<commit_message>
Complete MERN Multi-Game platform implementation with role-based dashboards, games, and comprehensive documentation
</commit_message>
<xml_diff>
--- a/Documentation.docx
+++ b/Documentation.docx
@@ -1,6 +1,6 @@
 
 <file path=word/document.xml><?xml version="1.0" encoding="utf-8"?>
-<w:document xmlns:wpc="http://schemas.microsoft.com/office/word/2010/wordprocessingCanvas" xmlns:cx="http://schemas.microsoft.com/office/drawing/2014/chartex" xmlns:cx1="http://schemas.microsoft.com/office/drawing/2015/9/8/chartex" xmlns:cx2="http://schemas.microsoft.com/office/drawing/2015/10/21/chartex" xmlns:cx3="http://schemas.microsoft.com/office/drawing/2016/5/9/chartex" xmlns:cx4="http://schemas.microsoft.com/office/drawing/2016/5/10/chartex" xmlns:cx5="http://schemas.microsoft.com/office/drawing/2016/5/11/chartex" xmlns:cx6="http://schemas.microsoft.com/office/drawing/2016/5/12/chartex" xmlns:cx7="http://schemas.microsoft.com/office/drawing/2016/5/13/chartex" xmlns:cx8="http://schemas.microsoft.com/office/drawing/2016/5/14/chartex" xmlns:mc="http://schemas.openxmlformats.org/markup-compatibility/2006" xmlns:aink="http://schemas.microsoft.com/office/drawing/2016/ink" xmlns:am3d="http://schemas.microsoft.com/office/drawing/2017/model3d" xmlns:o="urn:schemas-microsoft-com:office:office" xmlns:oel="http://schemas.microsoft.com/office/2019/extlst" xmlns:r="http://schemas.openxmlformats.org/officeDocument/2006/relationships" xmlns:m="http://schemas.openxmlformats.org/officeDocument/2006/math" xmlns:v="urn:schemas-microsoft-com:vml" xmlns:wp14="http://schemas.microsoft.com/office/word/2010/wordprocessingDrawing" xmlns:wp="http://schemas.openxmlformats.org/drawingml/2006/wordprocessingDrawing" xmlns:w10="urn:schemas-microsoft-com:office:word" xmlns:w="http://schemas.openxmlformats.org/wordprocessingml/2006/main" xmlns:w14="http://schemas.microsoft.com/office/word/2010/wordml" xmlns:w15="http://schemas.microsoft.com/office/word/2012/wordml" xmlns:w16cex="http://schemas.microsoft.com/office/word/2018/wordml/cex" xmlns:w16cid="http://schemas.microsoft.com/office/word/2016/wordml/cid" xmlns:w16="http://schemas.microsoft.com/office/word/2018/wordml" xmlns:w16du="http://schemas.microsoft.com/office/word/2023/wordml/word16du" xmlns:w16sdtdh="http://schemas.microsoft.com/office/word/2020/wordml/sdtdatahash" xmlns:w16sdtfl="http://schemas.microsoft.com/office/word/2024/wordml/sdtformatlock" xmlns:w16se="http://schemas.microsoft.com/office/word/2015/wordml/symex" xmlns:wpg="http://schemas.microsoft.com/office/word/2010/wordprocessingGroup" xmlns:wpi="http://schemas.microsoft.com/office/word/2010/wordprocessingInk" xmlns:wne="http://schemas.microsoft.com/office/word/2006/wordml" xmlns:wps="http://schemas.microsoft.com/office/word/2010/wordprocessingShape" mc:Ignorable="w14 w15 w16se w16cid w16 w16cex w16sdtdh w16sdtfl w16du wp14">
+<w:document xmlns:wpc="http://schemas.microsoft.com/office/word/2010/wordprocessingCanvas" xmlns:mc="http://schemas.openxmlformats.org/markup-compatibility/2006" xmlns:o="urn:schemas-microsoft-com:office:office" xmlns:r="http://schemas.openxmlformats.org/officeDocument/2006/relationships" xmlns:m="http://schemas.openxmlformats.org/officeDocument/2006/math" xmlns:v="urn:schemas-microsoft-com:vml" xmlns:wp14="http://schemas.microsoft.com/office/word/2010/wordprocessingDrawing" xmlns:wp="http://schemas.openxmlformats.org/drawingml/2006/wordprocessingDrawing" xmlns:w10="urn:schemas-microsoft-com:office:word" xmlns:w="http://schemas.openxmlformats.org/wordprocessingml/2006/main" xmlns:w14="http://schemas.microsoft.com/office/word/2010/wordml" xmlns:w15="http://schemas.microsoft.com/office/word/2012/wordml" xmlns:wpg="http://schemas.microsoft.com/office/word/2010/wordprocessingGroup" xmlns:wpi="http://schemas.microsoft.com/office/word/2010/wordprocessingInk" xmlns:wne="http://schemas.microsoft.com/office/word/2006/wordml" xmlns:wps="http://schemas.microsoft.com/office/word/2010/wordprocessingShape" mc:Ignorable="w14 w15 wp14">
   <w:body>
     <w:p>
       <w:pPr>
@@ -18,6 +18,7 @@
           <w:b/>
           <w:noProof/>
           <w:sz w:val="28"/>
+          <w:lang w:bidi="gu-IN"/>
         </w:rPr>
         <mc:AlternateContent>
           <mc:Choice Requires="wps">
@@ -253,7 +254,7 @@
               </wp:anchor>
             </w:drawing>
           </mc:Choice>
-          <mc:Fallback>
+          <mc:Fallback xmlns:w16se="http://schemas.microsoft.com/office/word/2015/wordml/symex" xmlns:w16sdtfl="http://schemas.microsoft.com/office/word/2024/wordml/sdtformatlock" xmlns:w16sdtdh="http://schemas.microsoft.com/office/word/2020/wordml/sdtdatahash" xmlns:w16du="http://schemas.microsoft.com/office/word/2023/wordml/word16du" xmlns:w16="http://schemas.microsoft.com/office/word/2018/wordml" xmlns:w16cid="http://schemas.microsoft.com/office/word/2016/wordml/cid" xmlns:w16cex="http://schemas.microsoft.com/office/word/2018/wordml/cex" xmlns:oel="http://schemas.microsoft.com/office/2019/extlst" xmlns:am3d="http://schemas.microsoft.com/office/drawing/2017/model3d" xmlns:aink="http://schemas.microsoft.com/office/drawing/2016/ink" xmlns:cx8="http://schemas.microsoft.com/office/drawing/2016/5/14/chartex" xmlns:cx7="http://schemas.microsoft.com/office/drawing/2016/5/13/chartex" xmlns:cx6="http://schemas.microsoft.com/office/drawing/2016/5/12/chartex" xmlns:cx5="http://schemas.microsoft.com/office/drawing/2016/5/11/chartex" xmlns:cx4="http://schemas.microsoft.com/office/drawing/2016/5/10/chartex" xmlns:cx3="http://schemas.microsoft.com/office/drawing/2016/5/9/chartex" xmlns:cx2="http://schemas.microsoft.com/office/drawing/2015/10/21/chartex" xmlns:cx1="http://schemas.microsoft.com/office/drawing/2015/9/8/chartex" xmlns:cx="http://schemas.microsoft.com/office/drawing/2014/chartex">
             <w:pict>
               <v:shape w14:anchorId="49E1D609" id="Graphic 3" o:spid="_x0000_s1026" style="position:absolute;margin-left:24.35pt;margin-top:24.95pt;width:546.6pt;height:11in;z-index:-251655168;visibility:visible;mso-wrap-style:square;mso-wrap-distance-left:0;mso-wrap-distance-top:0;mso-wrap-distance-right:0;mso-wrap-distance-bottom:0;mso-position-horizontal:absolute;mso-position-horizontal-relative:page;mso-position-vertical:absolute;mso-position-vertical-relative:page;v-text-anchor:top" coordsize="6941820,10058400" o:gfxdata="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" path="m56375,47244r-9131,l47244,56388r,9945624l47244,10040112r9131,l56375,10002012r,-9945624l56375,47244xem6894563,47244r-9131,l56388,47244r,9144l6885432,56388r,9945624l56388,10002012r,38100l6885432,10040112r9131,l6894563,10002012r,-9945624l6894563,47244xem6941820,r-38100,l6903720,38100r,18288l6903720,10002012r,47244l6885432,10049256r-6829044,l38100,10049256r,-47244l38100,56388r,-18288l56388,38100r6829044,l6903720,38100r,-38100l6885432,,56388,,38100,,,,,38100,,56388r,9945624l,10049256r,9144l38100,10058400r18288,l6885432,10058400r18288,l6941820,10058400r,-9144l6941820,10002012r,-9945624l6941820,38100r,-38100xe" fillcolor="black" stroked="f">
                 <v:path arrowok="t"/>
@@ -425,6 +426,7 @@
       <w:r>
         <w:rPr>
           <w:noProof/>
+          <w:lang w:bidi="gu-IN"/>
         </w:rPr>
         <w:drawing>
           <wp:inline distT="0" distB="0" distL="0" distR="0" wp14:anchorId="68F75F2F" wp14:editId="750B7F96">
@@ -433,7 +435,7 @@
             <wp:docPr id="8" name="Picture 7">
               <a:extLst xmlns:a="http://schemas.openxmlformats.org/drawingml/2006/main">
                 <a:ext uri="{FF2B5EF4-FFF2-40B4-BE49-F238E27FC236}">
-                  <a16:creationId xmlns:a16="http://schemas.microsoft.com/office/drawing/2014/main" id="{6BEA8DE7-04BA-42F5-8D14-2E68203D6A6A}"/>
+                  <a16:creationId xmlns:a16="http://schemas.microsoft.com/office/drawing/2014/main" xmlns:w16se="http://schemas.microsoft.com/office/word/2015/wordml/symex" xmlns:w16sdtfl="http://schemas.microsoft.com/office/word/2024/wordml/sdtformatlock" xmlns:w16sdtdh="http://schemas.microsoft.com/office/word/2020/wordml/sdtdatahash" xmlns:w16du="http://schemas.microsoft.com/office/word/2023/wordml/word16du" xmlns:w16="http://schemas.microsoft.com/office/word/2018/wordml" xmlns:w16cid="http://schemas.microsoft.com/office/word/2016/wordml/cid" xmlns:w16cex="http://schemas.microsoft.com/office/word/2018/wordml/cex" xmlns:w="http://schemas.openxmlformats.org/wordprocessingml/2006/main" xmlns:w10="urn:schemas-microsoft-com:office:word" xmlns:v="urn:schemas-microsoft-com:vml" xmlns:oel="http://schemas.microsoft.com/office/2019/extlst" xmlns:o="urn:schemas-microsoft-com:office:office" xmlns:am3d="http://schemas.microsoft.com/office/drawing/2017/model3d" xmlns:aink="http://schemas.microsoft.com/office/drawing/2016/ink" xmlns:cx8="http://schemas.microsoft.com/office/drawing/2016/5/14/chartex" xmlns:cx7="http://schemas.microsoft.com/office/drawing/2016/5/13/chartex" xmlns:cx6="http://schemas.microsoft.com/office/drawing/2016/5/12/chartex" xmlns:cx5="http://schemas.microsoft.com/office/drawing/2016/5/11/chartex" xmlns:cx4="http://schemas.microsoft.com/office/drawing/2016/5/10/chartex" xmlns:cx3="http://schemas.microsoft.com/office/drawing/2016/5/9/chartex" xmlns:cx2="http://schemas.microsoft.com/office/drawing/2015/10/21/chartex" xmlns:cx1="http://schemas.microsoft.com/office/drawing/2015/9/8/chartex" xmlns:cx="http://schemas.microsoft.com/office/drawing/2014/chartex" xmlns="" id="{6BEA8DE7-04BA-42F5-8D14-2E68203D6A6A}"/>
                 </a:ext>
               </a:extLst>
             </wp:docPr>
@@ -447,7 +449,7 @@
                     <pic:cNvPr id="8" name="Picture 7">
                       <a:extLst>
                         <a:ext uri="{FF2B5EF4-FFF2-40B4-BE49-F238E27FC236}">
-                          <a16:creationId xmlns:a16="http://schemas.microsoft.com/office/drawing/2014/main" id="{6BEA8DE7-04BA-42F5-8D14-2E68203D6A6A}"/>
+                          <a16:creationId xmlns:a16="http://schemas.microsoft.com/office/drawing/2014/main" xmlns:w16se="http://schemas.microsoft.com/office/word/2015/wordml/symex" xmlns:w16sdtfl="http://schemas.microsoft.com/office/word/2024/wordml/sdtformatlock" xmlns:w16sdtdh="http://schemas.microsoft.com/office/word/2020/wordml/sdtdatahash" xmlns:w16du="http://schemas.microsoft.com/office/word/2023/wordml/word16du" xmlns:w16="http://schemas.microsoft.com/office/word/2018/wordml" xmlns:w16cid="http://schemas.microsoft.com/office/word/2016/wordml/cid" xmlns:w16cex="http://schemas.microsoft.com/office/word/2018/wordml/cex" xmlns:w="http://schemas.openxmlformats.org/wordprocessingml/2006/main" xmlns:w10="urn:schemas-microsoft-com:office:word" xmlns:v="urn:schemas-microsoft-com:vml" xmlns:oel="http://schemas.microsoft.com/office/2019/extlst" xmlns:o="urn:schemas-microsoft-com:office:office" xmlns:am3d="http://schemas.microsoft.com/office/drawing/2017/model3d" xmlns:aink="http://schemas.microsoft.com/office/drawing/2016/ink" xmlns:cx8="http://schemas.microsoft.com/office/drawing/2016/5/14/chartex" xmlns:cx7="http://schemas.microsoft.com/office/drawing/2016/5/13/chartex" xmlns:cx6="http://schemas.microsoft.com/office/drawing/2016/5/12/chartex" xmlns:cx5="http://schemas.microsoft.com/office/drawing/2016/5/11/chartex" xmlns:cx4="http://schemas.microsoft.com/office/drawing/2016/5/10/chartex" xmlns:cx3="http://schemas.microsoft.com/office/drawing/2016/5/9/chartex" xmlns:cx2="http://schemas.microsoft.com/office/drawing/2015/10/21/chartex" xmlns:cx1="http://schemas.microsoft.com/office/drawing/2015/9/8/chartex" xmlns:cx="http://schemas.microsoft.com/office/drawing/2014/chartex" xmlns="" id="{6BEA8DE7-04BA-42F5-8D14-2E68203D6A6A}"/>
                         </a:ext>
                       </a:extLst>
                     </pic:cNvPr>
@@ -596,9 +598,19 @@
         </w:rPr>
         <w:t xml:space="preserve"> </w:t>
       </w:r>
-      <w:r>
-        <w:t>Nilesh Parmar</w:t>
-      </w:r>
+      <w:proofErr w:type="spellStart"/>
+      <w:r>
+        <w:t>Nilesh</w:t>
+      </w:r>
+      <w:proofErr w:type="spellEnd"/>
+      <w:r>
+        <w:t xml:space="preserve"> </w:t>
+      </w:r>
+      <w:proofErr w:type="spellStart"/>
+      <w:r>
+        <w:t>Parmar</w:t>
+      </w:r>
+      <w:proofErr w:type="spellEnd"/>
     </w:p>
     <w:p>
       <w:pPr>
@@ -663,7 +675,27 @@
           <w:sz w:val="32"/>
           <w:szCs w:val="32"/>
         </w:rPr>
-        <w:t xml:space="preserve"> Dhvanit Shah</w:t>
+        <w:t xml:space="preserve"> </w:t>
+      </w:r>
+      <w:proofErr w:type="spellStart"/>
+      <w:r>
+        <w:rPr>
+          <w:b/>
+          <w:spacing w:val="-3"/>
+          <w:sz w:val="32"/>
+          <w:szCs w:val="32"/>
+        </w:rPr>
+        <w:t>Dhvanit</w:t>
+      </w:r>
+      <w:proofErr w:type="spellEnd"/>
+      <w:r>
+        <w:rPr>
+          <w:b/>
+          <w:spacing w:val="-3"/>
+          <w:sz w:val="32"/>
+          <w:szCs w:val="32"/>
+        </w:rPr>
+        <w:t xml:space="preserve"> Shah</w:t>
       </w:r>
       <w:r>
         <w:rPr>
@@ -681,6 +713,7 @@
         </w:rPr>
         <w:t xml:space="preserve"> </w:t>
       </w:r>
+      <w:proofErr w:type="spellStart"/>
       <w:r>
         <w:rPr>
           <w:b/>
@@ -688,8 +721,9 @@
           <w:sz w:val="32"/>
           <w:szCs w:val="32"/>
         </w:rPr>
-        <w:t>Kavy Sharma</w:t>
-      </w:r>
+        <w:t>Kavy</w:t>
+      </w:r>
+      <w:proofErr w:type="spellEnd"/>
       <w:r>
         <w:rPr>
           <w:b/>
@@ -697,6 +731,15 @@
           <w:sz w:val="32"/>
           <w:szCs w:val="32"/>
         </w:rPr>
+        <w:t xml:space="preserve"> Sharma</w:t>
+      </w:r>
+      <w:r>
+        <w:rPr>
+          <w:b/>
+          <w:spacing w:val="-3"/>
+          <w:sz w:val="32"/>
+          <w:szCs w:val="32"/>
+        </w:rPr>
         <w:t>,</w:t>
       </w:r>
       <w:r>
@@ -706,8 +749,39 @@
           <w:sz w:val="32"/>
           <w:szCs w:val="32"/>
         </w:rPr>
-        <w:t xml:space="preserve"> Harmeet sinha</w:t>
-      </w:r>
+        <w:t xml:space="preserve"> </w:t>
+      </w:r>
+      <w:proofErr w:type="spellStart"/>
+      <w:r>
+        <w:rPr>
+          <w:b/>
+          <w:spacing w:val="-3"/>
+          <w:sz w:val="32"/>
+          <w:szCs w:val="32"/>
+        </w:rPr>
+        <w:t>Harmeet</w:t>
+      </w:r>
+      <w:proofErr w:type="spellEnd"/>
+      <w:r>
+        <w:rPr>
+          <w:b/>
+          <w:spacing w:val="-3"/>
+          <w:sz w:val="32"/>
+          <w:szCs w:val="32"/>
+        </w:rPr>
+        <w:t xml:space="preserve"> </w:t>
+      </w:r>
+      <w:proofErr w:type="spellStart"/>
+      <w:r>
+        <w:rPr>
+          <w:b/>
+          <w:spacing w:val="-3"/>
+          <w:sz w:val="32"/>
+          <w:szCs w:val="32"/>
+        </w:rPr>
+        <w:t>sinha</w:t>
+      </w:r>
+      <w:proofErr w:type="spellEnd"/>
     </w:p>
     <w:p>
       <w:pPr>
@@ -753,6 +827,7 @@
         </w:rPr>
         <w:t>No: 24004500210254</w:t>
       </w:r>
+      <w:proofErr w:type="gramStart"/>
       <w:r>
         <w:rPr>
           <w:b/>
@@ -785,6 +860,7 @@
         </w:rPr>
         <w:t>24004500210266</w:t>
       </w:r>
+      <w:proofErr w:type="gramEnd"/>
     </w:p>
     <w:p>
       <w:pPr>
@@ -800,6 +876,7 @@
           <w:b/>
           <w:noProof/>
           <w:sz w:val="36"/>
+          <w:lang w:bidi="gu-IN"/>
         </w:rPr>
         <w:lastRenderedPageBreak/>
         <mc:AlternateContent>
@@ -1036,7 +1113,7 @@
               </wp:anchor>
             </w:drawing>
           </mc:Choice>
-          <mc:Fallback>
+          <mc:Fallback xmlns:w16se="http://schemas.microsoft.com/office/word/2015/wordml/symex" xmlns:w16sdtfl="http://schemas.microsoft.com/office/word/2024/wordml/sdtformatlock" xmlns:w16sdtdh="http://schemas.microsoft.com/office/word/2020/wordml/sdtdatahash" xmlns:w16du="http://schemas.microsoft.com/office/word/2023/wordml/word16du" xmlns:w16="http://schemas.microsoft.com/office/word/2018/wordml" xmlns:w16cid="http://schemas.microsoft.com/office/word/2016/wordml/cid" xmlns:w16cex="http://schemas.microsoft.com/office/word/2018/wordml/cex" xmlns:oel="http://schemas.microsoft.com/office/2019/extlst" xmlns:am3d="http://schemas.microsoft.com/office/drawing/2017/model3d" xmlns:aink="http://schemas.microsoft.com/office/drawing/2016/ink" xmlns:cx8="http://schemas.microsoft.com/office/drawing/2016/5/14/chartex" xmlns:cx7="http://schemas.microsoft.com/office/drawing/2016/5/13/chartex" xmlns:cx6="http://schemas.microsoft.com/office/drawing/2016/5/12/chartex" xmlns:cx5="http://schemas.microsoft.com/office/drawing/2016/5/11/chartex" xmlns:cx4="http://schemas.microsoft.com/office/drawing/2016/5/10/chartex" xmlns:cx3="http://schemas.microsoft.com/office/drawing/2016/5/9/chartex" xmlns:cx2="http://schemas.microsoft.com/office/drawing/2015/10/21/chartex" xmlns:cx1="http://schemas.microsoft.com/office/drawing/2015/9/8/chartex" xmlns:cx="http://schemas.microsoft.com/office/drawing/2014/chartex">
             <w:pict>
               <v:shape w14:anchorId="687EE4C6" id="Graphic 7" o:spid="_x0000_s1026" style="position:absolute;margin-left:24.35pt;margin-top:24.95pt;width:546.6pt;height:11in;z-index:-251654144;visibility:visible;mso-wrap-style:square;mso-wrap-distance-left:0;mso-wrap-distance-top:0;mso-wrap-distance-right:0;mso-wrap-distance-bottom:0;mso-position-horizontal:absolute;mso-position-horizontal-relative:page;mso-position-vertical:absolute;mso-position-vertical-relative:page;v-text-anchor:top" coordsize="6941820,10058400" o:gfxdata="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" path="m56375,47244r-9131,l47244,56388r,9945624l47244,10040112r9131,l56375,10002012r,-9945624l56375,47244xem6894563,47244r-9131,l56388,47244r,9144l6885432,56388r,9945624l56388,10002012r,38100l6885432,10040112r9131,l6894563,10002012r,-9945624l6894563,47244xem6941820,r-38100,l6903720,38100r,18288l6903720,10002012r,47244l6885432,10049256r-6829044,l38100,10049256r,-47244l38100,56388r,-18288l56388,38100r6829044,l6903720,38100r,-38100l6885432,,56388,,38100,,,,,38100,,56388r,9945624l,10049256r,9144l38100,10058400r18288,l6885432,10058400r18288,l6941820,10058400r,-9144l6941820,10002012r,-9945624l6941820,38100r,-38100xe" fillcolor="black" stroked="f">
                 <v:path arrowok="t"/>
@@ -1453,6 +1530,7 @@
                 <w:szCs w:val="32"/>
               </w:rPr>
             </w:pPr>
+            <w:proofErr w:type="spellStart"/>
             <w:r>
               <w:rPr>
                 <w:b/>
@@ -1460,7 +1538,17 @@
                 <w:sz w:val="32"/>
                 <w:szCs w:val="32"/>
               </w:rPr>
-              <w:t>Dhvanit Shah</w:t>
+              <w:t>Dhvanit</w:t>
+            </w:r>
+            <w:proofErr w:type="spellEnd"/>
+            <w:r>
+              <w:rPr>
+                <w:b/>
+                <w:spacing w:val="-3"/>
+                <w:sz w:val="32"/>
+                <w:szCs w:val="32"/>
+              </w:rPr>
+              <w:t xml:space="preserve"> Shah</w:t>
             </w:r>
           </w:p>
           <w:p>
@@ -1491,6 +1579,7 @@
               <w:rPr>
                 <w:noProof/>
                 <w:sz w:val="28"/>
+                <w:lang w:bidi="gu-IN"/>
                 <w14:ligatures w14:val="standardContextual"/>
               </w:rPr>
               <w:drawing>
@@ -1585,6 +1674,7 @@
                 <w:szCs w:val="32"/>
               </w:rPr>
             </w:pPr>
+            <w:proofErr w:type="spellStart"/>
             <w:r>
               <w:rPr>
                 <w:b/>
@@ -1592,7 +1682,17 @@
                 <w:sz w:val="32"/>
                 <w:szCs w:val="32"/>
               </w:rPr>
-              <w:t>Kavy Sharma</w:t>
+              <w:t>Kavy</w:t>
+            </w:r>
+            <w:proofErr w:type="spellEnd"/>
+            <w:r>
+              <w:rPr>
+                <w:b/>
+                <w:spacing w:val="-3"/>
+                <w:sz w:val="32"/>
+                <w:szCs w:val="32"/>
+              </w:rPr>
+              <w:t xml:space="preserve"> Sharma</w:t>
             </w:r>
           </w:p>
         </w:tc>
@@ -1615,6 +1715,7 @@
               <w:rPr>
                 <w:noProof/>
                 <w:sz w:val="28"/>
+                <w:lang w:bidi="gu-IN"/>
                 <w14:ligatures w14:val="standardContextual"/>
               </w:rPr>
               <w:drawing>
@@ -1720,6 +1821,7 @@
                 <w:szCs w:val="32"/>
               </w:rPr>
             </w:pPr>
+            <w:proofErr w:type="spellStart"/>
             <w:r>
               <w:rPr>
                 <w:b/>
@@ -1727,8 +1829,29 @@
                 <w:sz w:val="32"/>
                 <w:szCs w:val="32"/>
               </w:rPr>
-              <w:t>Harmeet sinha</w:t>
-            </w:r>
+              <w:t>Harmeet</w:t>
+            </w:r>
+            <w:proofErr w:type="spellEnd"/>
+            <w:r>
+              <w:rPr>
+                <w:b/>
+                <w:spacing w:val="-3"/>
+                <w:sz w:val="32"/>
+                <w:szCs w:val="32"/>
+              </w:rPr>
+              <w:t xml:space="preserve"> </w:t>
+            </w:r>
+            <w:proofErr w:type="spellStart"/>
+            <w:r>
+              <w:rPr>
+                <w:b/>
+                <w:spacing w:val="-3"/>
+                <w:sz w:val="32"/>
+                <w:szCs w:val="32"/>
+              </w:rPr>
+              <w:t>sinha</w:t>
+            </w:r>
+            <w:proofErr w:type="spellEnd"/>
           </w:p>
         </w:tc>
         <w:tc>
@@ -1750,6 +1873,7 @@
               <w:rPr>
                 <w:noProof/>
                 <w:sz w:val="28"/>
+                <w:lang w:bidi="gu-IN"/>
                 <w14:ligatures w14:val="standardContextual"/>
               </w:rPr>
               <w:drawing>
@@ -1879,6 +2003,7 @@
           <w:sz w:val="40"/>
           <w:szCs w:val="28"/>
         </w:rPr>
+        <w:lastRenderedPageBreak/>
         <w:t>MULTI-GAME WEB APP PORTAL</w:t>
       </w:r>
     </w:p>
@@ -2937,7 +3062,13 @@
               <w:t xml:space="preserve">         </w:t>
             </w:r>
             <w:r>
-              <w:t>3.3 Interaction Diagram</w:t>
+              <w:t xml:space="preserve">3.3 </w:t>
+            </w:r>
+            <w:r>
+              <w:t>ER</w:t>
+            </w:r>
+            <w:r>
+              <w:t xml:space="preserve"> Diagram</w:t>
             </w:r>
           </w:p>
         </w:tc>
@@ -2985,7 +3116,10 @@
               <w:t xml:space="preserve">         </w:t>
             </w:r>
             <w:r>
-              <w:t>3.4 Activity Diagram</w:t>
+              <w:t>3.4</w:t>
+            </w:r>
+            <w:r>
+              <w:t xml:space="preserve"> Data Dictionary</w:t>
             </w:r>
           </w:p>
         </w:tc>
@@ -3019,6 +3153,20 @@
                 <w:bCs/>
               </w:rPr>
             </w:pPr>
+            <w:r>
+              <w:rPr>
+                <w:b/>
+                <w:bCs/>
+              </w:rPr>
+              <w:t>4</w:t>
+            </w:r>
+            <w:r>
+              <w:rPr>
+                <w:b/>
+                <w:bCs/>
+              </w:rPr>
+              <w:t>.</w:t>
+            </w:r>
           </w:p>
         </w:tc>
         <w:tc>
@@ -3026,14 +3174,12 @@
             <w:tcW w:w="7857" w:type="dxa"/>
           </w:tcPr>
           <w:p>
-            <w:pPr>
-              <w:jc w:val="both"/>
-            </w:pPr>
-            <w:r>
-              <w:t xml:space="preserve">         </w:t>
-            </w:r>
-            <w:r>
-              <w:t>3.5 Data Dictionary</w:t>
+            <w:r>
+              <w:rPr>
+                <w:b/>
+                <w:bCs/>
+              </w:rPr>
+              <w:t>DEVELOPMENT</w:t>
             </w:r>
           </w:p>
         </w:tc>
@@ -3046,7 +3192,7 @@
               <w:jc w:val="center"/>
             </w:pPr>
             <w:r>
-              <w:t>18</w:t>
+              <w:t>22</w:t>
             </w:r>
           </w:p>
         </w:tc>
@@ -3061,26 +3207,11 @@
           </w:tcPr>
           <w:p>
             <w:pPr>
-              <w:jc w:val="center"/>
               <w:rPr>
                 <w:b/>
                 <w:bCs/>
               </w:rPr>
             </w:pPr>
-            <w:r>
-              <w:rPr>
-                <w:b/>
-                <w:bCs/>
-              </w:rPr>
-              <w:t>4</w:t>
-            </w:r>
-            <w:r>
-              <w:rPr>
-                <w:b/>
-                <w:bCs/>
-              </w:rPr>
-              <w:t>.</w:t>
-            </w:r>
           </w:p>
         </w:tc>
         <w:tc>
@@ -3088,13 +3219,29 @@
             <w:tcW w:w="7857" w:type="dxa"/>
           </w:tcPr>
           <w:p>
-            <w:r>
-              <w:rPr>
-                <w:b/>
-                <w:bCs/>
-              </w:rPr>
-              <w:t>DEVELOPMENT</w:t>
-            </w:r>
+            <w:pPr>
+              <w:jc w:val="both"/>
+            </w:pPr>
+            <w:r>
+              <w:t xml:space="preserve">        </w:t>
+            </w:r>
+            <w:r>
+              <w:t>4.</w:t>
+            </w:r>
+            <w:r>
+              <w:t>1</w:t>
+            </w:r>
+            <w:r>
+              <w:t xml:space="preserve"> </w:t>
+            </w:r>
+            <w:r>
+              <w:t>Coding Standard</w:t>
+            </w:r>
+          </w:p>
+          <w:p>
+            <w:pPr>
+              <w:jc w:val="both"/>
+            </w:pPr>
           </w:p>
         </w:tc>
         <w:tc>
@@ -3106,7 +3253,7 @@
               <w:jc w:val="center"/>
             </w:pPr>
             <w:r>
-              <w:t>23</w:t>
+              <w:t>22</w:t>
             </w:r>
           </w:p>
         </w:tc>
@@ -3143,19 +3290,8 @@
               <w:t>4.</w:t>
             </w:r>
             <w:r>
-              <w:t>1</w:t>
-            </w:r>
-            <w:r>
-              <w:t xml:space="preserve"> </w:t>
-            </w:r>
-            <w:r>
-              <w:t>Coding Standard</w:t>
-            </w:r>
-          </w:p>
-          <w:p>
-            <w:pPr>
-              <w:jc w:val="both"/>
-            </w:pPr>
+              <w:t>2 Screenshots</w:t>
+            </w:r>
           </w:p>
         </w:tc>
         <w:tc>
@@ -3167,7 +3303,7 @@
               <w:jc w:val="center"/>
             </w:pPr>
             <w:r>
-              <w:t>23</w:t>
+              <w:t>25</w:t>
             </w:r>
           </w:p>
         </w:tc>
@@ -3182,11 +3318,35 @@
           </w:tcPr>
           <w:p>
             <w:pPr>
+              <w:jc w:val="center"/>
               <w:rPr>
                 <w:b/>
                 <w:bCs/>
               </w:rPr>
             </w:pPr>
+            <w:r>
+              <w:rPr>
+                <w:b/>
+                <w:bCs/>
+              </w:rPr>
+              <w:t>5</w:t>
+            </w:r>
+            <w:r>
+              <w:rPr>
+                <w:b/>
+                <w:bCs/>
+              </w:rPr>
+              <w:t xml:space="preserve">. </w:t>
+            </w:r>
+          </w:p>
+          <w:p>
+            <w:pPr>
+              <w:jc w:val="center"/>
+              <w:rPr>
+                <w:b/>
+                <w:bCs/>
+              </w:rPr>
+            </w:pPr>
           </w:p>
         </w:tc>
         <w:tc>
@@ -3195,16 +3355,17 @@
           </w:tcPr>
           <w:p>
             <w:pPr>
-              <w:jc w:val="both"/>
+              <w:rPr>
+                <w:b/>
+                <w:bCs/>
+              </w:rPr>
             </w:pPr>
             <w:r>
-              <w:t xml:space="preserve">        </w:t>
-            </w:r>
-            <w:r>
-              <w:t>4.</w:t>
-            </w:r>
-            <w:r>
-              <w:t>2 Screenshots</w:t>
+              <w:rPr>
+                <w:b/>
+                <w:bCs/>
+              </w:rPr>
+              <w:t>PROPOSED ENHANCEMENTS</w:t>
             </w:r>
           </w:p>
         </w:tc>
@@ -3243,7 +3404,7 @@
                 <w:b/>
                 <w:bCs/>
               </w:rPr>
-              <w:t>5</w:t>
+              <w:t>6</w:t>
             </w:r>
             <w:r>
               <w:rPr>
@@ -3279,7 +3440,7 @@
                 <w:b/>
                 <w:bCs/>
               </w:rPr>
-              <w:t>PROPOSED ENHANCEMENTS</w:t>
+              <w:t>CONCLUSION</w:t>
             </w:r>
           </w:p>
         </w:tc>
@@ -3318,7 +3479,7 @@
                 <w:b/>
                 <w:bCs/>
               </w:rPr>
-              <w:t>6</w:t>
+              <w:t>7</w:t>
             </w:r>
             <w:r>
               <w:rPr>
@@ -3354,7 +3515,7 @@
                 <w:b/>
                 <w:bCs/>
               </w:rPr>
-              <w:t>CONCLUSION</w:t>
+              <w:t>BIBLIOGRAPHY</w:t>
             </w:r>
           </w:p>
         </w:tc>
@@ -3367,82 +3528,7 @@
               <w:jc w:val="center"/>
             </w:pPr>
             <w:r>
-              <w:t>28</w:t>
-            </w:r>
-          </w:p>
-        </w:tc>
-      </w:tr>
-      <w:tr>
-        <w:trPr>
-          <w:trHeight w:val="415"/>
-        </w:trPr>
-        <w:tc>
-          <w:tcPr>
-            <w:tcW w:w="738" w:type="dxa"/>
-          </w:tcPr>
-          <w:p>
-            <w:pPr>
-              <w:jc w:val="center"/>
-              <w:rPr>
-                <w:b/>
-                <w:bCs/>
-              </w:rPr>
-            </w:pPr>
-            <w:r>
-              <w:rPr>
-                <w:b/>
-                <w:bCs/>
-              </w:rPr>
-              <w:t>7</w:t>
-            </w:r>
-            <w:r>
-              <w:rPr>
-                <w:b/>
-                <w:bCs/>
-              </w:rPr>
-              <w:t xml:space="preserve">. </w:t>
-            </w:r>
-          </w:p>
-          <w:p>
-            <w:pPr>
-              <w:jc w:val="center"/>
-              <w:rPr>
-                <w:b/>
-                <w:bCs/>
-              </w:rPr>
-            </w:pPr>
-          </w:p>
-        </w:tc>
-        <w:tc>
-          <w:tcPr>
-            <w:tcW w:w="7857" w:type="dxa"/>
-          </w:tcPr>
-          <w:p>
-            <w:pPr>
-              <w:rPr>
-                <w:b/>
-                <w:bCs/>
-              </w:rPr>
-            </w:pPr>
-            <w:r>
-              <w:rPr>
-                <w:b/>
-                <w:bCs/>
-              </w:rPr>
-              <w:t>BIBLIOGRAPHY</w:t>
-            </w:r>
-          </w:p>
-        </w:tc>
-        <w:tc>
-          <w:tcPr>
-            <w:tcW w:w="1247" w:type="dxa"/>
-          </w:tcPr>
-          <w:p>
-            <w:pPr>
-              <w:jc w:val="center"/>
-            </w:pPr>
-            <w:r>
-              <w:t>28</w:t>
+              <w:t>27</w:t>
             </w:r>
           </w:p>
         </w:tc>
@@ -3470,6 +3556,7 @@
           <w:sz w:val="40"/>
           <w:szCs w:val="40"/>
         </w:rPr>
+        <w:lastRenderedPageBreak/>
         <w:t>INTRODUCTION</w:t>
       </w:r>
     </w:p>
@@ -3627,7 +3714,23 @@
           <w:sz w:val="32"/>
           <w:szCs w:val="32"/>
         </w:rPr>
-        <w:t>In the existing system, web gaming is mainly done through scattered, standalone websites or by downloading multiple independent applications with limited community features. Players face challenges like fragmented progress tracking, a lack of centralized leaderboards, and the inconvenience of managing multiple accounts across different platforms. Game developers often struggle with complex deployment processes, finding a reliable platform to easily publish lightweight web games, and reaching a wider player base, while administrators have minimal control over content curation, user analytics, and platform</w:t>
+        <w:t xml:space="preserve">In the existing system, web gaming is mainly done through scattered, standalone websites or by downloading multiple independent applications with limited community features. Players face challenges like fragmented progress tracking, a lack of centralized leaderboards, and the inconvenience of managing multiple accounts across different platforms. Game developers often struggle with complex deployment processes, finding a reliable platform to easily publish lightweight web games, and reaching a wider player base, while administrators have minimal control over content </w:t>
+      </w:r>
+      <w:proofErr w:type="spellStart"/>
+      <w:r>
+        <w:rPr>
+          <w:sz w:val="32"/>
+          <w:szCs w:val="32"/>
+        </w:rPr>
+        <w:t>curation</w:t>
+      </w:r>
+      <w:proofErr w:type="spellEnd"/>
+      <w:r>
+        <w:rPr>
+          <w:sz w:val="32"/>
+          <w:szCs w:val="32"/>
+        </w:rPr>
+        <w:t>, user analytics, and platform</w:t>
       </w:r>
       <w:r>
         <w:rPr>
@@ -3686,7 +3789,15 @@
           <w:sz w:val="32"/>
           <w:szCs w:val="32"/>
         </w:rPr>
-        <w:t>The growing demand for accessibility, community engagement, and centralized tracking in online gaming highlights the need for a modern system. Players want easy access to a diverse catalog of games, secure user profiles, and real-time leaderboard rankings alongside achievements. Developers require a streamlined publishing process and better insights into player engagement, while administrators need powerful tools to curate content and oversee platform operations. A unified digital platform like the Multi-Game Web App Portal addresses these challenges, creating a seamless and interactive experience for all users.</w:t>
+        <w:t xml:space="preserve">The growing demand for accessibility, community engagement, and centralized tracking in online gaming highlights the need for a modern system. Players want easy access to a diverse catalog of games, secure user profiles, and real-time leaderboard rankings alongside achievements. Developers require a streamlined publishing process and better insights into player engagement, while administrators need powerful tools to curate content and oversee platform operations. A unified digital platform like the Multi-Game Web App Portal addresses </w:t>
+      </w:r>
+      <w:r>
+        <w:rPr>
+          <w:sz w:val="32"/>
+          <w:szCs w:val="32"/>
+        </w:rPr>
+        <w:lastRenderedPageBreak/>
+        <w:t>these challenges, creating a seamless and interactive experience for all users.</w:t>
       </w:r>
     </w:p>
     <w:p>
@@ -3814,6 +3925,7 @@
           <w:sz w:val="32"/>
           <w:szCs w:val="32"/>
         </w:rPr>
+        <w:lastRenderedPageBreak/>
         <w:t xml:space="preserve">1.5 </w:t>
       </w:r>
       <w:r>
@@ -3920,7 +4032,23 @@
           <w:sz w:val="32"/>
           <w:szCs w:val="32"/>
         </w:rPr>
-        <w:t>Provides players with secure registration, game browsing, the ability to submit ratings and reviews, and a personal profile.</w:t>
+        <w:t xml:space="preserve">Provides players with secure registration, game browsing, </w:t>
+      </w:r>
+      <w:proofErr w:type="gramStart"/>
+      <w:r>
+        <w:rPr>
+          <w:sz w:val="32"/>
+          <w:szCs w:val="32"/>
+        </w:rPr>
+        <w:t>the</w:t>
+      </w:r>
+      <w:proofErr w:type="gramEnd"/>
+      <w:r>
+        <w:rPr>
+          <w:sz w:val="32"/>
+          <w:szCs w:val="32"/>
+        </w:rPr>
+        <w:t xml:space="preserve"> ability to submit ratings and reviews, and a personal profile.</w:t>
       </w:r>
     </w:p>
     <w:p>
@@ -4007,7 +4135,23 @@
           <w:sz w:val="32"/>
           <w:szCs w:val="32"/>
         </w:rPr>
-        <w:t>– Offers visual reports on user activity, most played games, and developer portfolio performance for better curation.</w:t>
+        <w:t xml:space="preserve">– Offers visual reports on user activity, most played games, and developer portfolio performance for better </w:t>
+      </w:r>
+      <w:proofErr w:type="spellStart"/>
+      <w:r>
+        <w:rPr>
+          <w:sz w:val="32"/>
+          <w:szCs w:val="32"/>
+        </w:rPr>
+        <w:t>curation</w:t>
+      </w:r>
+      <w:proofErr w:type="spellEnd"/>
+      <w:r>
+        <w:rPr>
+          <w:sz w:val="32"/>
+          <w:szCs w:val="32"/>
+        </w:rPr>
+        <w:t>.</w:t>
       </w:r>
     </w:p>
     <w:p>
@@ -4036,7 +4180,23 @@
           <w:sz w:val="32"/>
           <w:szCs w:val="32"/>
         </w:rPr>
-        <w:t>– Ensures secure encrypted logins with strict role-based access control (Admin, Developer, Player) across the MERN stack.</w:t>
+        <w:t xml:space="preserve">– Ensures secure encrypted logins with strict role-based access control (Admin, Developer, </w:t>
+      </w:r>
+      <w:proofErr w:type="gramStart"/>
+      <w:r>
+        <w:rPr>
+          <w:sz w:val="32"/>
+          <w:szCs w:val="32"/>
+        </w:rPr>
+        <w:t>Player</w:t>
+      </w:r>
+      <w:proofErr w:type="gramEnd"/>
+      <w:r>
+        <w:rPr>
+          <w:sz w:val="32"/>
+          <w:szCs w:val="32"/>
+        </w:rPr>
+        <w:t>) across the MERN stack.</w:t>
       </w:r>
     </w:p>
     <w:p>
@@ -4101,6 +4261,7 @@
           <w:sz w:val="40"/>
           <w:szCs w:val="40"/>
         </w:rPr>
+        <w:lastRenderedPageBreak/>
         <w:t>1.6 Project Profile</w:t>
       </w:r>
     </w:p>
@@ -4233,8 +4394,19 @@
                 <w:sz w:val="28"/>
                 <w:szCs w:val="28"/>
               </w:rPr>
-              <w:t>Multi-Game-WebApp</w:t>
-            </w:r>
+              <w:t>Multi-Game-</w:t>
+            </w:r>
+            <w:proofErr w:type="spellStart"/>
+            <w:r>
+              <w:rPr>
+                <w:b/>
+                <w:bCs/>
+                <w:sz w:val="28"/>
+                <w:szCs w:val="28"/>
+              </w:rPr>
+              <w:t>WebApp</w:t>
+            </w:r>
+            <w:proofErr w:type="spellEnd"/>
             <w:r>
               <w:rPr>
                 <w:b/>
@@ -4302,13 +4474,23 @@
               </w:rPr>
               <w:t xml:space="preserve"> </w:t>
             </w:r>
+            <w:proofErr w:type="spellStart"/>
             <w:r>
               <w:rPr>
                 <w:sz w:val="28"/>
                 <w:szCs w:val="28"/>
                 <w:lang w:val="en-IN"/>
               </w:rPr>
-              <w:t>js, HTML5, CSS3, JavaScript</w:t>
+              <w:t>js</w:t>
+            </w:r>
+            <w:proofErr w:type="spellEnd"/>
+            <w:r>
+              <w:rPr>
+                <w:sz w:val="28"/>
+                <w:szCs w:val="28"/>
+                <w:lang w:val="en-IN"/>
+              </w:rPr>
+              <w:t>, HTML5, CSS3, JavaScript</w:t>
             </w:r>
           </w:p>
           <w:p>
@@ -4368,6 +4550,7 @@
                 <w:szCs w:val="28"/>
               </w:rPr>
             </w:pPr>
+            <w:proofErr w:type="spellStart"/>
             <w:r>
               <w:rPr>
                 <w:sz w:val="28"/>
@@ -4376,6 +4559,7 @@
               </w:rPr>
               <w:t>MongoDB</w:t>
             </w:r>
+            <w:proofErr w:type="spellEnd"/>
           </w:p>
         </w:tc>
       </w:tr>
@@ -4417,12 +4601,21 @@
                 <w:szCs w:val="28"/>
               </w:rPr>
             </w:pPr>
+            <w:proofErr w:type="spellStart"/>
             <w:r>
               <w:rPr>
                 <w:sz w:val="28"/>
                 <w:szCs w:val="28"/>
               </w:rPr>
-              <w:t>Dhvanit Shah</w:t>
+              <w:t>Dhvanit</w:t>
+            </w:r>
+            <w:proofErr w:type="spellEnd"/>
+            <w:r>
+              <w:rPr>
+                <w:sz w:val="28"/>
+                <w:szCs w:val="28"/>
+              </w:rPr>
+              <w:t xml:space="preserve"> Shah</w:t>
             </w:r>
           </w:p>
           <w:p>
@@ -4438,20 +4631,29 @@
                 <w:sz w:val="28"/>
                 <w:szCs w:val="28"/>
               </w:rPr>
-              <w:t xml:space="preserve"> Kavy</w:t>
-            </w:r>
+              <w:t xml:space="preserve"> </w:t>
+            </w:r>
+            <w:proofErr w:type="spellStart"/>
             <w:r>
               <w:rPr>
                 <w:sz w:val="28"/>
                 <w:szCs w:val="28"/>
               </w:rPr>
-              <w:t xml:space="preserve"> </w:t>
-            </w:r>
+              <w:t>Kavy</w:t>
+            </w:r>
+            <w:proofErr w:type="spellEnd"/>
             <w:r>
               <w:rPr>
                 <w:sz w:val="28"/>
                 <w:szCs w:val="28"/>
               </w:rPr>
+              <w:t xml:space="preserve"> </w:t>
+            </w:r>
+            <w:r>
+              <w:rPr>
+                <w:sz w:val="28"/>
+                <w:szCs w:val="28"/>
+              </w:rPr>
               <w:t>Sharma</w:t>
             </w:r>
           </w:p>
@@ -4463,13 +4665,31 @@
                 <w:szCs w:val="28"/>
               </w:rPr>
             </w:pPr>
+            <w:proofErr w:type="spellStart"/>
             <w:r>
               <w:rPr>
                 <w:sz w:val="28"/>
                 <w:szCs w:val="28"/>
               </w:rPr>
-              <w:t>Harmeet sinha</w:t>
-            </w:r>
+              <w:t>Harmeet</w:t>
+            </w:r>
+            <w:proofErr w:type="spellEnd"/>
+            <w:r>
+              <w:rPr>
+                <w:sz w:val="28"/>
+                <w:szCs w:val="28"/>
+              </w:rPr>
+              <w:t xml:space="preserve"> </w:t>
+            </w:r>
+            <w:proofErr w:type="spellStart"/>
+            <w:r>
+              <w:rPr>
+                <w:sz w:val="28"/>
+                <w:szCs w:val="28"/>
+              </w:rPr>
+              <w:t>sinha</w:t>
+            </w:r>
+            <w:proofErr w:type="spellEnd"/>
           </w:p>
         </w:tc>
       </w:tr>
@@ -4522,20 +4742,31 @@
             <w:r>
               <w:t xml:space="preserve"> </w:t>
             </w:r>
+            <w:proofErr w:type="spellStart"/>
             <w:r>
               <w:rPr>
                 <w:sz w:val="28"/>
                 <w:szCs w:val="28"/>
               </w:rPr>
-              <w:t xml:space="preserve">Nilesh </w:t>
-            </w:r>
+              <w:t>Nilesh</w:t>
+            </w:r>
+            <w:proofErr w:type="spellEnd"/>
             <w:r>
               <w:rPr>
                 <w:sz w:val="28"/>
                 <w:szCs w:val="28"/>
               </w:rPr>
+              <w:t xml:space="preserve"> </w:t>
+            </w:r>
+            <w:proofErr w:type="spellStart"/>
+            <w:r>
+              <w:rPr>
+                <w:sz w:val="28"/>
+                <w:szCs w:val="28"/>
+              </w:rPr>
               <w:t>Parmar</w:t>
             </w:r>
+            <w:proofErr w:type="spellEnd"/>
           </w:p>
         </w:tc>
       </w:tr>
@@ -4721,6 +4952,7 @@
           <w:sz w:val="28"/>
           <w:szCs w:val="28"/>
         </w:rPr>
+        <w:lastRenderedPageBreak/>
         <w:t>Strict data security and anti-cheat measures must be enforced across leaderboards, which may limit certain integrations or features for developers.</w:t>
       </w:r>
     </w:p>
@@ -5000,7 +5232,7 @@
           <w:ilvl w:val="0"/>
           <w:numId w:val="15"/>
         </w:numPr>
-        <w:jc w:val="both"/>
+        <w:jc w:val="center"/>
         <w:rPr>
           <w:b/>
           <w:bCs/>
@@ -5015,6 +5247,7 @@
           <w:sz w:val="36"/>
           <w:szCs w:val="36"/>
         </w:rPr>
+        <w:lastRenderedPageBreak/>
         <w:t>Requir</w:t>
       </w:r>
       <w:r>
@@ -5273,6 +5506,7 @@
           <w:sz w:val="32"/>
           <w:szCs w:val="32"/>
         </w:rPr>
+        <w:lastRenderedPageBreak/>
         <w:t xml:space="preserve">Search &amp; Filters: </w:t>
       </w:r>
       <w:r>
@@ -5686,7 +5920,25 @@
           <w:szCs w:val="32"/>
           <w:lang w:val="en-IN"/>
         </w:rPr>
-        <w:t xml:space="preserve"> to browse the game library, play games, unlock personal achievements, submit high scores to global leaderboards, and write reviews.</w:t>
+        <w:t xml:space="preserve"> to browse the game library, play games, unlock personal achievements, submit high scores to global </w:t>
+      </w:r>
+      <w:proofErr w:type="spellStart"/>
+      <w:r>
+        <w:rPr>
+          <w:sz w:val="32"/>
+          <w:szCs w:val="32"/>
+          <w:lang w:val="en-IN"/>
+        </w:rPr>
+        <w:t>leaderboards</w:t>
+      </w:r>
+      <w:proofErr w:type="spellEnd"/>
+      <w:r>
+        <w:rPr>
+          <w:sz w:val="32"/>
+          <w:szCs w:val="32"/>
+          <w:lang w:val="en-IN"/>
+        </w:rPr>
+        <w:t>, and write reviews.</w:t>
       </w:r>
     </w:p>
     <w:p>
@@ -5961,6 +6213,7 @@
           <w:szCs w:val="32"/>
           <w:lang w:val="en-IN"/>
         </w:rPr>
+        <w:lastRenderedPageBreak/>
         <w:t>Server-Side (Development/Hosting):</w:t>
       </w:r>
     </w:p>
@@ -6001,7 +6254,25 @@
           <w:szCs w:val="32"/>
           <w:lang w:val="en-IN"/>
         </w:rPr>
-        <w:t>• RAM: 8 GB or higher recommended (for running Node.js and MongoDB concurrently)</w:t>
+        <w:t xml:space="preserve">• RAM: 8 GB or higher recommended (for running Node.js and </w:t>
+      </w:r>
+      <w:proofErr w:type="spellStart"/>
+      <w:r>
+        <w:rPr>
+          <w:sz w:val="32"/>
+          <w:szCs w:val="32"/>
+          <w:lang w:val="en-IN"/>
+        </w:rPr>
+        <w:t>MongoDB</w:t>
+      </w:r>
+      <w:proofErr w:type="spellEnd"/>
+      <w:r>
+        <w:rPr>
+          <w:sz w:val="32"/>
+          <w:szCs w:val="32"/>
+          <w:lang w:val="en-IN"/>
+        </w:rPr>
+        <w:t xml:space="preserve"> concurrently)</w:t>
       </w:r>
     </w:p>
     <w:p>
@@ -6101,8 +6372,36 @@
           <w:szCs w:val="32"/>
           <w:lang w:val="en-IN"/>
         </w:rPr>
-        <w:t>• Operating System: Windows, macOS, Linux, Android, or iOS</w:t>
-      </w:r>
+        <w:t xml:space="preserve">• Operating System: Windows, </w:t>
+      </w:r>
+      <w:proofErr w:type="spellStart"/>
+      <w:r>
+        <w:rPr>
+          <w:sz w:val="32"/>
+          <w:szCs w:val="32"/>
+          <w:lang w:val="en-IN"/>
+        </w:rPr>
+        <w:t>macOS</w:t>
+      </w:r>
+      <w:proofErr w:type="spellEnd"/>
+      <w:r>
+        <w:rPr>
+          <w:sz w:val="32"/>
+          <w:szCs w:val="32"/>
+          <w:lang w:val="en-IN"/>
+        </w:rPr>
+        <w:t xml:space="preserve">, Linux, Android, or </w:t>
+      </w:r>
+      <w:proofErr w:type="spellStart"/>
+      <w:r>
+        <w:rPr>
+          <w:sz w:val="32"/>
+          <w:szCs w:val="32"/>
+          <w:lang w:val="en-IN"/>
+        </w:rPr>
+        <w:t>iOS</w:t>
+      </w:r>
+      <w:proofErr w:type="spellEnd"/>
     </w:p>
     <w:p>
       <w:pPr>
@@ -6177,7 +6476,25 @@
           <w:szCs w:val="32"/>
           <w:lang w:val="en-IN"/>
         </w:rPr>
-        <w:t>• Operating System: Windows, macOS, or Linux</w:t>
+        <w:t xml:space="preserve">• Operating System: Windows, </w:t>
+      </w:r>
+      <w:proofErr w:type="spellStart"/>
+      <w:r>
+        <w:rPr>
+          <w:sz w:val="32"/>
+          <w:szCs w:val="32"/>
+          <w:lang w:val="en-IN"/>
+        </w:rPr>
+        <w:t>macOS</w:t>
+      </w:r>
+      <w:proofErr w:type="spellEnd"/>
+      <w:r>
+        <w:rPr>
+          <w:sz w:val="32"/>
+          <w:szCs w:val="32"/>
+          <w:lang w:val="en-IN"/>
+        </w:rPr>
+        <w:t>, or Linux</w:t>
       </w:r>
     </w:p>
     <w:p>
@@ -6217,7 +6534,43 @@
           <w:szCs w:val="32"/>
           <w:lang w:val="en-IN"/>
         </w:rPr>
-        <w:t>• Database: MongoDB (v4.x or higher) or MongoDB Atlas (Cloud)</w:t>
+        <w:t xml:space="preserve">• Database: </w:t>
+      </w:r>
+      <w:proofErr w:type="spellStart"/>
+      <w:r>
+        <w:rPr>
+          <w:sz w:val="32"/>
+          <w:szCs w:val="32"/>
+          <w:lang w:val="en-IN"/>
+        </w:rPr>
+        <w:t>MongoDB</w:t>
+      </w:r>
+      <w:proofErr w:type="spellEnd"/>
+      <w:r>
+        <w:rPr>
+          <w:sz w:val="32"/>
+          <w:szCs w:val="32"/>
+          <w:lang w:val="en-IN"/>
+        </w:rPr>
+        <w:t xml:space="preserve"> (v4.x or higher) or </w:t>
+      </w:r>
+      <w:proofErr w:type="spellStart"/>
+      <w:r>
+        <w:rPr>
+          <w:sz w:val="32"/>
+          <w:szCs w:val="32"/>
+          <w:lang w:val="en-IN"/>
+        </w:rPr>
+        <w:t>MongoDB</w:t>
+      </w:r>
+      <w:proofErr w:type="spellEnd"/>
+      <w:r>
+        <w:rPr>
+          <w:sz w:val="32"/>
+          <w:szCs w:val="32"/>
+          <w:lang w:val="en-IN"/>
+        </w:rPr>
+        <w:t xml:space="preserve"> Atlas (Cloud)</w:t>
       </w:r>
     </w:p>
     <w:p>
@@ -6372,6 +6725,7 @@
           <w:sz w:val="44"/>
           <w:szCs w:val="44"/>
         </w:rPr>
+        <w:lastRenderedPageBreak/>
         <w:t>SYSTEM DESIGN</w:t>
       </w:r>
     </w:p>
@@ -6408,6 +6762,7 @@
           <w:noProof/>
           <w:sz w:val="32"/>
           <w:szCs w:val="32"/>
+          <w:lang w:bidi="gu-IN"/>
         </w:rPr>
         <w:drawing>
           <wp:anchor distT="0" distB="0" distL="114300" distR="114300" simplePos="0" relativeHeight="251658240" behindDoc="0" locked="0" layoutInCell="1" allowOverlap="1" wp14:anchorId="5B561CCE" wp14:editId="073BB966">
@@ -6676,6 +7031,7 @@
           <w:sz w:val="32"/>
           <w:szCs w:val="32"/>
         </w:rPr>
+        <w:lastRenderedPageBreak/>
         <w:t xml:space="preserve">3.2 </w:t>
       </w:r>
       <w:r>
@@ -6750,6 +7106,7 @@
           <w:noProof/>
           <w:sz w:val="32"/>
           <w:szCs w:val="32"/>
+          <w:lang w:bidi="gu-IN"/>
         </w:rPr>
         <w:drawing>
           <wp:inline distT="0" distB="0" distL="0" distR="0" wp14:anchorId="3A9EDAA0" wp14:editId="4F02363D">
@@ -6810,6 +7167,7 @@
           <w:noProof/>
           <w:sz w:val="32"/>
           <w:szCs w:val="32"/>
+          <w:lang w:bidi="gu-IN"/>
         </w:rPr>
         <w:drawing>
           <wp:inline distT="0" distB="0" distL="0" distR="0" wp14:anchorId="3B3B2B65" wp14:editId="22F7AFA5">
@@ -6860,6 +7218,7 @@
           <w:noProof/>
           <w:sz w:val="32"/>
           <w:szCs w:val="32"/>
+          <w:lang w:bidi="gu-IN"/>
         </w:rPr>
         <w:drawing>
           <wp:inline distT="0" distB="0" distL="0" distR="0" wp14:anchorId="044DCA2C" wp14:editId="016FFED0">
@@ -6906,6 +7265,7 @@
       <w:r>
         <w:rPr>
           <w:noProof/>
+          <w:lang w:bidi="gu-IN"/>
         </w:rPr>
         <mc:AlternateContent>
           <mc:Choice Requires="wps">
@@ -6964,7 +7324,7 @@
               </wp:inline>
             </w:drawing>
           </mc:Choice>
-          <mc:Fallback>
+          <mc:Fallback xmlns:w16se="http://schemas.microsoft.com/office/word/2015/wordml/symex" xmlns:w16sdtfl="http://schemas.microsoft.com/office/word/2024/wordml/sdtformatlock" xmlns:w16sdtdh="http://schemas.microsoft.com/office/word/2020/wordml/sdtdatahash" xmlns:w16du="http://schemas.microsoft.com/office/word/2023/wordml/word16du" xmlns:w16="http://schemas.microsoft.com/office/word/2018/wordml" xmlns:w16cid="http://schemas.microsoft.com/office/word/2016/wordml/cid" xmlns:w16cex="http://schemas.microsoft.com/office/word/2018/wordml/cex" xmlns:oel="http://schemas.microsoft.com/office/2019/extlst" xmlns:am3d="http://schemas.microsoft.com/office/drawing/2017/model3d" xmlns:aink="http://schemas.microsoft.com/office/drawing/2016/ink" xmlns:cx8="http://schemas.microsoft.com/office/drawing/2016/5/14/chartex" xmlns:cx7="http://schemas.microsoft.com/office/drawing/2016/5/13/chartex" xmlns:cx6="http://schemas.microsoft.com/office/drawing/2016/5/12/chartex" xmlns:cx5="http://schemas.microsoft.com/office/drawing/2016/5/11/chartex" xmlns:cx4="http://schemas.microsoft.com/office/drawing/2016/5/10/chartex" xmlns:cx3="http://schemas.microsoft.com/office/drawing/2016/5/9/chartex" xmlns:cx2="http://schemas.microsoft.com/office/drawing/2015/10/21/chartex" xmlns:cx1="http://schemas.microsoft.com/office/drawing/2015/9/8/chartex" xmlns:cx="http://schemas.microsoft.com/office/drawing/2014/chartex">
             <w:pict>
               <v:rect w14:anchorId="1FA9F876" id="Rectangle 5" o:spid="_x0000_s1026" style="width:24pt;height:24pt;visibility:visible;mso-wrap-style:square;mso-left-percent:-10001;mso-top-percent:-10001;mso-position-horizontal:absolute;mso-position-horizontal-relative:char;mso-position-vertical:absolute;mso-position-vertical-relative:line;mso-left-percent:-10001;mso-top-percent:-10001;v-text-anchor:top" o:gfxdata="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" filled="f" stroked="f">
                 <o:lock v:ext="edit" aspectratio="t"/>
@@ -6992,6 +7352,7 @@
           <w:sz w:val="32"/>
           <w:szCs w:val="32"/>
         </w:rPr>
+        <w:lastRenderedPageBreak/>
         <w:t>3.</w:t>
       </w:r>
       <w:r>
@@ -7019,7 +7380,7 @@
           <w:sz w:val="32"/>
           <w:szCs w:val="32"/>
         </w:rPr>
-        <w:t>Interaction</w:t>
+        <w:t>ER</w:t>
       </w:r>
       <w:r>
         <w:rPr>
@@ -7053,6 +7414,57 @@
           <w:lang w:val="en-IN"/>
         </w:rPr>
       </w:pPr>
+      <w:r>
+        <w:rPr>
+          <w:b/>
+          <w:bCs/>
+          <w:noProof/>
+          <w:sz w:val="32"/>
+          <w:szCs w:val="32"/>
+          <w:lang w:bidi="gu-IN"/>
+        </w:rPr>
+        <w:drawing>
+          <wp:inline distT="0" distB="0" distL="0" distR="0" wp14:anchorId="184E4166" wp14:editId="675E28AF">
+            <wp:extent cx="6524866" cy="4467225"/>
+            <wp:effectExtent l="0" t="0" r="9525" b="0"/>
+            <wp:docPr id="104470556" name="Picture 6"/>
+            <wp:cNvGraphicFramePr>
+              <a:graphicFrameLocks xmlns:a="http://schemas.openxmlformats.org/drawingml/2006/main" noChangeAspect="1"/>
+            </wp:cNvGraphicFramePr>
+            <a:graphic xmlns:a="http://schemas.openxmlformats.org/drawingml/2006/main">
+              <a:graphicData uri="http://schemas.openxmlformats.org/drawingml/2006/picture">
+                <pic:pic xmlns:pic="http://schemas.openxmlformats.org/drawingml/2006/picture">
+                  <pic:nvPicPr>
+                    <pic:cNvPr id="104470556" name="Picture 104470556"/>
+                    <pic:cNvPicPr/>
+                  </pic:nvPicPr>
+                  <pic:blipFill>
+                    <a:blip r:embed="rId20">
+                      <a:extLst>
+                        <a:ext uri="{28A0092B-C50C-407E-A947-70E740481C1C}">
+                          <a14:useLocalDpi xmlns:a14="http://schemas.microsoft.com/office/drawing/2010/main" val="0"/>
+                        </a:ext>
+                      </a:extLst>
+                    </a:blip>
+                    <a:stretch>
+                      <a:fillRect/>
+                    </a:stretch>
+                  </pic:blipFill>
+                  <pic:spPr>
+                    <a:xfrm>
+                      <a:off x="0" y="0"/>
+                      <a:ext cx="6527540" cy="4469056"/>
+                    </a:xfrm>
+                    <a:prstGeom prst="rect">
+                      <a:avLst/>
+                    </a:prstGeom>
+                  </pic:spPr>
+                </pic:pic>
+              </a:graphicData>
+            </a:graphic>
+          </wp:inline>
+        </w:drawing>
+      </w:r>
     </w:p>
     <w:p>
       <w:pPr>
@@ -7078,6 +7490,56 @@
     </w:p>
     <w:p>
       <w:pPr>
+        <w:rPr>
+          <w:b/>
+          <w:bCs/>
+          <w:sz w:val="32"/>
+          <w:szCs w:val="32"/>
+        </w:rPr>
+      </w:pPr>
+    </w:p>
+    <w:p>
+      <w:pPr>
+        <w:rPr>
+          <w:b/>
+          <w:bCs/>
+          <w:sz w:val="32"/>
+          <w:szCs w:val="32"/>
+        </w:rPr>
+      </w:pPr>
+    </w:p>
+    <w:p>
+      <w:pPr>
+        <w:rPr>
+          <w:b/>
+          <w:bCs/>
+          <w:sz w:val="32"/>
+          <w:szCs w:val="32"/>
+        </w:rPr>
+      </w:pPr>
+    </w:p>
+    <w:p>
+      <w:pPr>
+        <w:rPr>
+          <w:b/>
+          <w:bCs/>
+          <w:sz w:val="32"/>
+          <w:szCs w:val="32"/>
+        </w:rPr>
+      </w:pPr>
+    </w:p>
+    <w:p>
+      <w:pPr>
+        <w:rPr>
+          <w:b/>
+          <w:bCs/>
+          <w:sz w:val="32"/>
+          <w:szCs w:val="32"/>
+        </w:rPr>
+      </w:pPr>
+    </w:p>
+    <w:p>
+      <w:pPr>
         <w:jc w:val="center"/>
         <w:rPr>
           <w:b/>
@@ -7086,6 +7548,61 @@
           <w:szCs w:val="32"/>
         </w:rPr>
       </w:pPr>
+      <w:r>
+        <w:rPr>
+          <w:b/>
+          <w:bCs/>
+          <w:sz w:val="32"/>
+          <w:szCs w:val="32"/>
+        </w:rPr>
+        <w:lastRenderedPageBreak/>
+        <w:t>3.4</w:t>
+      </w:r>
+      <w:r>
+        <w:rPr>
+          <w:b/>
+          <w:bCs/>
+          <w:sz w:val="32"/>
+          <w:szCs w:val="32"/>
+        </w:rPr>
+        <w:t xml:space="preserve"> </w:t>
+      </w:r>
+      <w:r>
+        <w:rPr>
+          <w:b/>
+          <w:bCs/>
+          <w:sz w:val="32"/>
+          <w:szCs w:val="32"/>
+        </w:rPr>
+        <w:t>Data</w:t>
+      </w:r>
+      <w:r>
+        <w:rPr>
+          <w:b/>
+          <w:bCs/>
+          <w:sz w:val="32"/>
+          <w:szCs w:val="32"/>
+        </w:rPr>
+        <w:t xml:space="preserve"> Di</w:t>
+      </w:r>
+      <w:r>
+        <w:rPr>
+          <w:b/>
+          <w:bCs/>
+          <w:sz w:val="32"/>
+          <w:szCs w:val="32"/>
+        </w:rPr>
+        <w:t>ctionar</w:t>
+      </w:r>
+      <w:r>
+        <w:rPr>
+          <w:b/>
+          <w:bCs/>
+          <w:sz w:val="32"/>
+          <w:szCs w:val="32"/>
+        </w:rPr>
+        <w:t>y</w:t>
+      </w:r>
     </w:p>
     <w:p>
       <w:pPr>
@@ -7100,499 +7617,6 @@
     </w:p>
     <w:p>
       <w:pPr>
-        <w:jc w:val="center"/>
-        <w:rPr>
-          <w:b/>
-          <w:bCs/>
-          <w:sz w:val="32"/>
-          <w:szCs w:val="32"/>
-        </w:rPr>
-      </w:pPr>
-    </w:p>
-    <w:p>
-      <w:pPr>
-        <w:jc w:val="center"/>
-        <w:rPr>
-          <w:b/>
-          <w:bCs/>
-          <w:sz w:val="32"/>
-          <w:szCs w:val="32"/>
-        </w:rPr>
-      </w:pPr>
-    </w:p>
-    <w:p>
-      <w:pPr>
-        <w:jc w:val="center"/>
-        <w:rPr>
-          <w:b/>
-          <w:bCs/>
-          <w:sz w:val="32"/>
-          <w:szCs w:val="32"/>
-        </w:rPr>
-      </w:pPr>
-    </w:p>
-    <w:p>
-      <w:pPr>
-        <w:jc w:val="center"/>
-        <w:rPr>
-          <w:b/>
-          <w:bCs/>
-          <w:sz w:val="32"/>
-          <w:szCs w:val="32"/>
-        </w:rPr>
-      </w:pPr>
-    </w:p>
-    <w:p>
-      <w:pPr>
-        <w:jc w:val="center"/>
-        <w:rPr>
-          <w:b/>
-          <w:bCs/>
-          <w:sz w:val="32"/>
-          <w:szCs w:val="32"/>
-        </w:rPr>
-      </w:pPr>
-    </w:p>
-    <w:p>
-      <w:pPr>
-        <w:jc w:val="center"/>
-        <w:rPr>
-          <w:b/>
-          <w:bCs/>
-          <w:sz w:val="32"/>
-          <w:szCs w:val="32"/>
-        </w:rPr>
-      </w:pPr>
-    </w:p>
-    <w:p>
-      <w:pPr>
-        <w:jc w:val="center"/>
-        <w:rPr>
-          <w:b/>
-          <w:bCs/>
-          <w:sz w:val="32"/>
-          <w:szCs w:val="32"/>
-        </w:rPr>
-      </w:pPr>
-    </w:p>
-    <w:p>
-      <w:pPr>
-        <w:jc w:val="center"/>
-        <w:rPr>
-          <w:b/>
-          <w:bCs/>
-          <w:sz w:val="32"/>
-          <w:szCs w:val="32"/>
-        </w:rPr>
-      </w:pPr>
-    </w:p>
-    <w:p>
-      <w:pPr>
-        <w:jc w:val="center"/>
-        <w:rPr>
-          <w:b/>
-          <w:bCs/>
-          <w:sz w:val="32"/>
-          <w:szCs w:val="32"/>
-        </w:rPr>
-      </w:pPr>
-    </w:p>
-    <w:p>
-      <w:pPr>
-        <w:jc w:val="center"/>
-        <w:rPr>
-          <w:b/>
-          <w:bCs/>
-          <w:sz w:val="32"/>
-          <w:szCs w:val="32"/>
-        </w:rPr>
-      </w:pPr>
-    </w:p>
-    <w:p>
-      <w:pPr>
-        <w:jc w:val="center"/>
-        <w:rPr>
-          <w:b/>
-          <w:bCs/>
-          <w:sz w:val="32"/>
-          <w:szCs w:val="32"/>
-        </w:rPr>
-      </w:pPr>
-    </w:p>
-    <w:p>
-      <w:pPr>
-        <w:jc w:val="center"/>
-        <w:rPr>
-          <w:b/>
-          <w:bCs/>
-          <w:sz w:val="32"/>
-          <w:szCs w:val="32"/>
-        </w:rPr>
-      </w:pPr>
-    </w:p>
-    <w:p>
-      <w:pPr>
-        <w:jc w:val="center"/>
-        <w:rPr>
-          <w:b/>
-          <w:bCs/>
-          <w:sz w:val="32"/>
-          <w:szCs w:val="32"/>
-        </w:rPr>
-      </w:pPr>
-    </w:p>
-    <w:p>
-      <w:pPr>
-        <w:jc w:val="center"/>
-        <w:rPr>
-          <w:b/>
-          <w:bCs/>
-          <w:sz w:val="32"/>
-          <w:szCs w:val="32"/>
-        </w:rPr>
-      </w:pPr>
-    </w:p>
-    <w:p>
-      <w:pPr>
-        <w:jc w:val="center"/>
-        <w:rPr>
-          <w:b/>
-          <w:bCs/>
-          <w:sz w:val="32"/>
-          <w:szCs w:val="32"/>
-        </w:rPr>
-      </w:pPr>
-      <w:r>
-        <w:rPr>
-          <w:b/>
-          <w:bCs/>
-          <w:sz w:val="32"/>
-          <w:szCs w:val="32"/>
-        </w:rPr>
-        <w:t>3.</w:t>
-      </w:r>
-      <w:r>
-        <w:rPr>
-          <w:b/>
-          <w:bCs/>
-          <w:sz w:val="32"/>
-          <w:szCs w:val="32"/>
-        </w:rPr>
-        <w:t>4</w:t>
-      </w:r>
-      <w:r>
-        <w:rPr>
-          <w:b/>
-          <w:bCs/>
-          <w:sz w:val="32"/>
-          <w:szCs w:val="32"/>
-        </w:rPr>
-        <w:t xml:space="preserve"> </w:t>
-      </w:r>
-      <w:r>
-        <w:rPr>
-          <w:b/>
-          <w:bCs/>
-          <w:sz w:val="32"/>
-          <w:szCs w:val="32"/>
-        </w:rPr>
-        <w:t>Activity</w:t>
-      </w:r>
-      <w:r>
-        <w:rPr>
-          <w:b/>
-          <w:bCs/>
-          <w:sz w:val="32"/>
-          <w:szCs w:val="32"/>
-        </w:rPr>
-        <w:t xml:space="preserve"> Diagram</w:t>
-      </w:r>
-    </w:p>
-    <w:p>
-      <w:pPr>
-        <w:jc w:val="center"/>
-        <w:rPr>
-          <w:b/>
-          <w:bCs/>
-          <w:sz w:val="32"/>
-          <w:szCs w:val="32"/>
-        </w:rPr>
-      </w:pPr>
-    </w:p>
-    <w:p>
-      <w:pPr>
-        <w:jc w:val="center"/>
-        <w:rPr>
-          <w:b/>
-          <w:bCs/>
-          <w:sz w:val="32"/>
-          <w:szCs w:val="32"/>
-        </w:rPr>
-      </w:pPr>
-    </w:p>
-    <w:p>
-      <w:pPr>
-        <w:jc w:val="center"/>
-        <w:rPr>
-          <w:b/>
-          <w:bCs/>
-          <w:sz w:val="32"/>
-          <w:szCs w:val="32"/>
-        </w:rPr>
-      </w:pPr>
-    </w:p>
-    <w:p>
-      <w:pPr>
-        <w:jc w:val="center"/>
-        <w:rPr>
-          <w:b/>
-          <w:bCs/>
-          <w:sz w:val="32"/>
-          <w:szCs w:val="32"/>
-        </w:rPr>
-      </w:pPr>
-    </w:p>
-    <w:p>
-      <w:pPr>
-        <w:jc w:val="center"/>
-        <w:rPr>
-          <w:b/>
-          <w:bCs/>
-          <w:sz w:val="32"/>
-          <w:szCs w:val="32"/>
-        </w:rPr>
-      </w:pPr>
-    </w:p>
-    <w:p>
-      <w:pPr>
-        <w:jc w:val="center"/>
-        <w:rPr>
-          <w:b/>
-          <w:bCs/>
-          <w:sz w:val="32"/>
-          <w:szCs w:val="32"/>
-        </w:rPr>
-      </w:pPr>
-    </w:p>
-    <w:p>
-      <w:pPr>
-        <w:jc w:val="center"/>
-        <w:rPr>
-          <w:b/>
-          <w:bCs/>
-          <w:sz w:val="32"/>
-          <w:szCs w:val="32"/>
-        </w:rPr>
-      </w:pPr>
-    </w:p>
-    <w:p>
-      <w:pPr>
-        <w:jc w:val="center"/>
-        <w:rPr>
-          <w:b/>
-          <w:bCs/>
-          <w:sz w:val="32"/>
-          <w:szCs w:val="32"/>
-        </w:rPr>
-      </w:pPr>
-    </w:p>
-    <w:p>
-      <w:pPr>
-        <w:jc w:val="center"/>
-        <w:rPr>
-          <w:b/>
-          <w:bCs/>
-          <w:sz w:val="32"/>
-          <w:szCs w:val="32"/>
-        </w:rPr>
-      </w:pPr>
-    </w:p>
-    <w:p>
-      <w:pPr>
-        <w:jc w:val="center"/>
-        <w:rPr>
-          <w:b/>
-          <w:bCs/>
-          <w:sz w:val="32"/>
-          <w:szCs w:val="32"/>
-        </w:rPr>
-      </w:pPr>
-    </w:p>
-    <w:p>
-      <w:pPr>
-        <w:jc w:val="center"/>
-        <w:rPr>
-          <w:b/>
-          <w:bCs/>
-          <w:sz w:val="32"/>
-          <w:szCs w:val="32"/>
-        </w:rPr>
-      </w:pPr>
-    </w:p>
-    <w:p>
-      <w:pPr>
-        <w:jc w:val="center"/>
-        <w:rPr>
-          <w:b/>
-          <w:bCs/>
-          <w:sz w:val="32"/>
-          <w:szCs w:val="32"/>
-        </w:rPr>
-      </w:pPr>
-    </w:p>
-    <w:p>
-      <w:pPr>
-        <w:jc w:val="center"/>
-        <w:rPr>
-          <w:b/>
-          <w:bCs/>
-          <w:sz w:val="32"/>
-          <w:szCs w:val="32"/>
-        </w:rPr>
-      </w:pPr>
-    </w:p>
-    <w:p>
-      <w:pPr>
-        <w:jc w:val="center"/>
-        <w:rPr>
-          <w:b/>
-          <w:bCs/>
-          <w:sz w:val="32"/>
-          <w:szCs w:val="32"/>
-        </w:rPr>
-      </w:pPr>
-    </w:p>
-    <w:p>
-      <w:pPr>
-        <w:jc w:val="center"/>
-        <w:rPr>
-          <w:b/>
-          <w:bCs/>
-          <w:sz w:val="32"/>
-          <w:szCs w:val="32"/>
-        </w:rPr>
-      </w:pPr>
-    </w:p>
-    <w:p>
-      <w:pPr>
-        <w:jc w:val="center"/>
-        <w:rPr>
-          <w:b/>
-          <w:bCs/>
-          <w:sz w:val="32"/>
-          <w:szCs w:val="32"/>
-        </w:rPr>
-      </w:pPr>
-    </w:p>
-    <w:p>
-      <w:pPr>
-        <w:jc w:val="center"/>
-        <w:rPr>
-          <w:b/>
-          <w:bCs/>
-          <w:sz w:val="32"/>
-          <w:szCs w:val="32"/>
-        </w:rPr>
-      </w:pPr>
-    </w:p>
-    <w:p>
-      <w:pPr>
-        <w:jc w:val="center"/>
-        <w:rPr>
-          <w:b/>
-          <w:bCs/>
-          <w:sz w:val="32"/>
-          <w:szCs w:val="32"/>
-        </w:rPr>
-      </w:pPr>
-    </w:p>
-    <w:p>
-      <w:pPr>
-        <w:jc w:val="center"/>
-        <w:rPr>
-          <w:b/>
-          <w:bCs/>
-          <w:sz w:val="32"/>
-          <w:szCs w:val="32"/>
-        </w:rPr>
-      </w:pPr>
-    </w:p>
-    <w:p>
-      <w:pPr>
-        <w:jc w:val="center"/>
-        <w:rPr>
-          <w:b/>
-          <w:bCs/>
-          <w:sz w:val="32"/>
-          <w:szCs w:val="32"/>
-        </w:rPr>
-      </w:pPr>
-    </w:p>
-    <w:p>
-      <w:pPr>
-        <w:pStyle w:val="ListParagraph"/>
-        <w:numPr>
-          <w:ilvl w:val="1"/>
-          <w:numId w:val="35"/>
-        </w:numPr>
-        <w:jc w:val="center"/>
-        <w:rPr>
-          <w:b/>
-          <w:bCs/>
-          <w:sz w:val="32"/>
-          <w:szCs w:val="32"/>
-        </w:rPr>
-      </w:pPr>
-      <w:r>
-        <w:rPr>
-          <w:b/>
-          <w:bCs/>
-          <w:sz w:val="32"/>
-          <w:szCs w:val="32"/>
-        </w:rPr>
-        <w:t>Data</w:t>
-      </w:r>
-      <w:r>
-        <w:rPr>
-          <w:b/>
-          <w:bCs/>
-          <w:sz w:val="32"/>
-          <w:szCs w:val="32"/>
-        </w:rPr>
-        <w:t xml:space="preserve"> Di</w:t>
-      </w:r>
-      <w:r>
-        <w:rPr>
-          <w:b/>
-          <w:bCs/>
-          <w:sz w:val="32"/>
-          <w:szCs w:val="32"/>
-        </w:rPr>
-        <w:t>ctionar</w:t>
-      </w:r>
-      <w:r>
-        <w:rPr>
-          <w:b/>
-          <w:bCs/>
-          <w:sz w:val="32"/>
-          <w:szCs w:val="32"/>
-        </w:rPr>
-        <w:t>y</w:t>
-      </w:r>
-    </w:p>
-    <w:p>
-      <w:pPr>
-        <w:jc w:val="center"/>
-        <w:rPr>
-          <w:b/>
-          <w:bCs/>
-          <w:sz w:val="32"/>
-          <w:szCs w:val="32"/>
-        </w:rPr>
-      </w:pPr>
-    </w:p>
-    <w:p>
-      <w:pPr>
         <w:rPr>
           <w:b/>
           <w:bCs/>
@@ -7608,7 +7632,15 @@
     </w:p>
     <w:p>
       <w:r>
-        <w:t>This table stores core account information for all actors identified in the diagram (Admin, Registered User, Developer).</w:t>
+        <w:t xml:space="preserve">This table stores core account information for all actors identified in the diagram (Admin, Registered User, </w:t>
+      </w:r>
+      <w:proofErr w:type="gramStart"/>
+      <w:r>
+        <w:t>Developer</w:t>
+      </w:r>
+      <w:proofErr w:type="gramEnd"/>
+      <w:r>
+        <w:t>).</w:t>
       </w:r>
     </w:p>
     <w:tbl>
@@ -8289,6 +8321,7 @@
             <w:hideMark/>
           </w:tcPr>
           <w:p>
+            <w:proofErr w:type="spellStart"/>
             <w:r>
               <w:rPr>
                 <w:b/>
@@ -8296,6 +8329,7 @@
               </w:rPr>
               <w:t>avatar_url</w:t>
             </w:r>
+            <w:proofErr w:type="spellEnd"/>
           </w:p>
         </w:tc>
         <w:tc>
@@ -8341,9 +8375,11 @@
             <w:hideMark/>
           </w:tcPr>
           <w:p>
+            <w:proofErr w:type="spellStart"/>
             <w:r>
               <w:t>Nullable</w:t>
             </w:r>
+            <w:proofErr w:type="spellEnd"/>
           </w:p>
         </w:tc>
         <w:tc>
@@ -8366,7 +8402,15 @@
           </w:tcPr>
           <w:p>
             <w:r>
-              <w:t>Path to profile picture for "Profile Updation" use case.</w:t>
+              <w:t xml:space="preserve">Path to profile picture for "Profile </w:t>
+            </w:r>
+            <w:proofErr w:type="spellStart"/>
+            <w:r>
+              <w:t>Updation</w:t>
+            </w:r>
+            <w:proofErr w:type="spellEnd"/>
+            <w:r>
+              <w:t>" use case.</w:t>
             </w:r>
           </w:p>
         </w:tc>
@@ -8439,6 +8483,7 @@
           <w:b/>
           <w:bCs/>
         </w:rPr>
+        <w:lastRenderedPageBreak/>
         <w:t>2. Game Inventory (games)</w:t>
       </w:r>
     </w:p>
@@ -8810,6 +8855,7 @@
             <w:hideMark/>
           </w:tcPr>
           <w:p>
+            <w:proofErr w:type="spellStart"/>
             <w:r>
               <w:rPr>
                 <w:b/>
@@ -8817,6 +8863,7 @@
               </w:rPr>
               <w:t>category_id</w:t>
             </w:r>
+            <w:proofErr w:type="spellEnd"/>
           </w:p>
         </w:tc>
         <w:tc>
@@ -8915,6 +8962,7 @@
             <w:hideMark/>
           </w:tcPr>
           <w:p>
+            <w:proofErr w:type="spellStart"/>
             <w:r>
               <w:rPr>
                 <w:b/>
@@ -8922,6 +8970,7 @@
               </w:rPr>
               <w:t>developer_id</w:t>
             </w:r>
+            <w:proofErr w:type="spellEnd"/>
           </w:p>
         </w:tc>
         <w:tc>
@@ -9121,6 +9170,7 @@
             <w:hideMark/>
           </w:tcPr>
           <w:p>
+            <w:proofErr w:type="spellStart"/>
             <w:r>
               <w:rPr>
                 <w:b/>
@@ -9128,6 +9178,7 @@
               </w:rPr>
               <w:t>image_url</w:t>
             </w:r>
+            <w:proofErr w:type="spellEnd"/>
           </w:p>
         </w:tc>
         <w:tc>
@@ -9222,6 +9273,7 @@
             <w:hideMark/>
           </w:tcPr>
           <w:p>
+            <w:proofErr w:type="spellStart"/>
             <w:r>
               <w:rPr>
                 <w:b/>
@@ -9229,6 +9281,7 @@
               </w:rPr>
               <w:t>video_url</w:t>
             </w:r>
+            <w:proofErr w:type="spellEnd"/>
           </w:p>
         </w:tc>
         <w:tc>
@@ -9323,6 +9376,7 @@
             <w:hideMark/>
           </w:tcPr>
           <w:p>
+            <w:proofErr w:type="spellStart"/>
             <w:r>
               <w:rPr>
                 <w:b/>
@@ -9330,6 +9384,7 @@
               </w:rPr>
               <w:t>game_file</w:t>
             </w:r>
+            <w:proofErr w:type="spellEnd"/>
           </w:p>
         </w:tc>
         <w:tc>
@@ -9501,7 +9556,15 @@
           </w:tcPr>
           <w:p>
             <w:r>
-              <w:t>"Pending" added for the "Approve Request of dev" use case.</w:t>
+              <w:t xml:space="preserve">"Pending" added for the "Approve Request of </w:t>
+            </w:r>
+            <w:proofErr w:type="spellStart"/>
+            <w:r>
+              <w:t>dev</w:t>
+            </w:r>
+            <w:proofErr w:type="spellEnd"/>
+            <w:r>
+              <w:t>" use case.</w:t>
             </w:r>
           </w:p>
         </w:tc>
@@ -9550,6 +9613,7 @@
           <w:b/>
           <w:bCs/>
         </w:rPr>
+        <w:lastRenderedPageBreak/>
         <w:t>3. Categories (categories)</w:t>
       </w:r>
     </w:p>
@@ -10297,6 +10361,7 @@
             <w:hideMark/>
           </w:tcPr>
           <w:p>
+            <w:proofErr w:type="spellStart"/>
             <w:r>
               <w:rPr>
                 <w:b/>
@@ -10304,6 +10369,7 @@
               </w:rPr>
               <w:t>user_id</w:t>
             </w:r>
+            <w:proofErr w:type="spellEnd"/>
           </w:p>
         </w:tc>
         <w:tc>
@@ -10402,6 +10468,7 @@
             <w:hideMark/>
           </w:tcPr>
           <w:p>
+            <w:proofErr w:type="spellStart"/>
             <w:r>
               <w:rPr>
                 <w:b/>
@@ -10409,6 +10476,7 @@
               </w:rPr>
               <w:t>game_id</w:t>
             </w:r>
+            <w:proofErr w:type="spellEnd"/>
           </w:p>
         </w:tc>
         <w:tc>
@@ -10726,7 +10794,24 @@
           <w:b/>
           <w:bCs/>
         </w:rPr>
-        <w:t>5. Leaderboard &amp; Scoring (scores)</w:t>
+        <w:lastRenderedPageBreak/>
+        <w:t xml:space="preserve">5. Leaderboard &amp; </w:t>
+      </w:r>
+      <w:proofErr w:type="gramStart"/>
+      <w:r>
+        <w:rPr>
+          <w:b/>
+          <w:bCs/>
+        </w:rPr>
+        <w:t>Scoring</w:t>
+      </w:r>
+      <w:proofErr w:type="gramEnd"/>
+      <w:r>
+        <w:rPr>
+          <w:b/>
+          <w:bCs/>
+        </w:rPr>
+        <w:t xml:space="preserve"> (scores)</w:t>
       </w:r>
     </w:p>
     <w:p>
@@ -10996,6 +11081,7 @@
             <w:hideMark/>
           </w:tcPr>
           <w:p>
+            <w:proofErr w:type="spellStart"/>
             <w:r>
               <w:rPr>
                 <w:b/>
@@ -11003,6 +11089,7 @@
               </w:rPr>
               <w:t>user_id</w:t>
             </w:r>
+            <w:proofErr w:type="spellEnd"/>
           </w:p>
         </w:tc>
         <w:tc>
@@ -11101,6 +11188,7 @@
             <w:hideMark/>
           </w:tcPr>
           <w:p>
+            <w:proofErr w:type="spellStart"/>
             <w:r>
               <w:rPr>
                 <w:b/>
@@ -11108,6 +11196,7 @@
               </w:rPr>
               <w:t>game_id</w:t>
             </w:r>
+            <w:proofErr w:type="spellEnd"/>
           </w:p>
         </w:tc>
         <w:tc>
@@ -11574,6 +11663,7 @@
             <w:hideMark/>
           </w:tcPr>
           <w:p>
+            <w:proofErr w:type="spellStart"/>
             <w:r>
               <w:rPr>
                 <w:b/>
@@ -11581,6 +11671,7 @@
               </w:rPr>
               <w:t>game_id</w:t>
             </w:r>
+            <w:proofErr w:type="spellEnd"/>
           </w:p>
         </w:tc>
         <w:tc>
@@ -11886,7 +11977,24 @@
           <w:b/>
           <w:bCs/>
         </w:rPr>
-        <w:t>7. User Achievements (user_achievements) — NEW</w:t>
+        <w:lastRenderedPageBreak/>
+        <w:t>7. User Achievements (</w:t>
+      </w:r>
+      <w:proofErr w:type="spellStart"/>
+      <w:r>
+        <w:rPr>
+          <w:b/>
+          <w:bCs/>
+        </w:rPr>
+        <w:t>user_achievements</w:t>
+      </w:r>
+      <w:proofErr w:type="spellEnd"/>
+      <w:r>
+        <w:rPr>
+          <w:b/>
+          <w:bCs/>
+        </w:rPr>
+        <w:t>) — NEW</w:t>
       </w:r>
     </w:p>
     <w:p>
@@ -12051,6 +12159,7 @@
             <w:hideMark/>
           </w:tcPr>
           <w:p>
+            <w:proofErr w:type="spellStart"/>
             <w:r>
               <w:rPr>
                 <w:b/>
@@ -12058,6 +12167,7 @@
               </w:rPr>
               <w:t>user_id</w:t>
             </w:r>
+            <w:proofErr w:type="spellEnd"/>
           </w:p>
         </w:tc>
         <w:tc>
@@ -12156,6 +12266,7 @@
             <w:hideMark/>
           </w:tcPr>
           <w:p>
+            <w:proofErr w:type="spellStart"/>
             <w:r>
               <w:rPr>
                 <w:b/>
@@ -12163,6 +12274,7 @@
               </w:rPr>
               <w:t>achievement_id</w:t>
             </w:r>
+            <w:proofErr w:type="spellEnd"/>
           </w:p>
         </w:tc>
         <w:tc>
@@ -12261,6 +12373,7 @@
             <w:hideMark/>
           </w:tcPr>
           <w:p>
+            <w:proofErr w:type="spellStart"/>
             <w:r>
               <w:rPr>
                 <w:b/>
@@ -12268,6 +12381,7 @@
               </w:rPr>
               <w:t>earned_at</w:t>
             </w:r>
+            <w:proofErr w:type="spellEnd"/>
           </w:p>
         </w:tc>
         <w:tc>
@@ -12374,7 +12488,23 @@
           <w:b/>
           <w:bCs/>
         </w:rPr>
-        <w:t>Users 1:M Reviews</w:t>
+        <w:t>Users 1</w:t>
+      </w:r>
+      <w:proofErr w:type="gramStart"/>
+      <w:r>
+        <w:rPr>
+          <w:b/>
+          <w:bCs/>
+        </w:rPr>
+        <w:t>:M</w:t>
+      </w:r>
+      <w:proofErr w:type="gramEnd"/>
+      <w:r>
+        <w:rPr>
+          <w:b/>
+          <w:bCs/>
+        </w:rPr>
+        <w:t xml:space="preserve"> Reviews</w:t>
       </w:r>
       <w:r>
         <w:t>: A user can write many reviews.</w:t>
@@ -12392,7 +12522,23 @@
           <w:b/>
           <w:bCs/>
         </w:rPr>
-        <w:t>Users 1:M Scores</w:t>
+        <w:t>Users 1</w:t>
+      </w:r>
+      <w:proofErr w:type="gramStart"/>
+      <w:r>
+        <w:rPr>
+          <w:b/>
+          <w:bCs/>
+        </w:rPr>
+        <w:t>:M</w:t>
+      </w:r>
+      <w:proofErr w:type="gramEnd"/>
+      <w:r>
+        <w:rPr>
+          <w:b/>
+          <w:bCs/>
+        </w:rPr>
+        <w:t xml:space="preserve"> Scores</w:t>
       </w:r>
       <w:r>
         <w:t>: A user can have many scores.</w:t>
@@ -12410,7 +12556,23 @@
           <w:b/>
           <w:bCs/>
         </w:rPr>
-        <w:t>Users M:N Achievements</w:t>
+        <w:t>Users M</w:t>
+      </w:r>
+      <w:proofErr w:type="gramStart"/>
+      <w:r>
+        <w:rPr>
+          <w:b/>
+          <w:bCs/>
+        </w:rPr>
+        <w:t>:N</w:t>
+      </w:r>
+      <w:proofErr w:type="gramEnd"/>
+      <w:r>
+        <w:rPr>
+          <w:b/>
+          <w:bCs/>
+        </w:rPr>
+        <w:t xml:space="preserve"> Achievements</w:t>
       </w:r>
       <w:r>
         <w:t>: Users earn many achievements; achievements are earned by many users.</w:t>
@@ -12428,7 +12590,23 @@
           <w:b/>
           <w:bCs/>
         </w:rPr>
-        <w:t>Developers 1:M Games</w:t>
+        <w:t>Developers 1</w:t>
+      </w:r>
+      <w:proofErr w:type="gramStart"/>
+      <w:r>
+        <w:rPr>
+          <w:b/>
+          <w:bCs/>
+        </w:rPr>
+        <w:t>:M</w:t>
+      </w:r>
+      <w:proofErr w:type="gramEnd"/>
+      <w:r>
+        <w:rPr>
+          <w:b/>
+          <w:bCs/>
+        </w:rPr>
+        <w:t xml:space="preserve"> Games</w:t>
       </w:r>
       <w:r>
         <w:t>: A developer can submit multiple games for approval.</w:t>
@@ -12446,7 +12624,23 @@
           <w:b/>
           <w:bCs/>
         </w:rPr>
-        <w:t>Categories 1:M Games</w:t>
+        <w:t>Categories 1</w:t>
+      </w:r>
+      <w:proofErr w:type="gramStart"/>
+      <w:r>
+        <w:rPr>
+          <w:b/>
+          <w:bCs/>
+        </w:rPr>
+        <w:t>:M</w:t>
+      </w:r>
+      <w:proofErr w:type="gramEnd"/>
+      <w:r>
+        <w:rPr>
+          <w:b/>
+          <w:bCs/>
+        </w:rPr>
+        <w:t xml:space="preserve"> Games</w:t>
       </w:r>
       <w:r>
         <w:t>: A category has many games.</w:t>
@@ -12467,7 +12661,23 @@
           <w:b/>
           <w:bCs/>
         </w:rPr>
-        <w:t>Games 1:M Reviews/Scores</w:t>
+        <w:t>Games 1</w:t>
+      </w:r>
+      <w:proofErr w:type="gramStart"/>
+      <w:r>
+        <w:rPr>
+          <w:b/>
+          <w:bCs/>
+        </w:rPr>
+        <w:t>:M</w:t>
+      </w:r>
+      <w:proofErr w:type="gramEnd"/>
+      <w:r>
+        <w:rPr>
+          <w:b/>
+          <w:bCs/>
+        </w:rPr>
+        <w:t xml:space="preserve"> Reviews/Scores</w:t>
       </w:r>
       <w:r>
         <w:t>: Games host multiple reviews and leaderboard entries.</w:t>
@@ -12526,6 +12736,7 @@
           <w:sz w:val="44"/>
           <w:szCs w:val="44"/>
         </w:rPr>
+        <w:lastRenderedPageBreak/>
         <w:t>DEVELOPMENT</w:t>
       </w:r>
     </w:p>
@@ -12604,7 +12815,23 @@
           <w:sz w:val="35"/>
           <w:szCs w:val="35"/>
         </w:rPr>
-        <w:t>Use camelCase for variables and functions (e.g., fetch Games, player Score).</w:t>
+        <w:t xml:space="preserve">Use </w:t>
+      </w:r>
+      <w:proofErr w:type="spellStart"/>
+      <w:r>
+        <w:rPr>
+          <w:sz w:val="35"/>
+          <w:szCs w:val="35"/>
+        </w:rPr>
+        <w:t>camelCase</w:t>
+      </w:r>
+      <w:proofErr w:type="spellEnd"/>
+      <w:r>
+        <w:rPr>
+          <w:sz w:val="35"/>
+          <w:szCs w:val="35"/>
+        </w:rPr>
+        <w:t xml:space="preserve"> for variables and functions (e.g., fetch Games, player Score).</w:t>
       </w:r>
     </w:p>
     <w:p>
@@ -12681,7 +12908,23 @@
           <w:sz w:val="35"/>
           <w:szCs w:val="35"/>
         </w:rPr>
-        <w:t>Write clear, concise comments explaining the purpose and logic of complex React components and backend API endpoints.</w:t>
+        <w:t xml:space="preserve">Write clear, concise comments explaining the purpose and logic of complex </w:t>
+      </w:r>
+      <w:proofErr w:type="gramStart"/>
+      <w:r>
+        <w:rPr>
+          <w:sz w:val="35"/>
+          <w:szCs w:val="35"/>
+        </w:rPr>
+        <w:t>React</w:t>
+      </w:r>
+      <w:proofErr w:type="gramEnd"/>
+      <w:r>
+        <w:rPr>
+          <w:sz w:val="35"/>
+          <w:szCs w:val="35"/>
+        </w:rPr>
+        <w:t xml:space="preserve"> components and backend API endpoints.</w:t>
       </w:r>
     </w:p>
     <w:p>
@@ -12700,7 +12943,23 @@
           <w:sz w:val="35"/>
           <w:szCs w:val="35"/>
         </w:rPr>
-        <w:t>Use JSDoc-style comments (e.g., /** … */) to describe functions, API routes, parameters, and return values.</w:t>
+        <w:t xml:space="preserve">Use </w:t>
+      </w:r>
+      <w:proofErr w:type="spellStart"/>
+      <w:r>
+        <w:rPr>
+          <w:sz w:val="35"/>
+          <w:szCs w:val="35"/>
+        </w:rPr>
+        <w:t>JSDoc</w:t>
+      </w:r>
+      <w:proofErr w:type="spellEnd"/>
+      <w:r>
+        <w:rPr>
+          <w:sz w:val="35"/>
+          <w:szCs w:val="35"/>
+        </w:rPr>
+        <w:t>-style comments (e.g., /** … */) to describe functions, API routes, parameters, and return values.</w:t>
       </w:r>
     </w:p>
     <w:p>
@@ -12769,6 +13028,7 @@
           <w:sz w:val="35"/>
           <w:szCs w:val="35"/>
         </w:rPr>
+        <w:lastRenderedPageBreak/>
         <w:t>3. Code Structure and Formatting</w:t>
       </w:r>
     </w:p>
@@ -12916,23 +13176,23 @@
           <w:sz w:val="35"/>
           <w:szCs w:val="35"/>
         </w:rPr>
-        <w:t>Use try/catch blocks with async/await to handle promise rejections and failures gracefully.</w:t>
-      </w:r>
-    </w:p>
-    <w:p>
-      <w:pPr>
-        <w:jc w:val="both"/>
+        <w:t xml:space="preserve">Use try/catch blocks with </w:t>
+      </w:r>
+      <w:proofErr w:type="spellStart"/>
+      <w:r>
         <w:rPr>
           <w:sz w:val="35"/>
           <w:szCs w:val="35"/>
         </w:rPr>
-      </w:pPr>
+        <w:t>async</w:t>
+      </w:r>
+      <w:proofErr w:type="spellEnd"/>
       <w:r>
         <w:rPr>
           <w:sz w:val="35"/>
           <w:szCs w:val="35"/>
         </w:rPr>
-        <w:t>Ensure the API always returns proper HTTP status codes (e.g., 400 for bad requests, 404 for not found, 500 for server errors).</w:t>
+        <w:t>/await to handle promise rejections and failures gracefully.</w:t>
       </w:r>
     </w:p>
     <w:p>
@@ -12948,43 +13208,43 @@
           <w:sz w:val="35"/>
           <w:szCs w:val="35"/>
         </w:rPr>
-        <w:t>Log backend errors with sufficient context to enable debugging, while ensuring sensitive stack traces are not exposed to the client.</w:t>
+        <w:t>Ensure the API always returns proper HTTP status codes (e.g., 400 for bad requests, 404 for not found, 500 for server errors).</w:t>
       </w:r>
     </w:p>
     <w:p>
       <w:pPr>
         <w:jc w:val="both"/>
         <w:rPr>
-          <w:b/>
-          <w:bCs/>
           <w:sz w:val="35"/>
           <w:szCs w:val="35"/>
         </w:rPr>
       </w:pPr>
       <w:r>
         <w:rPr>
-          <w:b/>
-          <w:bCs/>
           <w:sz w:val="35"/>
           <w:szCs w:val="35"/>
         </w:rPr>
-        <w:t>5. Code Efficiency and Optimization</w:t>
+        <w:t>Log backend errors with sufficient context to enable debugging, while ensuring sensitive stack traces are not exposed to the client.</w:t>
       </w:r>
     </w:p>
     <w:p>
       <w:pPr>
         <w:jc w:val="both"/>
         <w:rPr>
+          <w:b/>
+          <w:bCs/>
           <w:sz w:val="35"/>
           <w:szCs w:val="35"/>
         </w:rPr>
       </w:pPr>
       <w:r>
         <w:rPr>
+          <w:b/>
+          <w:bCs/>
           <w:sz w:val="35"/>
           <w:szCs w:val="35"/>
         </w:rPr>
-        <w:t>Avoid redundant code by strictly reusing React components and backend helper functions.</w:t>
+        <w:t>5. Code Efficiency and Optimization</w:t>
       </w:r>
     </w:p>
     <w:p>
@@ -13000,6 +13260,23 @@
           <w:sz w:val="35"/>
           <w:szCs w:val="35"/>
         </w:rPr>
+        <w:t>Avoid redundant code by strictly reusing React components and backend helper functions.</w:t>
+      </w:r>
+    </w:p>
+    <w:p>
+      <w:pPr>
+        <w:jc w:val="both"/>
+        <w:rPr>
+          <w:sz w:val="35"/>
+          <w:szCs w:val="35"/>
+        </w:rPr>
+      </w:pPr>
+      <w:r>
+        <w:rPr>
+          <w:sz w:val="35"/>
+          <w:szCs w:val="35"/>
+        </w:rPr>
+        <w:lastRenderedPageBreak/>
         <w:t>Write highly modular and reusable code, leveraging modular imports and exports in Node.js.</w:t>
       </w:r>
     </w:p>
@@ -13056,7 +13333,39 @@
           <w:sz w:val="35"/>
           <w:szCs w:val="35"/>
         </w:rPr>
-        <w:t>Sanitize and validate all external inputs to prevent Cross-Site Scripting (XSS) on the frontend and NoSQL injections in MongoDB.</w:t>
+        <w:t xml:space="preserve">Sanitize and validate all external inputs to prevent Cross-Site Scripting (XSS) on the frontend and </w:t>
+      </w:r>
+      <w:proofErr w:type="spellStart"/>
+      <w:r>
+        <w:rPr>
+          <w:sz w:val="35"/>
+          <w:szCs w:val="35"/>
+        </w:rPr>
+        <w:t>NoSQL</w:t>
+      </w:r>
+      <w:proofErr w:type="spellEnd"/>
+      <w:r>
+        <w:rPr>
+          <w:sz w:val="35"/>
+          <w:szCs w:val="35"/>
+        </w:rPr>
+        <w:t xml:space="preserve"> injections in </w:t>
+      </w:r>
+      <w:proofErr w:type="spellStart"/>
+      <w:r>
+        <w:rPr>
+          <w:sz w:val="35"/>
+          <w:szCs w:val="35"/>
+        </w:rPr>
+        <w:t>MongoDB</w:t>
+      </w:r>
+      <w:proofErr w:type="spellEnd"/>
+      <w:r>
+        <w:rPr>
+          <w:sz w:val="35"/>
+          <w:szCs w:val="35"/>
+        </w:rPr>
+        <w:t>.</w:t>
       </w:r>
     </w:p>
     <w:p>
@@ -13075,7 +13384,23 @@
           <w:sz w:val="35"/>
           <w:szCs w:val="35"/>
         </w:rPr>
-        <w:t>Never hardcode sensitive data such as JWT secrets, database URIs, or API keys in the source code; strictly use environment (.env) variables.</w:t>
+        <w:t>Never hardcode sensitive data such as JWT secrets, database URIs, or API keys in the source code; strictly use environment (.</w:t>
+      </w:r>
+      <w:proofErr w:type="spellStart"/>
+      <w:r>
+        <w:rPr>
+          <w:sz w:val="35"/>
+          <w:szCs w:val="35"/>
+        </w:rPr>
+        <w:t>env</w:t>
+      </w:r>
+      <w:proofErr w:type="spellEnd"/>
+      <w:r>
+        <w:rPr>
+          <w:sz w:val="35"/>
+          <w:szCs w:val="35"/>
+        </w:rPr>
+        <w:t>) variables.</w:t>
       </w:r>
     </w:p>
     <w:p>
@@ -13130,23 +13455,23 @@
           <w:sz w:val="35"/>
           <w:szCs w:val="35"/>
         </w:rPr>
-        <w:t>Use clear, meaningful Git commit messages describing what changes were made and why.</w:t>
-      </w:r>
-    </w:p>
-    <w:p>
-      <w:pPr>
-        <w:jc w:val="both"/>
+        <w:t xml:space="preserve">Use clear, meaningful </w:t>
+      </w:r>
+      <w:proofErr w:type="spellStart"/>
+      <w:r>
         <w:rPr>
           <w:sz w:val="35"/>
           <w:szCs w:val="35"/>
         </w:rPr>
-      </w:pPr>
+        <w:t>Git</w:t>
+      </w:r>
+      <w:proofErr w:type="spellEnd"/>
       <w:r>
         <w:rPr>
           <w:sz w:val="35"/>
           <w:szCs w:val="35"/>
         </w:rPr>
-        <w:t>Keep code merges clean by resolving conflicts carefully and using dedicated branches for new features or bug fixes.</w:t>
+        <w:t xml:space="preserve"> commit messages describing what changes were made and why.</w:t>
       </w:r>
     </w:p>
     <w:p>
@@ -13162,6 +13487,22 @@
           <w:sz w:val="35"/>
           <w:szCs w:val="35"/>
         </w:rPr>
+        <w:t>Keep code merges clean by resolving conflicts carefully and using dedicated branches for new features or bug fixes.</w:t>
+      </w:r>
+    </w:p>
+    <w:p>
+      <w:pPr>
+        <w:jc w:val="both"/>
+        <w:rPr>
+          <w:sz w:val="35"/>
+          <w:szCs w:val="35"/>
+        </w:rPr>
+      </w:pPr>
+      <w:r>
+        <w:rPr>
+          <w:sz w:val="35"/>
+          <w:szCs w:val="35"/>
+        </w:rPr>
         <w:t>Tag major releases and critical updates for future reference and deployment tracking.</w:t>
       </w:r>
     </w:p>
@@ -13204,6 +13545,7 @@
           <w:sz w:val="32"/>
           <w:szCs w:val="32"/>
         </w:rPr>
+        <w:lastRenderedPageBreak/>
         <w:t>4.</w:t>
       </w:r>
       <w:r>
@@ -13488,6 +13830,7 @@
           <w:sz w:val="36"/>
           <w:szCs w:val="36"/>
         </w:rPr>
+        <w:lastRenderedPageBreak/>
         <w:t>PROPOSED ENHANCEMENTS</w:t>
       </w:r>
     </w:p>
@@ -13561,11 +13904,10 @@
           <w:szCs w:val="30"/>
           <w14:ligatures w14:val="none"/>
         </w:rPr>
-        <w:t xml:space="preserve"> Expand the Game and User MongoDB schemas to track advanced metrics, such as total hours played, last login timestamps, and detailed, granular achievement progress.</w:t>
-      </w:r>
-    </w:p>
-    <w:p>
-      <w:pPr>
+        <w:t xml:space="preserve"> Expand the Game and User </w:t>
+      </w:r>
+      <w:proofErr w:type="spellStart"/>
+      <w:r>
         <w:rPr>
           <w:rFonts w:ascii="Times New Roman" w:eastAsia="Times New Roman" w:hAnsi="Times New Roman" w:cs="Times New Roman"/>
           <w:kern w:val="0"/>
@@ -13573,19 +13915,9 @@
           <w:szCs w:val="30"/>
           <w14:ligatures w14:val="none"/>
         </w:rPr>
-      </w:pPr>
-      <w:r>
-        <w:rPr>
-          <w:rFonts w:ascii="Times New Roman" w:eastAsia="Times New Roman" w:hAnsi="Times New Roman" w:cs="Times New Roman"/>
-          <w:b/>
-          <w:bCs/>
-          <w:kern w:val="0"/>
-          <w:sz w:val="30"/>
-          <w:szCs w:val="30"/>
-          <w14:ligatures w14:val="none"/>
-        </w:rPr>
-        <w:t>Gameplay &amp; Leaderboards:</w:t>
-      </w:r>
+        <w:t>MongoDB</w:t>
+      </w:r>
+      <w:proofErr w:type="spellEnd"/>
       <w:r>
         <w:rPr>
           <w:rFonts w:ascii="Times New Roman" w:eastAsia="Times New Roman" w:hAnsi="Times New Roman" w:cs="Times New Roman"/>
@@ -13594,7 +13926,7 @@
           <w:szCs w:val="30"/>
           <w14:ligatures w14:val="none"/>
         </w:rPr>
-        <w:t xml:space="preserve"> Upgrade the leaderboard system by integrating Web Sockets (Socket.io) to support real-time updates during matches, ensuring high scores are instantly synced across all active clients.</w:t>
+        <w:t xml:space="preserve"> schemas to track advanced metrics, such as total hours played, last login timestamps, and detailed, granular achievement progress.</w:t>
       </w:r>
     </w:p>
     <w:p>
@@ -13617,7 +13949,7 @@
           <w:szCs w:val="30"/>
           <w14:ligatures w14:val="none"/>
         </w:rPr>
-        <w:t>Admin Dashboard Upgrades:</w:t>
+        <w:t>Gameplay &amp; Leaderboards:</w:t>
       </w:r>
       <w:r>
         <w:rPr>
@@ -13627,7 +13959,7 @@
           <w:szCs w:val="30"/>
           <w14:ligatures w14:val="none"/>
         </w:rPr>
-        <w:t xml:space="preserve"> Add robust filters, CSV export options, and dynamic visual charts tracking platform growth, most popular genres, and developer portfolio metrics to drive better content curation.</w:t>
+        <w:t xml:space="preserve"> Upgrade the leaderboard system by integrating Web Sockets (Socket.io) to support real-time updates during matches, ensuring high scores are instantly synced across all active clients.</w:t>
       </w:r>
     </w:p>
     <w:p>
@@ -13650,7 +13982,7 @@
           <w:szCs w:val="30"/>
           <w14:ligatures w14:val="none"/>
         </w:rPr>
-        <w:t>Developer Features:</w:t>
+        <w:t>Admin Dashboard Upgrades:</w:t>
       </w:r>
       <w:r>
         <w:rPr>
@@ -13660,11 +13992,10 @@
           <w:szCs w:val="30"/>
           <w14:ligatures w14:val="none"/>
         </w:rPr>
-        <w:t xml:space="preserve"> Allow developers to access detailed player retention analytics, deploy new game version updates without downtime, and temporarily hide their games from the public catalog for maintenance.</w:t>
-      </w:r>
-    </w:p>
-    <w:p>
-      <w:pPr>
+        <w:t xml:space="preserve"> Add robust filters, CSV export options, and dynamic visual charts tracking platform growth, most popular genres, and developer portfolio metrics to drive better content </w:t>
+      </w:r>
+      <w:proofErr w:type="spellStart"/>
+      <w:r>
         <w:rPr>
           <w:rFonts w:ascii="Times New Roman" w:eastAsia="Times New Roman" w:hAnsi="Times New Roman" w:cs="Times New Roman"/>
           <w:kern w:val="0"/>
@@ -13672,19 +14003,9 @@
           <w:szCs w:val="30"/>
           <w14:ligatures w14:val="none"/>
         </w:rPr>
-      </w:pPr>
-      <w:r>
-        <w:rPr>
-          <w:rFonts w:ascii="Times New Roman" w:eastAsia="Times New Roman" w:hAnsi="Times New Roman" w:cs="Times New Roman"/>
-          <w:b/>
-          <w:bCs/>
-          <w:kern w:val="0"/>
-          <w:sz w:val="30"/>
-          <w:szCs w:val="30"/>
-          <w14:ligatures w14:val="none"/>
-        </w:rPr>
-        <w:t>Player Experience:</w:t>
-      </w:r>
+        <w:t>curation</w:t>
+      </w:r>
+      <w:proofErr w:type="spellEnd"/>
       <w:r>
         <w:rPr>
           <w:rFonts w:ascii="Times New Roman" w:eastAsia="Times New Roman" w:hAnsi="Times New Roman" w:cs="Times New Roman"/>
@@ -13693,7 +14014,7 @@
           <w:szCs w:val="30"/>
           <w14:ligatures w14:val="none"/>
         </w:rPr>
-        <w:t xml:space="preserve"> Introduce social features such as adding friends, direct messaging, user-to-user challenges, and personalized game recommendations based on past gameplay history.</w:t>
+        <w:t>.</w:t>
       </w:r>
     </w:p>
     <w:p>
@@ -13716,7 +14037,7 @@
           <w:szCs w:val="30"/>
           <w14:ligatures w14:val="none"/>
         </w:rPr>
-        <w:t>Code Structure:</w:t>
+        <w:t>Developer Features:</w:t>
       </w:r>
       <w:r>
         <w:rPr>
@@ -13726,7 +14047,139 @@
           <w:szCs w:val="30"/>
           <w14:ligatures w14:val="none"/>
         </w:rPr>
-        <w:t xml:space="preserve"> Incrementally migrate the codebase to strict TypeScript across both the frontend and backend for better type safety, and implement Redux for complex global state management in React.</w:t>
+        <w:t xml:space="preserve"> Allow developers to access detailed player retention analytics, deploy new game version updates without downtime, and temporarily hide their games from the public catalog for maintenance.</w:t>
+      </w:r>
+    </w:p>
+    <w:p>
+      <w:pPr>
+        <w:rPr>
+          <w:rFonts w:ascii="Times New Roman" w:eastAsia="Times New Roman" w:hAnsi="Times New Roman" w:cs="Times New Roman"/>
+          <w:kern w:val="0"/>
+          <w:sz w:val="30"/>
+          <w:szCs w:val="30"/>
+          <w14:ligatures w14:val="none"/>
+        </w:rPr>
+      </w:pPr>
+      <w:r>
+        <w:rPr>
+          <w:rFonts w:ascii="Times New Roman" w:eastAsia="Times New Roman" w:hAnsi="Times New Roman" w:cs="Times New Roman"/>
+          <w:b/>
+          <w:bCs/>
+          <w:kern w:val="0"/>
+          <w:sz w:val="30"/>
+          <w:szCs w:val="30"/>
+          <w14:ligatures w14:val="none"/>
+        </w:rPr>
+        <w:t>Player Experience:</w:t>
+      </w:r>
+      <w:r>
+        <w:rPr>
+          <w:rFonts w:ascii="Times New Roman" w:eastAsia="Times New Roman" w:hAnsi="Times New Roman" w:cs="Times New Roman"/>
+          <w:kern w:val="0"/>
+          <w:sz w:val="30"/>
+          <w:szCs w:val="30"/>
+          <w14:ligatures w14:val="none"/>
+        </w:rPr>
+        <w:t xml:space="preserve"> Introduce social features such as adding friends, direct messaging, user-to-user challenges, and personalized game recommendations based on past gameplay history.</w:t>
+      </w:r>
+    </w:p>
+    <w:p>
+      <w:pPr>
+        <w:rPr>
+          <w:rFonts w:ascii="Times New Roman" w:eastAsia="Times New Roman" w:hAnsi="Times New Roman" w:cs="Times New Roman"/>
+          <w:kern w:val="0"/>
+          <w:sz w:val="30"/>
+          <w:szCs w:val="30"/>
+          <w14:ligatures w14:val="none"/>
+        </w:rPr>
+      </w:pPr>
+      <w:r>
+        <w:rPr>
+          <w:rFonts w:ascii="Times New Roman" w:eastAsia="Times New Roman" w:hAnsi="Times New Roman" w:cs="Times New Roman"/>
+          <w:b/>
+          <w:bCs/>
+          <w:kern w:val="0"/>
+          <w:sz w:val="30"/>
+          <w:szCs w:val="30"/>
+          <w14:ligatures w14:val="none"/>
+        </w:rPr>
+        <w:t>Code Structure:</w:t>
+      </w:r>
+      <w:r>
+        <w:rPr>
+          <w:rFonts w:ascii="Times New Roman" w:eastAsia="Times New Roman" w:hAnsi="Times New Roman" w:cs="Times New Roman"/>
+          <w:kern w:val="0"/>
+          <w:sz w:val="30"/>
+          <w:szCs w:val="30"/>
+          <w14:ligatures w14:val="none"/>
+        </w:rPr>
+        <w:t xml:space="preserve"> Incrementally migrate </w:t>
+      </w:r>
+      <w:proofErr w:type="gramStart"/>
+      <w:r>
+        <w:rPr>
+          <w:rFonts w:ascii="Times New Roman" w:eastAsia="Times New Roman" w:hAnsi="Times New Roman" w:cs="Times New Roman"/>
+          <w:kern w:val="0"/>
+          <w:sz w:val="30"/>
+          <w:szCs w:val="30"/>
+          <w14:ligatures w14:val="none"/>
+        </w:rPr>
+        <w:t>the codebase</w:t>
+      </w:r>
+      <w:proofErr w:type="gramEnd"/>
+      <w:r>
+        <w:rPr>
+          <w:rFonts w:ascii="Times New Roman" w:eastAsia="Times New Roman" w:hAnsi="Times New Roman" w:cs="Times New Roman"/>
+          <w:kern w:val="0"/>
+          <w:sz w:val="30"/>
+          <w:szCs w:val="30"/>
+          <w14:ligatures w14:val="none"/>
+        </w:rPr>
+        <w:t xml:space="preserve"> to strict </w:t>
+      </w:r>
+      <w:proofErr w:type="spellStart"/>
+      <w:r>
+        <w:rPr>
+          <w:rFonts w:ascii="Times New Roman" w:eastAsia="Times New Roman" w:hAnsi="Times New Roman" w:cs="Times New Roman"/>
+          <w:kern w:val="0"/>
+          <w:sz w:val="30"/>
+          <w:szCs w:val="30"/>
+          <w14:ligatures w14:val="none"/>
+        </w:rPr>
+        <w:t>TypeScript</w:t>
+      </w:r>
+      <w:proofErr w:type="spellEnd"/>
+      <w:r>
+        <w:rPr>
+          <w:rFonts w:ascii="Times New Roman" w:eastAsia="Times New Roman" w:hAnsi="Times New Roman" w:cs="Times New Roman"/>
+          <w:kern w:val="0"/>
+          <w:sz w:val="30"/>
+          <w:szCs w:val="30"/>
+          <w14:ligatures w14:val="none"/>
+        </w:rPr>
+        <w:t xml:space="preserve"> across both the frontend and backend for better type safety, and implement </w:t>
+      </w:r>
+      <w:proofErr w:type="spellStart"/>
+      <w:r>
+        <w:rPr>
+          <w:rFonts w:ascii="Times New Roman" w:eastAsia="Times New Roman" w:hAnsi="Times New Roman" w:cs="Times New Roman"/>
+          <w:kern w:val="0"/>
+          <w:sz w:val="30"/>
+          <w:szCs w:val="30"/>
+          <w14:ligatures w14:val="none"/>
+        </w:rPr>
+        <w:t>Redux</w:t>
+      </w:r>
+      <w:proofErr w:type="spellEnd"/>
+      <w:r>
+        <w:rPr>
+          <w:rFonts w:ascii="Times New Roman" w:eastAsia="Times New Roman" w:hAnsi="Times New Roman" w:cs="Times New Roman"/>
+          <w:kern w:val="0"/>
+          <w:sz w:val="30"/>
+          <w:szCs w:val="30"/>
+          <w14:ligatures w14:val="none"/>
+        </w:rPr>
+        <w:t xml:space="preserve"> for complex global state management in React.</w:t>
       </w:r>
     </w:p>
     <w:p>
@@ -13813,6 +14266,7 @@
           <w:sz w:val="36"/>
           <w:szCs w:val="36"/>
         </w:rPr>
+        <w:lastRenderedPageBreak/>
         <w:t xml:space="preserve"> </w:t>
       </w:r>
       <w:r>
@@ -13858,7 +14312,39 @@
           <w:sz w:val="26"/>
           <w:szCs w:val="26"/>
         </w:rPr>
-        <w:t>Core features such as user registration, secure logins, developer game publication workflows, interactive gameplay, global leaderboards, and achievement tracking are fully implemented using the modern MERN stack (MongoDB, Express.js, React, and Node.js).</w:t>
+        <w:t xml:space="preserve">Core features such as user registration, secure logins, </w:t>
+      </w:r>
+      <w:proofErr w:type="gramStart"/>
+      <w:r>
+        <w:rPr>
+          <w:sz w:val="26"/>
+          <w:szCs w:val="26"/>
+        </w:rPr>
+        <w:t>developer</w:t>
+      </w:r>
+      <w:proofErr w:type="gramEnd"/>
+      <w:r>
+        <w:rPr>
+          <w:sz w:val="26"/>
+          <w:szCs w:val="26"/>
+        </w:rPr>
+        <w:t xml:space="preserve"> game publication workflows, interactive gameplay, global leaderboards, and achievement tracking are fully implemented using the modern MERN stack (</w:t>
+      </w:r>
+      <w:proofErr w:type="spellStart"/>
+      <w:r>
+        <w:rPr>
+          <w:sz w:val="26"/>
+          <w:szCs w:val="26"/>
+        </w:rPr>
+        <w:t>MongoDB</w:t>
+      </w:r>
+      <w:proofErr w:type="spellEnd"/>
+      <w:r>
+        <w:rPr>
+          <w:sz w:val="26"/>
+          <w:szCs w:val="26"/>
+        </w:rPr>
+        <w:t>, Express.js, React, and Node.js).</w:t>
       </w:r>
     </w:p>
     <w:p>
@@ -13876,7 +14362,39 @@
           <w:sz w:val="26"/>
           <w:szCs w:val="26"/>
         </w:rPr>
-        <w:t>The system actively demonstrates the practical application of RESTful API design, robust token-based authentication (JWT), complex NoSQL data modeling, and modern component-driven frontend architecture.</w:t>
+        <w:t xml:space="preserve">The system actively demonstrates the practical application of </w:t>
+      </w:r>
+      <w:proofErr w:type="spellStart"/>
+      <w:r>
+        <w:rPr>
+          <w:sz w:val="26"/>
+          <w:szCs w:val="26"/>
+        </w:rPr>
+        <w:t>RESTful</w:t>
+      </w:r>
+      <w:proofErr w:type="spellEnd"/>
+      <w:r>
+        <w:rPr>
+          <w:sz w:val="26"/>
+          <w:szCs w:val="26"/>
+        </w:rPr>
+        <w:t xml:space="preserve"> API design, robust token-based authentication (JWT), complex </w:t>
+      </w:r>
+      <w:proofErr w:type="spellStart"/>
+      <w:r>
+        <w:rPr>
+          <w:sz w:val="26"/>
+          <w:szCs w:val="26"/>
+        </w:rPr>
+        <w:t>NoSQL</w:t>
+      </w:r>
+      <w:proofErr w:type="spellEnd"/>
+      <w:r>
+        <w:rPr>
+          <w:sz w:val="26"/>
+          <w:szCs w:val="26"/>
+        </w:rPr>
+        <w:t xml:space="preserve"> data modeling, and modern component-driven frontend architecture.</w:t>
       </w:r>
     </w:p>
     <w:p>
@@ -14039,13 +14557,10 @@
           <w:szCs w:val="26"/>
           <w14:ligatures w14:val="none"/>
         </w:rPr>
-        <w:t xml:space="preserve"> Technical guides for setting up the backend server environment, routing RESTful API endpoints, and handling authentication middleware.</w:t>
-      </w:r>
-    </w:p>
-    <w:p>
-      <w:pPr>
-        <w:pStyle w:val="ListParagraph"/>
-        <w:ind w:left="360"/>
+        <w:t xml:space="preserve"> Technical guides for setting up the backend server environment, routing </w:t>
+      </w:r>
+      <w:proofErr w:type="spellStart"/>
+      <w:r>
         <w:rPr>
           <w:rFonts w:ascii="Times New Roman" w:eastAsia="Times New Roman" w:hAnsi="Times New Roman" w:cs="Times New Roman"/>
           <w:kern w:val="0"/>
@@ -14053,12 +14568,10 @@
           <w:szCs w:val="26"/>
           <w14:ligatures w14:val="none"/>
         </w:rPr>
-      </w:pPr>
-    </w:p>
-    <w:p>
-      <w:pPr>
-        <w:pStyle w:val="ListParagraph"/>
-        <w:ind w:left="360"/>
+        <w:t>RESTful</w:t>
+      </w:r>
+      <w:proofErr w:type="spellEnd"/>
+      <w:r>
         <w:rPr>
           <w:rFonts w:ascii="Times New Roman" w:eastAsia="Times New Roman" w:hAnsi="Times New Roman" w:cs="Times New Roman"/>
           <w:kern w:val="0"/>
@@ -14066,20 +14579,13 @@
           <w:szCs w:val="26"/>
           <w14:ligatures w14:val="none"/>
         </w:rPr>
-      </w:pPr>
-      <w:r>
-        <w:rPr>
-          <w:rFonts w:ascii="Times New Roman" w:eastAsia="Times New Roman" w:hAnsi="Times New Roman" w:cs="Times New Roman"/>
-          <w:b/>
-          <w:bCs/>
-          <w:kern w:val="0"/>
-          <w:sz w:val="26"/>
-          <w:szCs w:val="26"/>
-          <w14:ligatures w14:val="none"/>
-        </w:rPr>
-        <w:t>MongoDB &amp; Mongoose Documentation –</w:t>
-      </w:r>
-      <w:r>
+        <w:t xml:space="preserve"> API endpoints, and handling authentication middleware.</w:t>
+      </w:r>
+    </w:p>
+    <w:p>
+      <w:pPr>
+        <w:pStyle w:val="ListParagraph"/>
+        <w:ind w:left="360"/>
         <w:rPr>
           <w:rFonts w:ascii="Times New Roman" w:eastAsia="Times New Roman" w:hAnsi="Times New Roman" w:cs="Times New Roman"/>
           <w:kern w:val="0"/>
@@ -14087,8 +14593,7 @@
           <w:szCs w:val="26"/>
           <w14:ligatures w14:val="none"/>
         </w:rPr>
-        <w:t xml:space="preserve"> References for NoSQL database schema design, data modeling, and executing queries for users, game catalogs, and leaderboards.</w:t>
-      </w:r>
+      </w:pPr>
     </w:p>
     <w:p>
       <w:pPr>
@@ -14102,11 +14607,33 @@
           <w14:ligatures w14:val="none"/>
         </w:rPr>
       </w:pPr>
-    </w:p>
-    <w:p>
-      <w:pPr>
-        <w:pStyle w:val="ListParagraph"/>
-        <w:ind w:left="360"/>
+      <w:proofErr w:type="spellStart"/>
+      <w:r>
+        <w:rPr>
+          <w:rFonts w:ascii="Times New Roman" w:eastAsia="Times New Roman" w:hAnsi="Times New Roman" w:cs="Times New Roman"/>
+          <w:b/>
+          <w:bCs/>
+          <w:kern w:val="0"/>
+          <w:sz w:val="26"/>
+          <w:szCs w:val="26"/>
+          <w14:ligatures w14:val="none"/>
+        </w:rPr>
+        <w:t>MongoDB</w:t>
+      </w:r>
+      <w:proofErr w:type="spellEnd"/>
+      <w:r>
+        <w:rPr>
+          <w:rFonts w:ascii="Times New Roman" w:eastAsia="Times New Roman" w:hAnsi="Times New Roman" w:cs="Times New Roman"/>
+          <w:b/>
+          <w:bCs/>
+          <w:kern w:val="0"/>
+          <w:sz w:val="26"/>
+          <w:szCs w:val="26"/>
+          <w14:ligatures w14:val="none"/>
+        </w:rPr>
+        <w:t xml:space="preserve"> &amp; Mongoose Documentation –</w:t>
+      </w:r>
+      <w:r>
         <w:rPr>
           <w:rFonts w:ascii="Times New Roman" w:eastAsia="Times New Roman" w:hAnsi="Times New Roman" w:cs="Times New Roman"/>
           <w:kern w:val="0"/>
@@ -14114,19 +14641,9 @@
           <w:szCs w:val="26"/>
           <w14:ligatures w14:val="none"/>
         </w:rPr>
-      </w:pPr>
-      <w:r>
-        <w:rPr>
-          <w:rFonts w:ascii="Times New Roman" w:eastAsia="Times New Roman" w:hAnsi="Times New Roman" w:cs="Times New Roman"/>
-          <w:b/>
-          <w:bCs/>
-          <w:kern w:val="0"/>
-          <w:sz w:val="26"/>
-          <w:szCs w:val="26"/>
-          <w14:ligatures w14:val="none"/>
-        </w:rPr>
-        <w:t xml:space="preserve">MDN Web Docs – </w:t>
-      </w:r>
+        <w:t xml:space="preserve"> References for </w:t>
+      </w:r>
+      <w:proofErr w:type="spellStart"/>
       <w:r>
         <w:rPr>
           <w:rFonts w:ascii="Times New Roman" w:eastAsia="Times New Roman" w:hAnsi="Times New Roman" w:cs="Times New Roman"/>
@@ -14135,13 +14652,10 @@
           <w:szCs w:val="26"/>
           <w14:ligatures w14:val="none"/>
         </w:rPr>
-        <w:t>Core HTML5, CSS3, and modern JavaScript (ES6+) references used for building responsive layouts, handling asynchronous API calls, and form validation.</w:t>
-      </w:r>
-    </w:p>
-    <w:p>
-      <w:pPr>
-        <w:pStyle w:val="ListParagraph"/>
-        <w:ind w:left="360"/>
+        <w:t>NoSQL</w:t>
+      </w:r>
+      <w:proofErr w:type="spellEnd"/>
+      <w:r>
         <w:rPr>
           <w:rFonts w:ascii="Times New Roman" w:eastAsia="Times New Roman" w:hAnsi="Times New Roman" w:cs="Times New Roman"/>
           <w:kern w:val="0"/>
@@ -14149,7 +14663,8 @@
           <w:szCs w:val="26"/>
           <w14:ligatures w14:val="none"/>
         </w:rPr>
-      </w:pPr>
+        <w:t xml:space="preserve"> database schema design, data modeling, and executing queries for users, game catalogs, and leaderboards.</w:t>
+      </w:r>
     </w:p>
     <w:p>
       <w:pPr>
@@ -14163,19 +14678,11 @@
           <w14:ligatures w14:val="none"/>
         </w:rPr>
       </w:pPr>
-      <w:r>
-        <w:rPr>
-          <w:rFonts w:ascii="Times New Roman" w:eastAsia="Times New Roman" w:hAnsi="Times New Roman" w:cs="Times New Roman"/>
-          <w:b/>
-          <w:bCs/>
-          <w:kern w:val="0"/>
-          <w:sz w:val="26"/>
-          <w:szCs w:val="26"/>
-          <w14:ligatures w14:val="none"/>
-        </w:rPr>
-        <w:t>Font Awesome / UI Library Documentation –</w:t>
-      </w:r>
-      <w:r>
+    </w:p>
+    <w:p>
+      <w:pPr>
+        <w:pStyle w:val="ListParagraph"/>
+        <w:ind w:left="360"/>
         <w:rPr>
           <w:rFonts w:ascii="Times New Roman" w:eastAsia="Times New Roman" w:hAnsi="Times New Roman" w:cs="Times New Roman"/>
           <w:kern w:val="0"/>
@@ -14183,13 +14690,21 @@
           <w:szCs w:val="26"/>
           <w14:ligatures w14:val="none"/>
         </w:rPr>
-        <w:t xml:space="preserve"> Styling and icon usage guidelines for integrating visual elements into navigation headers, action buttons, and dashboard analytics cards.</w:t>
-      </w:r>
-    </w:p>
-    <w:p>
-      <w:pPr>
-        <w:pStyle w:val="ListParagraph"/>
-        <w:ind w:left="360"/>
+      </w:pPr>
+      <w:r>
+        <w:rPr>
+          <w:rFonts w:ascii="Times New Roman" w:eastAsia="Times New Roman" w:hAnsi="Times New Roman" w:cs="Times New Roman"/>
+          <w:b/>
+          <w:bCs/>
+          <w:kern w:val="0"/>
+          <w:sz w:val="26"/>
+          <w:szCs w:val="26"/>
+          <w14:ligatures w14:val="none"/>
+        </w:rPr>
+        <w:lastRenderedPageBreak/>
+        <w:t xml:space="preserve">MDN Web Docs – </w:t>
+      </w:r>
+      <w:r>
         <w:rPr>
           <w:rFonts w:ascii="Times New Roman" w:eastAsia="Times New Roman" w:hAnsi="Times New Roman" w:cs="Times New Roman"/>
           <w:kern w:val="0"/>
@@ -14197,7 +14712,8 @@
           <w:szCs w:val="26"/>
           <w14:ligatures w14:val="none"/>
         </w:rPr>
-      </w:pPr>
+        <w:t>Core HTML5, CSS3, and modern JavaScript (ES6+) references used for building responsive layouts, handling asynchronous API calls, and form validation.</w:t>
+      </w:r>
     </w:p>
     <w:p>
       <w:pPr>
@@ -14211,19 +14727,11 @@
           <w14:ligatures w14:val="none"/>
         </w:rPr>
       </w:pPr>
-      <w:r>
-        <w:rPr>
-          <w:rFonts w:ascii="Times New Roman" w:eastAsia="Times New Roman" w:hAnsi="Times New Roman" w:cs="Times New Roman"/>
-          <w:b/>
-          <w:bCs/>
-          <w:kern w:val="0"/>
-          <w:sz w:val="26"/>
-          <w:szCs w:val="26"/>
-          <w14:ligatures w14:val="none"/>
-        </w:rPr>
-        <w:t>Stack Overflow and Developer Forums –</w:t>
-      </w:r>
-      <w:r>
+    </w:p>
+    <w:p>
+      <w:pPr>
+        <w:pStyle w:val="ListParagraph"/>
+        <w:ind w:left="360"/>
         <w:rPr>
           <w:rFonts w:ascii="Times New Roman" w:eastAsia="Times New Roman" w:hAnsi="Times New Roman" w:cs="Times New Roman"/>
           <w:kern w:val="0"/>
@@ -14231,7 +14739,98 @@
           <w:szCs w:val="26"/>
           <w14:ligatures w14:val="none"/>
         </w:rPr>
-        <w:t xml:space="preserve"> Conceptual guidance for resolving technical challenges related to JWT authentication flows, React state management, and MongoDB aggregations (no direct code copied; strictly used for debugging insights and architectural approaches).</w:t>
+      </w:pPr>
+      <w:r>
+        <w:rPr>
+          <w:rFonts w:ascii="Times New Roman" w:eastAsia="Times New Roman" w:hAnsi="Times New Roman" w:cs="Times New Roman"/>
+          <w:b/>
+          <w:bCs/>
+          <w:kern w:val="0"/>
+          <w:sz w:val="26"/>
+          <w:szCs w:val="26"/>
+          <w14:ligatures w14:val="none"/>
+        </w:rPr>
+        <w:t>Font Awesome / UI Library Documentation –</w:t>
+      </w:r>
+      <w:r>
+        <w:rPr>
+          <w:rFonts w:ascii="Times New Roman" w:eastAsia="Times New Roman" w:hAnsi="Times New Roman" w:cs="Times New Roman"/>
+          <w:kern w:val="0"/>
+          <w:sz w:val="26"/>
+          <w:szCs w:val="26"/>
+          <w14:ligatures w14:val="none"/>
+        </w:rPr>
+        <w:t xml:space="preserve"> Styling and icon usage guidelines for integrating visual elements into navigation headers, action buttons, and dashboard analytics cards.</w:t>
+      </w:r>
+    </w:p>
+    <w:p>
+      <w:pPr>
+        <w:pStyle w:val="ListParagraph"/>
+        <w:ind w:left="360"/>
+        <w:rPr>
+          <w:rFonts w:ascii="Times New Roman" w:eastAsia="Times New Roman" w:hAnsi="Times New Roman" w:cs="Times New Roman"/>
+          <w:kern w:val="0"/>
+          <w:sz w:val="26"/>
+          <w:szCs w:val="26"/>
+          <w14:ligatures w14:val="none"/>
+        </w:rPr>
+      </w:pPr>
+    </w:p>
+    <w:p>
+      <w:pPr>
+        <w:pStyle w:val="ListParagraph"/>
+        <w:ind w:left="360"/>
+        <w:rPr>
+          <w:rFonts w:ascii="Times New Roman" w:eastAsia="Times New Roman" w:hAnsi="Times New Roman" w:cs="Times New Roman"/>
+          <w:kern w:val="0"/>
+          <w:sz w:val="26"/>
+          <w:szCs w:val="26"/>
+          <w14:ligatures w14:val="none"/>
+        </w:rPr>
+      </w:pPr>
+      <w:r>
+        <w:rPr>
+          <w:rFonts w:ascii="Times New Roman" w:eastAsia="Times New Roman" w:hAnsi="Times New Roman" w:cs="Times New Roman"/>
+          <w:b/>
+          <w:bCs/>
+          <w:kern w:val="0"/>
+          <w:sz w:val="26"/>
+          <w:szCs w:val="26"/>
+          <w14:ligatures w14:val="none"/>
+        </w:rPr>
+        <w:t>Stack Overflow and Developer Forums –</w:t>
+      </w:r>
+      <w:r>
+        <w:rPr>
+          <w:rFonts w:ascii="Times New Roman" w:eastAsia="Times New Roman" w:hAnsi="Times New Roman" w:cs="Times New Roman"/>
+          <w:kern w:val="0"/>
+          <w:sz w:val="26"/>
+          <w:szCs w:val="26"/>
+          <w14:ligatures w14:val="none"/>
+        </w:rPr>
+        <w:t xml:space="preserve"> Conceptual guidance for resolving technical challenges related to JWT authentication flows, React state management, and </w:t>
+      </w:r>
+      <w:proofErr w:type="spellStart"/>
+      <w:r>
+        <w:rPr>
+          <w:rFonts w:ascii="Times New Roman" w:eastAsia="Times New Roman" w:hAnsi="Times New Roman" w:cs="Times New Roman"/>
+          <w:kern w:val="0"/>
+          <w:sz w:val="26"/>
+          <w:szCs w:val="26"/>
+          <w14:ligatures w14:val="none"/>
+        </w:rPr>
+        <w:t>MongoDB</w:t>
+      </w:r>
+      <w:proofErr w:type="spellEnd"/>
+      <w:r>
+        <w:rPr>
+          <w:rFonts w:ascii="Times New Roman" w:eastAsia="Times New Roman" w:hAnsi="Times New Roman" w:cs="Times New Roman"/>
+          <w:kern w:val="0"/>
+          <w:sz w:val="26"/>
+          <w:szCs w:val="26"/>
+          <w14:ligatures w14:val="none"/>
+        </w:rPr>
+        <w:t xml:space="preserve"> aggregations (no direct code copied; strictly used for debugging insights and architectural approaches).</w:t>
       </w:r>
     </w:p>
     <w:p>
@@ -14243,9 +14842,11 @@
           <w:szCs w:val="26"/>
         </w:rPr>
       </w:pPr>
+      <w:bookmarkStart w:id="0" w:name="_GoBack"/>
+      <w:bookmarkEnd w:id="0"/>
     </w:p>
     <w:sectPr>
-      <w:headerReference w:type="default" r:id="rId20"/>
+      <w:headerReference w:type="default" r:id="rId21"/>
       <w:pgSz w:w="12240" w:h="15840"/>
       <w:pgMar w:top="1440" w:right="1440" w:bottom="1440" w:left="1440" w:header="720" w:footer="720" w:gutter="0"/>
       <w:cols w:space="720"/>
@@ -14256,7 +14857,7 @@
 </file>
 
 <file path=word/endnotes.xml><?xml version="1.0" encoding="utf-8"?>
-<w:endnotes xmlns:wpc="http://schemas.microsoft.com/office/word/2010/wordprocessingCanvas" xmlns:cx="http://schemas.microsoft.com/office/drawing/2014/chartex" xmlns:cx1="http://schemas.microsoft.com/office/drawing/2015/9/8/chartex" xmlns:cx2="http://schemas.microsoft.com/office/drawing/2015/10/21/chartex" xmlns:cx3="http://schemas.microsoft.com/office/drawing/2016/5/9/chartex" xmlns:cx4="http://schemas.microsoft.com/office/drawing/2016/5/10/chartex" xmlns:cx5="http://schemas.microsoft.com/office/drawing/2016/5/11/chartex" xmlns:cx6="http://schemas.microsoft.com/office/drawing/2016/5/12/chartex" xmlns:cx7="http://schemas.microsoft.com/office/drawing/2016/5/13/chartex" xmlns:cx8="http://schemas.microsoft.com/office/drawing/2016/5/14/chartex" xmlns:mc="http://schemas.openxmlformats.org/markup-compatibility/2006" xmlns:aink="http://schemas.microsoft.com/office/drawing/2016/ink" xmlns:am3d="http://schemas.microsoft.com/office/drawing/2017/model3d" xmlns:o="urn:schemas-microsoft-com:office:office" xmlns:oel="http://schemas.microsoft.com/office/2019/extlst" xmlns:r="http://schemas.openxmlformats.org/officeDocument/2006/relationships" xmlns:m="http://schemas.openxmlformats.org/officeDocument/2006/math" xmlns:v="urn:schemas-microsoft-com:vml" xmlns:wp14="http://schemas.microsoft.com/office/word/2010/wordprocessingDrawing" xmlns:wp="http://schemas.openxmlformats.org/drawingml/2006/wordprocessingDrawing" xmlns:w10="urn:schemas-microsoft-com:office:word" xmlns:w="http://schemas.openxmlformats.org/wordprocessingml/2006/main" xmlns:w14="http://schemas.microsoft.com/office/word/2010/wordml" xmlns:w15="http://schemas.microsoft.com/office/word/2012/wordml" xmlns:w16cex="http://schemas.microsoft.com/office/word/2018/wordml/cex" xmlns:w16cid="http://schemas.microsoft.com/office/word/2016/wordml/cid" xmlns:w16="http://schemas.microsoft.com/office/word/2018/wordml" xmlns:w16du="http://schemas.microsoft.com/office/word/2023/wordml/word16du" xmlns:w16sdtdh="http://schemas.microsoft.com/office/word/2020/wordml/sdtdatahash" xmlns:w16sdtfl="http://schemas.microsoft.com/office/word/2024/wordml/sdtformatlock" xmlns:w16se="http://schemas.microsoft.com/office/word/2015/wordml/symex" xmlns:wpg="http://schemas.microsoft.com/office/word/2010/wordprocessingGroup" xmlns:wpi="http://schemas.microsoft.com/office/word/2010/wordprocessingInk" xmlns:wne="http://schemas.microsoft.com/office/word/2006/wordml" xmlns:wps="http://schemas.microsoft.com/office/word/2010/wordprocessingShape" mc:Ignorable="w14 w15 w16se w16cid w16 w16cex w16sdtdh w16sdtfl w16du wp14">
+<w:endnotes xmlns:wpc="http://schemas.microsoft.com/office/word/2010/wordprocessingCanvas" xmlns:mc="http://schemas.openxmlformats.org/markup-compatibility/2006" xmlns:o="urn:schemas-microsoft-com:office:office" xmlns:r="http://schemas.openxmlformats.org/officeDocument/2006/relationships" xmlns:m="http://schemas.openxmlformats.org/officeDocument/2006/math" xmlns:v="urn:schemas-microsoft-com:vml" xmlns:wp14="http://schemas.microsoft.com/office/word/2010/wordprocessingDrawing" xmlns:wp="http://schemas.openxmlformats.org/drawingml/2006/wordprocessingDrawing" xmlns:w10="urn:schemas-microsoft-com:office:word" xmlns:w="http://schemas.openxmlformats.org/wordprocessingml/2006/main" xmlns:w14="http://schemas.microsoft.com/office/word/2010/wordml" xmlns:w15="http://schemas.microsoft.com/office/word/2012/wordml" xmlns:wpg="http://schemas.microsoft.com/office/word/2010/wordprocessingGroup" xmlns:wpi="http://schemas.microsoft.com/office/word/2010/wordprocessingInk" xmlns:wne="http://schemas.microsoft.com/office/word/2006/wordml" xmlns:wps="http://schemas.microsoft.com/office/word/2010/wordprocessingShape" mc:Ignorable="w14 w15 wp14">
   <w:endnote w:type="separator" w:id="-1">
     <w:p>
       <w:pPr>
@@ -14281,7 +14882,7 @@
 </file>
 
 <file path=word/footer1.xml><?xml version="1.0" encoding="utf-8"?>
-<w:ftr xmlns:wpc="http://schemas.microsoft.com/office/word/2010/wordprocessingCanvas" xmlns:cx="http://schemas.microsoft.com/office/drawing/2014/chartex" xmlns:cx1="http://schemas.microsoft.com/office/drawing/2015/9/8/chartex" xmlns:cx2="http://schemas.microsoft.com/office/drawing/2015/10/21/chartex" xmlns:cx3="http://schemas.microsoft.com/office/drawing/2016/5/9/chartex" xmlns:cx4="http://schemas.microsoft.com/office/drawing/2016/5/10/chartex" xmlns:cx5="http://schemas.microsoft.com/office/drawing/2016/5/11/chartex" xmlns:cx6="http://schemas.microsoft.com/office/drawing/2016/5/12/chartex" xmlns:cx7="http://schemas.microsoft.com/office/drawing/2016/5/13/chartex" xmlns:cx8="http://schemas.microsoft.com/office/drawing/2016/5/14/chartex" xmlns:mc="http://schemas.openxmlformats.org/markup-compatibility/2006" xmlns:aink="http://schemas.microsoft.com/office/drawing/2016/ink" xmlns:am3d="http://schemas.microsoft.com/office/drawing/2017/model3d" xmlns:o="urn:schemas-microsoft-com:office:office" xmlns:oel="http://schemas.microsoft.com/office/2019/extlst" xmlns:r="http://schemas.openxmlformats.org/officeDocument/2006/relationships" xmlns:m="http://schemas.openxmlformats.org/officeDocument/2006/math" xmlns:v="urn:schemas-microsoft-com:vml" xmlns:wp14="http://schemas.microsoft.com/office/word/2010/wordprocessingDrawing" xmlns:wp="http://schemas.openxmlformats.org/drawingml/2006/wordprocessingDrawing" xmlns:w10="urn:schemas-microsoft-com:office:word" xmlns:w="http://schemas.openxmlformats.org/wordprocessingml/2006/main" xmlns:w14="http://schemas.microsoft.com/office/word/2010/wordml" xmlns:w15="http://schemas.microsoft.com/office/word/2012/wordml" xmlns:w16cex="http://schemas.microsoft.com/office/word/2018/wordml/cex" xmlns:w16cid="http://schemas.microsoft.com/office/word/2016/wordml/cid" xmlns:w16="http://schemas.microsoft.com/office/word/2018/wordml" xmlns:w16du="http://schemas.microsoft.com/office/word/2023/wordml/word16du" xmlns:w16sdtdh="http://schemas.microsoft.com/office/word/2020/wordml/sdtdatahash" xmlns:w16sdtfl="http://schemas.microsoft.com/office/word/2024/wordml/sdtformatlock" xmlns:w16se="http://schemas.microsoft.com/office/word/2015/wordml/symex" xmlns:wpg="http://schemas.microsoft.com/office/word/2010/wordprocessingGroup" xmlns:wpi="http://schemas.microsoft.com/office/word/2010/wordprocessingInk" xmlns:wne="http://schemas.microsoft.com/office/word/2006/wordml" xmlns:wps="http://schemas.microsoft.com/office/word/2010/wordprocessingShape" mc:Ignorable="w14 w15 w16se w16cid w16 w16cex w16sdtdh w16sdtfl w16du wp14">
+<w:ftr xmlns:wpc="http://schemas.microsoft.com/office/word/2010/wordprocessingCanvas" xmlns:mc="http://schemas.openxmlformats.org/markup-compatibility/2006" xmlns:o="urn:schemas-microsoft-com:office:office" xmlns:r="http://schemas.openxmlformats.org/officeDocument/2006/relationships" xmlns:m="http://schemas.openxmlformats.org/officeDocument/2006/math" xmlns:v="urn:schemas-microsoft-com:vml" xmlns:wp14="http://schemas.microsoft.com/office/word/2010/wordprocessingDrawing" xmlns:wp="http://schemas.openxmlformats.org/drawingml/2006/wordprocessingDrawing" xmlns:w10="urn:schemas-microsoft-com:office:word" xmlns:w="http://schemas.openxmlformats.org/wordprocessingml/2006/main" xmlns:w14="http://schemas.microsoft.com/office/word/2010/wordml" xmlns:w15="http://schemas.microsoft.com/office/word/2012/wordml" xmlns:wpg="http://schemas.microsoft.com/office/word/2010/wordprocessingGroup" xmlns:wpi="http://schemas.microsoft.com/office/word/2010/wordprocessingInk" xmlns:wne="http://schemas.microsoft.com/office/word/2006/wordml" xmlns:wps="http://schemas.microsoft.com/office/word/2010/wordprocessingShape" mc:Ignorable="w14 w15 wp14">
   <w:p>
     <w:pPr>
       <w:pStyle w:val="BodyText"/>
@@ -14294,6 +14895,7 @@
       <w:rPr>
         <w:noProof/>
         <w:sz w:val="20"/>
+        <w:lang w:bidi="gu-IN"/>
       </w:rPr>
       <mc:AlternateContent>
         <mc:Choice Requires="wps">
@@ -14350,7 +14952,7 @@
             </wp:anchor>
           </w:drawing>
         </mc:Choice>
-        <mc:Fallback>
+        <mc:Fallback xmlns:w16se="http://schemas.microsoft.com/office/word/2015/wordml/symex" xmlns:w16sdtfl="http://schemas.microsoft.com/office/word/2024/wordml/sdtformatlock" xmlns:w16sdtdh="http://schemas.microsoft.com/office/word/2020/wordml/sdtdatahash" xmlns:w16du="http://schemas.microsoft.com/office/word/2023/wordml/word16du" xmlns:w16="http://schemas.microsoft.com/office/word/2018/wordml" xmlns:w16cid="http://schemas.microsoft.com/office/word/2016/wordml/cid" xmlns:w16cex="http://schemas.microsoft.com/office/word/2018/wordml/cex" xmlns:oel="http://schemas.microsoft.com/office/2019/extlst" xmlns:am3d="http://schemas.microsoft.com/office/drawing/2017/model3d" xmlns:aink="http://schemas.microsoft.com/office/drawing/2016/ink" xmlns:cx8="http://schemas.microsoft.com/office/drawing/2016/5/14/chartex" xmlns:cx7="http://schemas.microsoft.com/office/drawing/2016/5/13/chartex" xmlns:cx6="http://schemas.microsoft.com/office/drawing/2016/5/12/chartex" xmlns:cx5="http://schemas.microsoft.com/office/drawing/2016/5/11/chartex" xmlns:cx4="http://schemas.microsoft.com/office/drawing/2016/5/10/chartex" xmlns:cx3="http://schemas.microsoft.com/office/drawing/2016/5/9/chartex" xmlns:cx2="http://schemas.microsoft.com/office/drawing/2015/10/21/chartex" xmlns:cx1="http://schemas.microsoft.com/office/drawing/2015/9/8/chartex" xmlns:cx="http://schemas.microsoft.com/office/drawing/2014/chartex">
           <w:pict>
             <v:shapetype w14:anchorId="431D03F2" id="_x0000_t202" coordsize="21600,21600" o:spt="202" path="m,l,21600r21600,l21600,xe">
               <v:stroke joinstyle="miter"/>
@@ -14381,7 +14983,7 @@
 </file>
 
 <file path=word/footnotes.xml><?xml version="1.0" encoding="utf-8"?>
-<w:footnotes xmlns:wpc="http://schemas.microsoft.com/office/word/2010/wordprocessingCanvas" xmlns:cx="http://schemas.microsoft.com/office/drawing/2014/chartex" xmlns:cx1="http://schemas.microsoft.com/office/drawing/2015/9/8/chartex" xmlns:cx2="http://schemas.microsoft.com/office/drawing/2015/10/21/chartex" xmlns:cx3="http://schemas.microsoft.com/office/drawing/2016/5/9/chartex" xmlns:cx4="http://schemas.microsoft.com/office/drawing/2016/5/10/chartex" xmlns:cx5="http://schemas.microsoft.com/office/drawing/2016/5/11/chartex" xmlns:cx6="http://schemas.microsoft.com/office/drawing/2016/5/12/chartex" xmlns:cx7="http://schemas.microsoft.com/office/drawing/2016/5/13/chartex" xmlns:cx8="http://schemas.microsoft.com/office/drawing/2016/5/14/chartex" xmlns:mc="http://schemas.openxmlformats.org/markup-compatibility/2006" xmlns:aink="http://schemas.microsoft.com/office/drawing/2016/ink" xmlns:am3d="http://schemas.microsoft.com/office/drawing/2017/model3d" xmlns:o="urn:schemas-microsoft-com:office:office" xmlns:oel="http://schemas.microsoft.com/office/2019/extlst" xmlns:r="http://schemas.openxmlformats.org/officeDocument/2006/relationships" xmlns:m="http://schemas.openxmlformats.org/officeDocument/2006/math" xmlns:v="urn:schemas-microsoft-com:vml" xmlns:wp14="http://schemas.microsoft.com/office/word/2010/wordprocessingDrawing" xmlns:wp="http://schemas.openxmlformats.org/drawingml/2006/wordprocessingDrawing" xmlns:w10="urn:schemas-microsoft-com:office:word" xmlns:w="http://schemas.openxmlformats.org/wordprocessingml/2006/main" xmlns:w14="http://schemas.microsoft.com/office/word/2010/wordml" xmlns:w15="http://schemas.microsoft.com/office/word/2012/wordml" xmlns:w16cex="http://schemas.microsoft.com/office/word/2018/wordml/cex" xmlns:w16cid="http://schemas.microsoft.com/office/word/2016/wordml/cid" xmlns:w16="http://schemas.microsoft.com/office/word/2018/wordml" xmlns:w16du="http://schemas.microsoft.com/office/word/2023/wordml/word16du" xmlns:w16sdtdh="http://schemas.microsoft.com/office/word/2020/wordml/sdtdatahash" xmlns:w16sdtfl="http://schemas.microsoft.com/office/word/2024/wordml/sdtformatlock" xmlns:w16se="http://schemas.microsoft.com/office/word/2015/wordml/symex" xmlns:wpg="http://schemas.microsoft.com/office/word/2010/wordprocessingGroup" xmlns:wpi="http://schemas.microsoft.com/office/word/2010/wordprocessingInk" xmlns:wne="http://schemas.microsoft.com/office/word/2006/wordml" xmlns:wps="http://schemas.microsoft.com/office/word/2010/wordprocessingShape" mc:Ignorable="w14 w15 w16se w16cid w16 w16cex w16sdtdh w16sdtfl w16du wp14">
+<w:footnotes xmlns:wpc="http://schemas.microsoft.com/office/word/2010/wordprocessingCanvas" xmlns:mc="http://schemas.openxmlformats.org/markup-compatibility/2006" xmlns:o="urn:schemas-microsoft-com:office:office" xmlns:r="http://schemas.openxmlformats.org/officeDocument/2006/relationships" xmlns:m="http://schemas.openxmlformats.org/officeDocument/2006/math" xmlns:v="urn:schemas-microsoft-com:vml" xmlns:wp14="http://schemas.microsoft.com/office/word/2010/wordprocessingDrawing" xmlns:wp="http://schemas.openxmlformats.org/drawingml/2006/wordprocessingDrawing" xmlns:w10="urn:schemas-microsoft-com:office:word" xmlns:w="http://schemas.openxmlformats.org/wordprocessingml/2006/main" xmlns:w14="http://schemas.microsoft.com/office/word/2010/wordml" xmlns:w15="http://schemas.microsoft.com/office/word/2012/wordml" xmlns:wpg="http://schemas.microsoft.com/office/word/2010/wordprocessingGroup" xmlns:wpi="http://schemas.microsoft.com/office/word/2010/wordprocessingInk" xmlns:wne="http://schemas.microsoft.com/office/word/2006/wordml" xmlns:wps="http://schemas.microsoft.com/office/word/2010/wordprocessingShape" mc:Ignorable="w14 w15 wp14">
   <w:footnote w:type="separator" w:id="-1">
     <w:p>
       <w:pPr>
@@ -14406,7 +15008,7 @@
 </file>
 
 <file path=word/header1.xml><?xml version="1.0" encoding="utf-8"?>
-<w:hdr xmlns:wpc="http://schemas.microsoft.com/office/word/2010/wordprocessingCanvas" xmlns:cx="http://schemas.microsoft.com/office/drawing/2014/chartex" xmlns:cx1="http://schemas.microsoft.com/office/drawing/2015/9/8/chartex" xmlns:cx2="http://schemas.microsoft.com/office/drawing/2015/10/21/chartex" xmlns:cx3="http://schemas.microsoft.com/office/drawing/2016/5/9/chartex" xmlns:cx4="http://schemas.microsoft.com/office/drawing/2016/5/10/chartex" xmlns:cx5="http://schemas.microsoft.com/office/drawing/2016/5/11/chartex" xmlns:cx6="http://schemas.microsoft.com/office/drawing/2016/5/12/chartex" xmlns:cx7="http://schemas.microsoft.com/office/drawing/2016/5/13/chartex" xmlns:cx8="http://schemas.microsoft.com/office/drawing/2016/5/14/chartex" xmlns:mc="http://schemas.openxmlformats.org/markup-compatibility/2006" xmlns:aink="http://schemas.microsoft.com/office/drawing/2016/ink" xmlns:am3d="http://schemas.microsoft.com/office/drawing/2017/model3d" xmlns:o="urn:schemas-microsoft-com:office:office" xmlns:oel="http://schemas.microsoft.com/office/2019/extlst" xmlns:r="http://schemas.openxmlformats.org/officeDocument/2006/relationships" xmlns:m="http://schemas.openxmlformats.org/officeDocument/2006/math" xmlns:v="urn:schemas-microsoft-com:vml" xmlns:wp14="http://schemas.microsoft.com/office/word/2010/wordprocessingDrawing" xmlns:wp="http://schemas.openxmlformats.org/drawingml/2006/wordprocessingDrawing" xmlns:w10="urn:schemas-microsoft-com:office:word" xmlns:w="http://schemas.openxmlformats.org/wordprocessingml/2006/main" xmlns:w14="http://schemas.microsoft.com/office/word/2010/wordml" xmlns:w15="http://schemas.microsoft.com/office/word/2012/wordml" xmlns:w16cex="http://schemas.microsoft.com/office/word/2018/wordml/cex" xmlns:w16cid="http://schemas.microsoft.com/office/word/2016/wordml/cid" xmlns:w16="http://schemas.microsoft.com/office/word/2018/wordml" xmlns:w16du="http://schemas.microsoft.com/office/word/2023/wordml/word16du" xmlns:w16sdtdh="http://schemas.microsoft.com/office/word/2020/wordml/sdtdatahash" xmlns:w16sdtfl="http://schemas.microsoft.com/office/word/2024/wordml/sdtformatlock" xmlns:w16se="http://schemas.microsoft.com/office/word/2015/wordml/symex" xmlns:wpg="http://schemas.microsoft.com/office/word/2010/wordprocessingGroup" xmlns:wpi="http://schemas.microsoft.com/office/word/2010/wordprocessingInk" xmlns:wne="http://schemas.microsoft.com/office/word/2006/wordml" xmlns:wps="http://schemas.microsoft.com/office/word/2010/wordprocessingShape" mc:Ignorable="w14 w15 w16se w16cid w16 w16cex w16sdtdh w16sdtfl w16du wp14">
+<w:hdr xmlns:wpc="http://schemas.microsoft.com/office/word/2010/wordprocessingCanvas" xmlns:mc="http://schemas.openxmlformats.org/markup-compatibility/2006" xmlns:o="urn:schemas-microsoft-com:office:office" xmlns:r="http://schemas.openxmlformats.org/officeDocument/2006/relationships" xmlns:m="http://schemas.openxmlformats.org/officeDocument/2006/math" xmlns:v="urn:schemas-microsoft-com:vml" xmlns:wp14="http://schemas.microsoft.com/office/word/2010/wordprocessingDrawing" xmlns:wp="http://schemas.openxmlformats.org/drawingml/2006/wordprocessingDrawing" xmlns:w10="urn:schemas-microsoft-com:office:word" xmlns:w="http://schemas.openxmlformats.org/wordprocessingml/2006/main" xmlns:w14="http://schemas.microsoft.com/office/word/2010/wordml" xmlns:w15="http://schemas.microsoft.com/office/word/2012/wordml" xmlns:wpg="http://schemas.microsoft.com/office/word/2010/wordprocessingGroup" xmlns:wpi="http://schemas.microsoft.com/office/word/2010/wordprocessingInk" xmlns:wne="http://schemas.microsoft.com/office/word/2006/wordml" xmlns:wps="http://schemas.microsoft.com/office/word/2010/wordprocessingShape" mc:Ignorable="w14 w15 wp14">
   <w:p>
     <w:pPr>
       <w:pStyle w:val="BodyText"/>
@@ -14419,6 +15021,7 @@
       <w:rPr>
         <w:noProof/>
         <w:sz w:val="20"/>
+        <w:lang w:bidi="gu-IN"/>
       </w:rPr>
       <mc:AlternateContent>
         <mc:Choice Requires="wps">
@@ -14493,7 +15096,7 @@
                               <w:noProof/>
                               <w:u w:val="single" w:color="D9D9D9"/>
                             </w:rPr>
-                            <w:t>3</w:t>
+                            <w:t>1</w:t>
                           </w:r>
                           <w:r>
                             <w:rPr>
@@ -14548,7 +15151,8 @@
               <v:stroke joinstyle="miter"/>
               <v:path gradientshapeok="t" o:connecttype="rect"/>
             </v:shapetype>
-            <v:shape id="Textbox 1" o:spid="_x0000_s1026" type="#_x0000_t202" style="position:absolute;margin-left:50.9pt;margin-top:34.95pt;width:493.1pt;height:17.55pt;z-index:-251657216;visibility:visible;mso-wrap-style:square;mso-wrap-distance-left:0;mso-wrap-distance-top:0;mso-wrap-distance-right:0;mso-wrap-distance-bottom:0;mso-position-horizontal:absolute;mso-position-horizontal-relative:page;mso-position-vertical:absolute;mso-position-vertical-relative:page;v-text-anchor:top" o:gfxdata="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" filled="f" stroked="f">
+            <v:shape id="Textbox 1" o:spid="_x0000_s1026" type="#_x0000_t202" style="position:absolute;margin-left:50.9pt;margin-top:34.95pt;width:493.1pt;height:17.55pt;z-index:-251657216;visibility:visible;mso-wrap-style:square;mso-wrap-distance-left:0;mso-wrap-distance-top:0;mso-wrap-distance-right:0;mso-wrap-distance-bottom:0;mso-position-horizontal:absolute;mso-position-horizontal-relative:page;mso-position-vertical:absolute;mso-position-vertical-relative:page;v-text-anchor:top" o:gfxdata="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" filled="f" stroked="f">
+              <v:path arrowok="t"/>
               <v:textbox inset="0,0,0,0">
                 <w:txbxContent>
                   <w:p>
@@ -14589,7 +15193,7 @@
                         <w:noProof/>
                         <w:u w:val="single" w:color="D9D9D9"/>
                       </w:rPr>
-                      <w:t>3</w:t>
+                      <w:t>1</w:t>
                     </w:r>
                     <w:r>
                       <w:rPr>
@@ -14640,7 +15244,7 @@
 </file>
 
 <file path=word/header2.xml><?xml version="1.0" encoding="utf-8"?>
-<w:hdr xmlns:wpc="http://schemas.microsoft.com/office/word/2010/wordprocessingCanvas" xmlns:cx="http://schemas.microsoft.com/office/drawing/2014/chartex" xmlns:cx1="http://schemas.microsoft.com/office/drawing/2015/9/8/chartex" xmlns:cx2="http://schemas.microsoft.com/office/drawing/2015/10/21/chartex" xmlns:cx3="http://schemas.microsoft.com/office/drawing/2016/5/9/chartex" xmlns:cx4="http://schemas.microsoft.com/office/drawing/2016/5/10/chartex" xmlns:cx5="http://schemas.microsoft.com/office/drawing/2016/5/11/chartex" xmlns:cx6="http://schemas.microsoft.com/office/drawing/2016/5/12/chartex" xmlns:cx7="http://schemas.microsoft.com/office/drawing/2016/5/13/chartex" xmlns:cx8="http://schemas.microsoft.com/office/drawing/2016/5/14/chartex" xmlns:mc="http://schemas.openxmlformats.org/markup-compatibility/2006" xmlns:aink="http://schemas.microsoft.com/office/drawing/2016/ink" xmlns:am3d="http://schemas.microsoft.com/office/drawing/2017/model3d" xmlns:o="urn:schemas-microsoft-com:office:office" xmlns:oel="http://schemas.microsoft.com/office/2019/extlst" xmlns:r="http://schemas.openxmlformats.org/officeDocument/2006/relationships" xmlns:m="http://schemas.openxmlformats.org/officeDocument/2006/math" xmlns:v="urn:schemas-microsoft-com:vml" xmlns:wp14="http://schemas.microsoft.com/office/word/2010/wordprocessingDrawing" xmlns:wp="http://schemas.openxmlformats.org/drawingml/2006/wordprocessingDrawing" xmlns:w10="urn:schemas-microsoft-com:office:word" xmlns:w="http://schemas.openxmlformats.org/wordprocessingml/2006/main" xmlns:w14="http://schemas.microsoft.com/office/word/2010/wordml" xmlns:w15="http://schemas.microsoft.com/office/word/2012/wordml" xmlns:w16cex="http://schemas.microsoft.com/office/word/2018/wordml/cex" xmlns:w16cid="http://schemas.microsoft.com/office/word/2016/wordml/cid" xmlns:w16="http://schemas.microsoft.com/office/word/2018/wordml" xmlns:w16du="http://schemas.microsoft.com/office/word/2023/wordml/word16du" xmlns:w16sdtdh="http://schemas.microsoft.com/office/word/2020/wordml/sdtdatahash" xmlns:w16sdtfl="http://schemas.microsoft.com/office/word/2024/wordml/sdtformatlock" xmlns:w16se="http://schemas.microsoft.com/office/word/2015/wordml/symex" xmlns:wpg="http://schemas.microsoft.com/office/word/2010/wordprocessingGroup" xmlns:wpi="http://schemas.microsoft.com/office/word/2010/wordprocessingInk" xmlns:wne="http://schemas.microsoft.com/office/word/2006/wordml" xmlns:wps="http://schemas.microsoft.com/office/word/2010/wordprocessingShape" mc:Ignorable="w14 w15 w16se w16cid w16 w16cex w16sdtdh w16sdtfl w16du wp14">
+<w:hdr xmlns:wpc="http://schemas.microsoft.com/office/word/2010/wordprocessingCanvas" xmlns:mc="http://schemas.openxmlformats.org/markup-compatibility/2006" xmlns:o="urn:schemas-microsoft-com:office:office" xmlns:r="http://schemas.openxmlformats.org/officeDocument/2006/relationships" xmlns:m="http://schemas.openxmlformats.org/officeDocument/2006/math" xmlns:v="urn:schemas-microsoft-com:vml" xmlns:wp14="http://schemas.microsoft.com/office/word/2010/wordprocessingDrawing" xmlns:wp="http://schemas.openxmlformats.org/drawingml/2006/wordprocessingDrawing" xmlns:w10="urn:schemas-microsoft-com:office:word" xmlns:w="http://schemas.openxmlformats.org/wordprocessingml/2006/main" xmlns:w14="http://schemas.microsoft.com/office/word/2010/wordml" xmlns:w15="http://schemas.microsoft.com/office/word/2012/wordml" xmlns:wpg="http://schemas.microsoft.com/office/word/2010/wordprocessingGroup" xmlns:wpi="http://schemas.microsoft.com/office/word/2010/wordprocessingInk" xmlns:wne="http://schemas.microsoft.com/office/word/2006/wordml" xmlns:wps="http://schemas.microsoft.com/office/word/2010/wordprocessingShape" mc:Ignorable="w14 w15 wp14">
   <w:sdt>
     <w:sdtPr>
       <w:id w:val="105698720"/>
@@ -14682,7 +15286,7 @@
             <w:bCs/>
             <w:noProof/>
           </w:rPr>
-          <w:t>2</w:t>
+          <w:t>27</w:t>
         </w:r>
         <w:r>
           <w:rPr>
@@ -14718,8 +15322,8 @@
 </file>
 
 <file path=word/numbering.xml><?xml version="1.0" encoding="utf-8"?>
-<w:numbering xmlns:wpc="http://schemas.microsoft.com/office/word/2010/wordprocessingCanvas" xmlns:cx="http://schemas.microsoft.com/office/drawing/2014/chartex" xmlns:cx1="http://schemas.microsoft.com/office/drawing/2015/9/8/chartex" xmlns:cx2="http://schemas.microsoft.com/office/drawing/2015/10/21/chartex" xmlns:cx3="http://schemas.microsoft.com/office/drawing/2016/5/9/chartex" xmlns:cx4="http://schemas.microsoft.com/office/drawing/2016/5/10/chartex" xmlns:cx5="http://schemas.microsoft.com/office/drawing/2016/5/11/chartex" xmlns:cx6="http://schemas.microsoft.com/office/drawing/2016/5/12/chartex" xmlns:cx7="http://schemas.microsoft.com/office/drawing/2016/5/13/chartex" xmlns:cx8="http://schemas.microsoft.com/office/drawing/2016/5/14/chartex" xmlns:mc="http://schemas.openxmlformats.org/markup-compatibility/2006" xmlns:aink="http://schemas.microsoft.com/office/drawing/2016/ink" xmlns:am3d="http://schemas.microsoft.com/office/drawing/2017/model3d" xmlns:o="urn:schemas-microsoft-com:office:office" xmlns:oel="http://schemas.microsoft.com/office/2019/extlst" xmlns:r="http://schemas.openxmlformats.org/officeDocument/2006/relationships" xmlns:m="http://schemas.openxmlformats.org/officeDocument/2006/math" xmlns:v="urn:schemas-microsoft-com:vml" xmlns:wp14="http://schemas.microsoft.com/office/word/2010/wordprocessingDrawing" xmlns:wp="http://schemas.openxmlformats.org/drawingml/2006/wordprocessingDrawing" xmlns:w10="urn:schemas-microsoft-com:office:word" xmlns:w="http://schemas.openxmlformats.org/wordprocessingml/2006/main" xmlns:w14="http://schemas.microsoft.com/office/word/2010/wordml" xmlns:w15="http://schemas.microsoft.com/office/word/2012/wordml" xmlns:w16cex="http://schemas.microsoft.com/office/word/2018/wordml/cex" xmlns:w16cid="http://schemas.microsoft.com/office/word/2016/wordml/cid" xmlns:w16="http://schemas.microsoft.com/office/word/2018/wordml" xmlns:w16du="http://schemas.microsoft.com/office/word/2023/wordml/word16du" xmlns:w16sdtdh="http://schemas.microsoft.com/office/word/2020/wordml/sdtdatahash" xmlns:w16sdtfl="http://schemas.microsoft.com/office/word/2024/wordml/sdtformatlock" xmlns:w16se="http://schemas.microsoft.com/office/word/2015/wordml/symex" xmlns:wpg="http://schemas.microsoft.com/office/word/2010/wordprocessingGroup" xmlns:wpi="http://schemas.microsoft.com/office/word/2010/wordprocessingInk" xmlns:wne="http://schemas.microsoft.com/office/word/2006/wordml" xmlns:wps="http://schemas.microsoft.com/office/word/2010/wordprocessingShape" mc:Ignorable="w14 w15 w16se w16cid w16 w16cex w16sdtdh w16sdtfl w16du wp14">
-  <w:abstractNum w:abstractNumId="0" w15:restartNumberingAfterBreak="0">
+<w:numbering xmlns:wpc="http://schemas.microsoft.com/office/word/2010/wordprocessingCanvas" xmlns:mc="http://schemas.openxmlformats.org/markup-compatibility/2006" xmlns:o="urn:schemas-microsoft-com:office:office" xmlns:r="http://schemas.openxmlformats.org/officeDocument/2006/relationships" xmlns:m="http://schemas.openxmlformats.org/officeDocument/2006/math" xmlns:v="urn:schemas-microsoft-com:vml" xmlns:wp14="http://schemas.microsoft.com/office/word/2010/wordprocessingDrawing" xmlns:wp="http://schemas.openxmlformats.org/drawingml/2006/wordprocessingDrawing" xmlns:w10="urn:schemas-microsoft-com:office:word" xmlns:w="http://schemas.openxmlformats.org/wordprocessingml/2006/main" xmlns:w14="http://schemas.microsoft.com/office/word/2010/wordml" xmlns:w15="http://schemas.microsoft.com/office/word/2012/wordml" xmlns:wpg="http://schemas.microsoft.com/office/word/2010/wordprocessingGroup" xmlns:wpi="http://schemas.microsoft.com/office/word/2010/wordprocessingInk" xmlns:wne="http://schemas.microsoft.com/office/word/2006/wordml" xmlns:wps="http://schemas.microsoft.com/office/word/2010/wordprocessingShape" mc:Ignorable="w14 w15 wp14">
+  <w:abstractNum w:abstractNumId="0">
     <w:nsid w:val="026926B6"/>
     <w:multiLevelType w:val="multilevel"/>
     <w:tmpl w:val="F8DC9A6A"/>
@@ -14842,7 +15446,120 @@
       </w:rPr>
     </w:lvl>
   </w:abstractNum>
-  <w:abstractNum w:abstractNumId="1" w15:restartNumberingAfterBreak="0">
+  <w:abstractNum w:abstractNumId="1">
+    <w:nsid w:val="08211A37"/>
+    <w:multiLevelType w:val="multilevel"/>
+    <w:tmpl w:val="D46CAF58"/>
+    <w:lvl w:ilvl="0">
+      <w:start w:val="3"/>
+      <w:numFmt w:val="decimal"/>
+      <w:lvlText w:val="%1"/>
+      <w:lvlJc w:val="left"/>
+      <w:pPr>
+        <w:ind w:left="420" w:hanging="420"/>
+      </w:pPr>
+      <w:rPr>
+        <w:rFonts w:hint="default"/>
+      </w:rPr>
+    </w:lvl>
+    <w:lvl w:ilvl="1">
+      <w:start w:val="4"/>
+      <w:numFmt w:val="decimal"/>
+      <w:lvlText w:val="%1.%2"/>
+      <w:lvlJc w:val="left"/>
+      <w:pPr>
+        <w:ind w:left="1800" w:hanging="720"/>
+      </w:pPr>
+      <w:rPr>
+        <w:rFonts w:hint="default"/>
+      </w:rPr>
+    </w:lvl>
+    <w:lvl w:ilvl="2">
+      <w:start w:val="1"/>
+      <w:numFmt w:val="decimal"/>
+      <w:lvlText w:val="%1.%2.%3"/>
+      <w:lvlJc w:val="left"/>
+      <w:pPr>
+        <w:ind w:left="2880" w:hanging="720"/>
+      </w:pPr>
+      <w:rPr>
+        <w:rFonts w:hint="default"/>
+      </w:rPr>
+    </w:lvl>
+    <w:lvl w:ilvl="3">
+      <w:start w:val="1"/>
+      <w:numFmt w:val="decimal"/>
+      <w:lvlText w:val="%1.%2.%3.%4"/>
+      <w:lvlJc w:val="left"/>
+      <w:pPr>
+        <w:ind w:left="4320" w:hanging="1080"/>
+      </w:pPr>
+      <w:rPr>
+        <w:rFonts w:hint="default"/>
+      </w:rPr>
+    </w:lvl>
+    <w:lvl w:ilvl="4">
+      <w:start w:val="1"/>
+      <w:numFmt w:val="decimal"/>
+      <w:lvlText w:val="%1.%2.%3.%4.%5"/>
+      <w:lvlJc w:val="left"/>
+      <w:pPr>
+        <w:ind w:left="5760" w:hanging="1440"/>
+      </w:pPr>
+      <w:rPr>
+        <w:rFonts w:hint="default"/>
+      </w:rPr>
+    </w:lvl>
+    <w:lvl w:ilvl="5">
+      <w:start w:val="1"/>
+      <w:numFmt w:val="decimal"/>
+      <w:lvlText w:val="%1.%2.%3.%4.%5.%6"/>
+      <w:lvlJc w:val="left"/>
+      <w:pPr>
+        <w:ind w:left="6840" w:hanging="1440"/>
+      </w:pPr>
+      <w:rPr>
+        <w:rFonts w:hint="default"/>
+      </w:rPr>
+    </w:lvl>
+    <w:lvl w:ilvl="6">
+      <w:start w:val="1"/>
+      <w:numFmt w:val="decimal"/>
+      <w:lvlText w:val="%1.%2.%3.%4.%5.%6.%7"/>
+      <w:lvlJc w:val="left"/>
+      <w:pPr>
+        <w:ind w:left="8280" w:hanging="1800"/>
+      </w:pPr>
+      <w:rPr>
+        <w:rFonts w:hint="default"/>
+      </w:rPr>
+    </w:lvl>
+    <w:lvl w:ilvl="7">
+      <w:start w:val="1"/>
+      <w:numFmt w:val="decimal"/>
+      <w:lvlText w:val="%1.%2.%3.%4.%5.%6.%7.%8"/>
+      <w:lvlJc w:val="left"/>
+      <w:pPr>
+        <w:ind w:left="9720" w:hanging="2160"/>
+      </w:pPr>
+      <w:rPr>
+        <w:rFonts w:hint="default"/>
+      </w:rPr>
+    </w:lvl>
+    <w:lvl w:ilvl="8">
+      <w:start w:val="1"/>
+      <w:numFmt w:val="decimal"/>
+      <w:lvlText w:val="%1.%2.%3.%4.%5.%6.%7.%8.%9"/>
+      <w:lvlJc w:val="left"/>
+      <w:pPr>
+        <w:ind w:left="10800" w:hanging="2160"/>
+      </w:pPr>
+      <w:rPr>
+        <w:rFonts w:hint="default"/>
+      </w:rPr>
+    </w:lvl>
+  </w:abstractNum>
+  <w:abstractNum w:abstractNumId="2">
     <w:nsid w:val="09955172"/>
     <w:multiLevelType w:val="multilevel"/>
     <w:tmpl w:val="7018A602"/>
@@ -14963,7 +15680,7 @@
       </w:rPr>
     </w:lvl>
   </w:abstractNum>
-  <w:abstractNum w:abstractNumId="2" w15:restartNumberingAfterBreak="0">
+  <w:abstractNum w:abstractNumId="3">
     <w:nsid w:val="09D31D07"/>
     <w:multiLevelType w:val="hybridMultilevel"/>
     <w:tmpl w:val="AB9ADEF8"/>
@@ -15076,7 +15793,7 @@
       </w:rPr>
     </w:lvl>
   </w:abstractNum>
-  <w:abstractNum w:abstractNumId="3" w15:restartNumberingAfterBreak="0">
+  <w:abstractNum w:abstractNumId="4">
     <w:nsid w:val="0DF35F3E"/>
     <w:multiLevelType w:val="multilevel"/>
     <w:tmpl w:val="63CE6784"/>
@@ -15189,7 +15906,7 @@
       </w:rPr>
     </w:lvl>
   </w:abstractNum>
-  <w:abstractNum w:abstractNumId="4" w15:restartNumberingAfterBreak="0">
+  <w:abstractNum w:abstractNumId="5">
     <w:nsid w:val="102871CF"/>
     <w:multiLevelType w:val="hybridMultilevel"/>
     <w:tmpl w:val="B276F3B0"/>
@@ -15275,7 +15992,7 @@
       </w:pPr>
     </w:lvl>
   </w:abstractNum>
-  <w:abstractNum w:abstractNumId="5" w15:restartNumberingAfterBreak="0">
+  <w:abstractNum w:abstractNumId="6">
     <w:nsid w:val="10540FCC"/>
     <w:multiLevelType w:val="multilevel"/>
     <w:tmpl w:val="639CB582"/>
@@ -15424,7 +16141,7 @@
       </w:rPr>
     </w:lvl>
   </w:abstractNum>
-  <w:abstractNum w:abstractNumId="6" w15:restartNumberingAfterBreak="0">
+  <w:abstractNum w:abstractNumId="7">
     <w:nsid w:val="175D1073"/>
     <w:multiLevelType w:val="hybridMultilevel"/>
     <w:tmpl w:val="72A0D58C"/>
@@ -15537,7 +16254,7 @@
       </w:rPr>
     </w:lvl>
   </w:abstractNum>
-  <w:abstractNum w:abstractNumId="7" w15:restartNumberingAfterBreak="0">
+  <w:abstractNum w:abstractNumId="8">
     <w:nsid w:val="180B2116"/>
     <w:multiLevelType w:val="multilevel"/>
     <w:tmpl w:val="FD8C89D2"/>
@@ -15650,7 +16367,7 @@
       </w:rPr>
     </w:lvl>
   </w:abstractNum>
-  <w:abstractNum w:abstractNumId="8" w15:restartNumberingAfterBreak="0">
+  <w:abstractNum w:abstractNumId="9">
     <w:nsid w:val="235523DF"/>
     <w:multiLevelType w:val="hybridMultilevel"/>
     <w:tmpl w:val="642A1A94"/>
@@ -15741,7 +16458,7 @@
       </w:pPr>
     </w:lvl>
   </w:abstractNum>
-  <w:abstractNum w:abstractNumId="9" w15:restartNumberingAfterBreak="0">
+  <w:abstractNum w:abstractNumId="10">
     <w:nsid w:val="261B1D7C"/>
     <w:multiLevelType w:val="multilevel"/>
     <w:tmpl w:val="AEB6F746"/>
@@ -15890,7 +16607,7 @@
       </w:rPr>
     </w:lvl>
   </w:abstractNum>
-  <w:abstractNum w:abstractNumId="10" w15:restartNumberingAfterBreak="0">
+  <w:abstractNum w:abstractNumId="11">
     <w:nsid w:val="277B607A"/>
     <w:multiLevelType w:val="multilevel"/>
     <w:tmpl w:val="4009001F"/>
@@ -16012,7 +16729,7 @@
       </w:rPr>
     </w:lvl>
   </w:abstractNum>
-  <w:abstractNum w:abstractNumId="11" w15:restartNumberingAfterBreak="0">
+  <w:abstractNum w:abstractNumId="12">
     <w:nsid w:val="35E4231C"/>
     <w:multiLevelType w:val="hybridMultilevel"/>
     <w:tmpl w:val="664499F2"/>
@@ -16125,7 +16842,7 @@
       </w:rPr>
     </w:lvl>
   </w:abstractNum>
-  <w:abstractNum w:abstractNumId="12" w15:restartNumberingAfterBreak="0">
+  <w:abstractNum w:abstractNumId="13">
     <w:nsid w:val="3CCD5268"/>
     <w:multiLevelType w:val="multilevel"/>
     <w:tmpl w:val="5EAEA3E4"/>
@@ -16274,7 +16991,7 @@
       </w:rPr>
     </w:lvl>
   </w:abstractNum>
-  <w:abstractNum w:abstractNumId="13" w15:restartNumberingAfterBreak="0">
+  <w:abstractNum w:abstractNumId="14">
     <w:nsid w:val="3E30670A"/>
     <w:multiLevelType w:val="multilevel"/>
     <w:tmpl w:val="63B6B958"/>
@@ -16423,7 +17140,7 @@
       </w:rPr>
     </w:lvl>
   </w:abstractNum>
-  <w:abstractNum w:abstractNumId="14" w15:restartNumberingAfterBreak="0">
+  <w:abstractNum w:abstractNumId="15">
     <w:nsid w:val="404A2721"/>
     <w:multiLevelType w:val="multilevel"/>
     <w:tmpl w:val="A1F85122"/>
@@ -16572,7 +17289,7 @@
       </w:rPr>
     </w:lvl>
   </w:abstractNum>
-  <w:abstractNum w:abstractNumId="15" w15:restartNumberingAfterBreak="0">
+  <w:abstractNum w:abstractNumId="16">
     <w:nsid w:val="417B45AE"/>
     <w:multiLevelType w:val="multilevel"/>
     <w:tmpl w:val="BB6E203E"/>
@@ -16694,7 +17411,7 @@
       </w:rPr>
     </w:lvl>
   </w:abstractNum>
-  <w:abstractNum w:abstractNumId="16" w15:restartNumberingAfterBreak="0">
+  <w:abstractNum w:abstractNumId="17">
     <w:nsid w:val="41D2538F"/>
     <w:multiLevelType w:val="multilevel"/>
     <w:tmpl w:val="4009001F"/>
@@ -16809,7 +17526,7 @@
       </w:rPr>
     </w:lvl>
   </w:abstractNum>
-  <w:abstractNum w:abstractNumId="17" w15:restartNumberingAfterBreak="0">
+  <w:abstractNum w:abstractNumId="18">
     <w:nsid w:val="463E06C0"/>
     <w:multiLevelType w:val="multilevel"/>
     <w:tmpl w:val="ACD26CDE"/>
@@ -16927,7 +17644,7 @@
       </w:rPr>
     </w:lvl>
   </w:abstractNum>
-  <w:abstractNum w:abstractNumId="18" w15:restartNumberingAfterBreak="0">
+  <w:abstractNum w:abstractNumId="19">
     <w:nsid w:val="469B6F1A"/>
     <w:multiLevelType w:val="hybridMultilevel"/>
     <w:tmpl w:val="7570BC6A"/>
@@ -17040,7 +17757,7 @@
       </w:rPr>
     </w:lvl>
   </w:abstractNum>
-  <w:abstractNum w:abstractNumId="19" w15:restartNumberingAfterBreak="0">
+  <w:abstractNum w:abstractNumId="20">
     <w:nsid w:val="4BB40149"/>
     <w:multiLevelType w:val="multilevel"/>
     <w:tmpl w:val="D576CB08"/>
@@ -17189,7 +17906,7 @@
       </w:rPr>
     </w:lvl>
   </w:abstractNum>
-  <w:abstractNum w:abstractNumId="20" w15:restartNumberingAfterBreak="0">
+  <w:abstractNum w:abstractNumId="21">
     <w:nsid w:val="4CF2300F"/>
     <w:multiLevelType w:val="multilevel"/>
     <w:tmpl w:val="98349DBA"/>
@@ -17313,7 +18030,7 @@
       </w:rPr>
     </w:lvl>
   </w:abstractNum>
-  <w:abstractNum w:abstractNumId="21" w15:restartNumberingAfterBreak="0">
+  <w:abstractNum w:abstractNumId="22">
     <w:nsid w:val="4D61442A"/>
     <w:multiLevelType w:val="multilevel"/>
     <w:tmpl w:val="98349DBA"/>
@@ -17436,7 +18153,7 @@
       </w:rPr>
     </w:lvl>
   </w:abstractNum>
-  <w:abstractNum w:abstractNumId="22" w15:restartNumberingAfterBreak="0">
+  <w:abstractNum w:abstractNumId="23">
     <w:nsid w:val="4FDC640A"/>
     <w:multiLevelType w:val="multilevel"/>
     <w:tmpl w:val="1AC2CD70"/>
@@ -17585,7 +18302,7 @@
       </w:rPr>
     </w:lvl>
   </w:abstractNum>
-  <w:abstractNum w:abstractNumId="23" w15:restartNumberingAfterBreak="0">
+  <w:abstractNum w:abstractNumId="24">
     <w:nsid w:val="4FEE14BF"/>
     <w:multiLevelType w:val="multilevel"/>
     <w:tmpl w:val="4EE4E8B0"/>
@@ -17734,7 +18451,7 @@
       </w:rPr>
     </w:lvl>
   </w:abstractNum>
-  <w:abstractNum w:abstractNumId="24" w15:restartNumberingAfterBreak="0">
+  <w:abstractNum w:abstractNumId="25">
     <w:nsid w:val="547D7C77"/>
     <w:multiLevelType w:val="multilevel"/>
     <w:tmpl w:val="6CECFC68"/>
@@ -17883,7 +18600,7 @@
       </w:rPr>
     </w:lvl>
   </w:abstractNum>
-  <w:abstractNum w:abstractNumId="25" w15:restartNumberingAfterBreak="0">
+  <w:abstractNum w:abstractNumId="26">
     <w:nsid w:val="588A7CAB"/>
     <w:multiLevelType w:val="multilevel"/>
     <w:tmpl w:val="18F4B2CC"/>
@@ -18032,7 +18749,7 @@
       </w:rPr>
     </w:lvl>
   </w:abstractNum>
-  <w:abstractNum w:abstractNumId="26" w15:restartNumberingAfterBreak="0">
+  <w:abstractNum w:abstractNumId="27">
     <w:nsid w:val="5A9C52C9"/>
     <w:multiLevelType w:val="multilevel"/>
     <w:tmpl w:val="A7784E5A"/>
@@ -18148,7 +18865,7 @@
       </w:pPr>
     </w:lvl>
   </w:abstractNum>
-  <w:abstractNum w:abstractNumId="27" w15:restartNumberingAfterBreak="0">
+  <w:abstractNum w:abstractNumId="28">
     <w:nsid w:val="5BDB33B6"/>
     <w:multiLevelType w:val="multilevel"/>
     <w:tmpl w:val="63CE6784"/>
@@ -18261,7 +18978,7 @@
       </w:rPr>
     </w:lvl>
   </w:abstractNum>
-  <w:abstractNum w:abstractNumId="28" w15:restartNumberingAfterBreak="0">
+  <w:abstractNum w:abstractNumId="29">
     <w:nsid w:val="5E292634"/>
     <w:multiLevelType w:val="multilevel"/>
     <w:tmpl w:val="870663D6"/>
@@ -18410,7 +19127,7 @@
       </w:rPr>
     </w:lvl>
   </w:abstractNum>
-  <w:abstractNum w:abstractNumId="29" w15:restartNumberingAfterBreak="0">
+  <w:abstractNum w:abstractNumId="30">
     <w:nsid w:val="5EB45F3D"/>
     <w:multiLevelType w:val="hybridMultilevel"/>
     <w:tmpl w:val="784C7858"/>
@@ -18501,7 +19218,7 @@
       </w:pPr>
     </w:lvl>
   </w:abstractNum>
-  <w:abstractNum w:abstractNumId="30" w15:restartNumberingAfterBreak="0">
+  <w:abstractNum w:abstractNumId="31">
     <w:nsid w:val="5F4A68DF"/>
     <w:multiLevelType w:val="multilevel"/>
     <w:tmpl w:val="00727D2C"/>
@@ -18614,7 +19331,7 @@
       </w:rPr>
     </w:lvl>
   </w:abstractNum>
-  <w:abstractNum w:abstractNumId="31" w15:restartNumberingAfterBreak="0">
+  <w:abstractNum w:abstractNumId="32">
     <w:nsid w:val="60056376"/>
     <w:multiLevelType w:val="multilevel"/>
     <w:tmpl w:val="083C3C34"/>
@@ -18727,7 +19444,7 @@
       </w:pPr>
     </w:lvl>
   </w:abstractNum>
-  <w:abstractNum w:abstractNumId="32" w15:restartNumberingAfterBreak="0">
+  <w:abstractNum w:abstractNumId="33">
     <w:nsid w:val="61400ECE"/>
     <w:multiLevelType w:val="hybridMultilevel"/>
     <w:tmpl w:val="72A6E7AE"/>
@@ -18840,7 +19557,7 @@
       </w:rPr>
     </w:lvl>
   </w:abstractNum>
-  <w:abstractNum w:abstractNumId="33" w15:restartNumberingAfterBreak="0">
+  <w:abstractNum w:abstractNumId="34">
     <w:nsid w:val="64677F1A"/>
     <w:multiLevelType w:val="hybridMultilevel"/>
     <w:tmpl w:val="642A1A94"/>
@@ -18931,7 +19648,7 @@
       </w:pPr>
     </w:lvl>
   </w:abstractNum>
-  <w:abstractNum w:abstractNumId="34" w15:restartNumberingAfterBreak="0">
+  <w:abstractNum w:abstractNumId="35">
     <w:nsid w:val="6AB041D8"/>
     <w:multiLevelType w:val="multilevel"/>
     <w:tmpl w:val="8A36D154"/>
@@ -19044,7 +19761,7 @@
       </w:pPr>
     </w:lvl>
   </w:abstractNum>
-  <w:abstractNum w:abstractNumId="35" w15:restartNumberingAfterBreak="0">
+  <w:abstractNum w:abstractNumId="36">
     <w:nsid w:val="6E057D39"/>
     <w:multiLevelType w:val="multilevel"/>
     <w:tmpl w:val="938873FE"/>
@@ -19193,7 +19910,7 @@
       </w:rPr>
     </w:lvl>
   </w:abstractNum>
-  <w:abstractNum w:abstractNumId="36" w15:restartNumberingAfterBreak="0">
+  <w:abstractNum w:abstractNumId="37">
     <w:nsid w:val="75D54D50"/>
     <w:multiLevelType w:val="multilevel"/>
     <w:tmpl w:val="983817B0"/>
@@ -19306,7 +20023,7 @@
       </w:pPr>
     </w:lvl>
   </w:abstractNum>
-  <w:abstractNum w:abstractNumId="37" w15:restartNumberingAfterBreak="0">
+  <w:abstractNum w:abstractNumId="38">
     <w:nsid w:val="75F051F4"/>
     <w:multiLevelType w:val="hybridMultilevel"/>
     <w:tmpl w:val="562415C0"/>
@@ -19395,7 +20112,7 @@
       </w:pPr>
     </w:lvl>
   </w:abstractNum>
-  <w:abstractNum w:abstractNumId="38" w15:restartNumberingAfterBreak="0">
+  <w:abstractNum w:abstractNumId="39">
     <w:nsid w:val="79480A64"/>
     <w:multiLevelType w:val="multilevel"/>
     <w:tmpl w:val="4009001F"/>
@@ -19518,7 +20235,7 @@
       </w:rPr>
     </w:lvl>
   </w:abstractNum>
-  <w:abstractNum w:abstractNumId="39" w15:restartNumberingAfterBreak="0">
+  <w:abstractNum w:abstractNumId="40">
     <w:nsid w:val="7B257D53"/>
     <w:multiLevelType w:val="multilevel"/>
     <w:tmpl w:val="51E89D92"/>
@@ -19634,7 +20351,7 @@
       </w:pPr>
     </w:lvl>
   </w:abstractNum>
-  <w:abstractNum w:abstractNumId="40" w15:restartNumberingAfterBreak="0">
+  <w:abstractNum w:abstractNumId="41">
     <w:nsid w:val="7E95683C"/>
     <w:multiLevelType w:val="hybridMultilevel"/>
     <w:tmpl w:val="16AC1C8E"/>
@@ -19747,7 +20464,7 @@
       </w:rPr>
     </w:lvl>
   </w:abstractNum>
-  <w:abstractNum w:abstractNumId="41" w15:restartNumberingAfterBreak="0">
+  <w:abstractNum w:abstractNumId="42">
     <w:nsid w:val="7F150F56"/>
     <w:multiLevelType w:val="hybridMultilevel"/>
     <w:tmpl w:val="F8627C36"/>
@@ -19860,137 +20577,140 @@
       </w:rPr>
     </w:lvl>
   </w:abstractNum>
-  <w:num w:numId="1" w16cid:durableId="1076435630">
+  <w:num w:numId="1">
+    <w:abstractNumId w:val="38"/>
+  </w:num>
+  <w:num w:numId="2">
+    <w:abstractNumId w:val="2"/>
+  </w:num>
+  <w:num w:numId="3">
+    <w:abstractNumId w:val="8"/>
+  </w:num>
+  <w:num w:numId="4">
+    <w:abstractNumId w:val="27"/>
+  </w:num>
+  <w:num w:numId="5">
+    <w:abstractNumId w:val="35"/>
+  </w:num>
+  <w:num w:numId="6">
     <w:abstractNumId w:val="37"/>
   </w:num>
-  <w:num w:numId="2" w16cid:durableId="2079404765">
-    <w:abstractNumId w:val="1"/>
+  <w:num w:numId="7">
+    <w:abstractNumId w:val="19"/>
   </w:num>
-  <w:num w:numId="3" w16cid:durableId="1763061687">
+  <w:num w:numId="8">
+    <w:abstractNumId w:val="33"/>
+  </w:num>
+  <w:num w:numId="9">
+    <w:abstractNumId w:val="40"/>
+  </w:num>
+  <w:num w:numId="10">
+    <w:abstractNumId w:val="31"/>
+  </w:num>
+  <w:num w:numId="11">
+    <w:abstractNumId w:val="32"/>
+  </w:num>
+  <w:num w:numId="12">
+    <w:abstractNumId w:val="15"/>
+  </w:num>
+  <w:num w:numId="13">
     <w:abstractNumId w:val="7"/>
   </w:num>
-  <w:num w:numId="4" w16cid:durableId="1561407625">
+  <w:num w:numId="14">
+    <w:abstractNumId w:val="30"/>
+  </w:num>
+  <w:num w:numId="15">
+    <w:abstractNumId w:val="17"/>
+  </w:num>
+  <w:num w:numId="16">
+    <w:abstractNumId w:val="9"/>
+  </w:num>
+  <w:num w:numId="17">
+    <w:abstractNumId w:val="34"/>
+  </w:num>
+  <w:num w:numId="18">
+    <w:abstractNumId w:val="22"/>
+  </w:num>
+  <w:num w:numId="19">
+    <w:abstractNumId w:val="13"/>
+  </w:num>
+  <w:num w:numId="20">
+    <w:abstractNumId w:val="29"/>
+  </w:num>
+  <w:num w:numId="21">
+    <w:abstractNumId w:val="14"/>
+  </w:num>
+  <w:num w:numId="22">
+    <w:abstractNumId w:val="24"/>
+  </w:num>
+  <w:num w:numId="23">
+    <w:abstractNumId w:val="6"/>
+  </w:num>
+  <w:num w:numId="24">
+    <w:abstractNumId w:val="23"/>
+  </w:num>
+  <w:num w:numId="25">
+    <w:abstractNumId w:val="36"/>
+  </w:num>
+  <w:num w:numId="26">
+    <w:abstractNumId w:val="16"/>
+  </w:num>
+  <w:num w:numId="27">
     <w:abstractNumId w:val="26"/>
   </w:num>
-  <w:num w:numId="5" w16cid:durableId="179856998">
-    <w:abstractNumId w:val="34"/>
+  <w:num w:numId="28">
+    <w:abstractNumId w:val="11"/>
   </w:num>
-  <w:num w:numId="6" w16cid:durableId="420180963">
-    <w:abstractNumId w:val="36"/>
+  <w:num w:numId="29">
+    <w:abstractNumId w:val="0"/>
   </w:num>
-  <w:num w:numId="7" w16cid:durableId="1111241485">
+  <w:num w:numId="30">
+    <w:abstractNumId w:val="39"/>
+  </w:num>
+  <w:num w:numId="31">
+    <w:abstractNumId w:val="21"/>
+  </w:num>
+  <w:num w:numId="32">
+    <w:abstractNumId w:val="10"/>
+  </w:num>
+  <w:num w:numId="33">
+    <w:abstractNumId w:val="20"/>
+  </w:num>
+  <w:num w:numId="34">
+    <w:abstractNumId w:val="5"/>
+  </w:num>
+  <w:num w:numId="35">
     <w:abstractNumId w:val="18"/>
   </w:num>
-  <w:num w:numId="8" w16cid:durableId="1719166704">
-    <w:abstractNumId w:val="32"/>
+  <w:num w:numId="36">
+    <w:abstractNumId w:val="3"/>
   </w:num>
-  <w:num w:numId="9" w16cid:durableId="734084709">
-    <w:abstractNumId w:val="39"/>
+  <w:num w:numId="37">
+    <w:abstractNumId w:val="41"/>
   </w:num>
-  <w:num w:numId="10" w16cid:durableId="1260020443">
-    <w:abstractNumId w:val="30"/>
+  <w:num w:numId="38">
+    <w:abstractNumId w:val="28"/>
   </w:num>
-  <w:num w:numId="11" w16cid:durableId="272714233">
-    <w:abstractNumId w:val="31"/>
+  <w:num w:numId="39">
+    <w:abstractNumId w:val="4"/>
   </w:num>
-  <w:num w:numId="12" w16cid:durableId="1925528410">
-    <w:abstractNumId w:val="14"/>
-  </w:num>
-  <w:num w:numId="13" w16cid:durableId="1516843588">
-    <w:abstractNumId w:val="6"/>
-  </w:num>
-  <w:num w:numId="14" w16cid:durableId="1756049918">
-    <w:abstractNumId w:val="29"/>
-  </w:num>
-  <w:num w:numId="15" w16cid:durableId="1644114373">
-    <w:abstractNumId w:val="16"/>
-  </w:num>
-  <w:num w:numId="16" w16cid:durableId="1733117384">
-    <w:abstractNumId w:val="8"/>
-  </w:num>
-  <w:num w:numId="17" w16cid:durableId="1544756587">
-    <w:abstractNumId w:val="33"/>
-  </w:num>
-  <w:num w:numId="18" w16cid:durableId="1279992978">
-    <w:abstractNumId w:val="21"/>
-  </w:num>
-  <w:num w:numId="19" w16cid:durableId="76900267">
+  <w:num w:numId="40">
     <w:abstractNumId w:val="12"/>
   </w:num>
-  <w:num w:numId="20" w16cid:durableId="886451204">
-    <w:abstractNumId w:val="28"/>
+  <w:num w:numId="41">
+    <w:abstractNumId w:val="42"/>
   </w:num>
-  <w:num w:numId="21" w16cid:durableId="1851213046">
-    <w:abstractNumId w:val="13"/>
-  </w:num>
-  <w:num w:numId="22" w16cid:durableId="676932360">
-    <w:abstractNumId w:val="23"/>
-  </w:num>
-  <w:num w:numId="23" w16cid:durableId="1939176468">
-    <w:abstractNumId w:val="5"/>
-  </w:num>
-  <w:num w:numId="24" w16cid:durableId="1611278360">
-    <w:abstractNumId w:val="22"/>
-  </w:num>
-  <w:num w:numId="25" w16cid:durableId="649558071">
-    <w:abstractNumId w:val="35"/>
-  </w:num>
-  <w:num w:numId="26" w16cid:durableId="445740223">
-    <w:abstractNumId w:val="15"/>
-  </w:num>
-  <w:num w:numId="27" w16cid:durableId="1574856721">
+  <w:num w:numId="42">
     <w:abstractNumId w:val="25"/>
   </w:num>
-  <w:num w:numId="28" w16cid:durableId="1038705421">
-    <w:abstractNumId w:val="10"/>
-  </w:num>
-  <w:num w:numId="29" w16cid:durableId="1535927925">
-    <w:abstractNumId w:val="0"/>
-  </w:num>
-  <w:num w:numId="30" w16cid:durableId="1166097410">
-    <w:abstractNumId w:val="38"/>
-  </w:num>
-  <w:num w:numId="31" w16cid:durableId="1877690854">
-    <w:abstractNumId w:val="20"/>
-  </w:num>
-  <w:num w:numId="32" w16cid:durableId="1650939962">
-    <w:abstractNumId w:val="9"/>
-  </w:num>
-  <w:num w:numId="33" w16cid:durableId="1152327246">
-    <w:abstractNumId w:val="19"/>
-  </w:num>
-  <w:num w:numId="34" w16cid:durableId="1885755818">
-    <w:abstractNumId w:val="4"/>
-  </w:num>
-  <w:num w:numId="35" w16cid:durableId="138423550">
-    <w:abstractNumId w:val="17"/>
-  </w:num>
-  <w:num w:numId="36" w16cid:durableId="1421104703">
-    <w:abstractNumId w:val="2"/>
-  </w:num>
-  <w:num w:numId="37" w16cid:durableId="1584951032">
-    <w:abstractNumId w:val="40"/>
-  </w:num>
-  <w:num w:numId="38" w16cid:durableId="76480636">
-    <w:abstractNumId w:val="27"/>
-  </w:num>
-  <w:num w:numId="39" w16cid:durableId="1497766653">
-    <w:abstractNumId w:val="3"/>
-  </w:num>
-  <w:num w:numId="40" w16cid:durableId="512302272">
-    <w:abstractNumId w:val="11"/>
-  </w:num>
-  <w:num w:numId="41" w16cid:durableId="741415710">
-    <w:abstractNumId w:val="41"/>
-  </w:num>
-  <w:num w:numId="42" w16cid:durableId="1468427081">
-    <w:abstractNumId w:val="24"/>
+  <w:num w:numId="43">
+    <w:abstractNumId w:val="1"/>
   </w:num>
 </w:numbering>
 </file>
 
 <file path=word/styles.xml><?xml version="1.0" encoding="utf-8"?>
-<w:styles xmlns:mc="http://schemas.openxmlformats.org/markup-compatibility/2006" xmlns:r="http://schemas.openxmlformats.org/officeDocument/2006/relationships" xmlns:w="http://schemas.openxmlformats.org/wordprocessingml/2006/main" xmlns:w14="http://schemas.microsoft.com/office/word/2010/wordml" xmlns:w15="http://schemas.microsoft.com/office/word/2012/wordml" xmlns:w16cex="http://schemas.microsoft.com/office/word/2018/wordml/cex" xmlns:w16cid="http://schemas.microsoft.com/office/word/2016/wordml/cid" xmlns:w16="http://schemas.microsoft.com/office/word/2018/wordml" xmlns:w16du="http://schemas.microsoft.com/office/word/2023/wordml/word16du" xmlns:w16sdtdh="http://schemas.microsoft.com/office/word/2020/wordml/sdtdatahash" xmlns:w16sdtfl="http://schemas.microsoft.com/office/word/2024/wordml/sdtformatlock" xmlns:w16se="http://schemas.microsoft.com/office/word/2015/wordml/symex" mc:Ignorable="w14 w15 w16se w16cid w16 w16cex w16sdtdh w16sdtfl w16du">
+<w:styles xmlns:mc="http://schemas.openxmlformats.org/markup-compatibility/2006" xmlns:r="http://schemas.openxmlformats.org/officeDocument/2006/relationships" xmlns:w="http://schemas.openxmlformats.org/wordprocessingml/2006/main" xmlns:w14="http://schemas.microsoft.com/office/word/2010/wordml" xmlns:w15="http://schemas.microsoft.com/office/word/2012/wordml" mc:Ignorable="w14 w15">
   <w:docDefaults>
     <w:rPrDefault>
       <w:rPr>
@@ -20008,7 +20728,7 @@
       </w:pPr>
     </w:pPrDefault>
   </w:docDefaults>
-  <w:latentStyles w:defLockedState="0" w:defUIPriority="99" w:defSemiHidden="0" w:defUnhideWhenUsed="0" w:defQFormat="0" w:count="376">
+  <w:latentStyles w:defLockedState="0" w:defUIPriority="99" w:defSemiHidden="0" w:defUnhideWhenUsed="0" w:defQFormat="0" w:count="371">
     <w:lsdException w:name="Normal" w:uiPriority="0" w:qFormat="1"/>
     <w:lsdException w:name="heading 1" w:uiPriority="9" w:qFormat="1"/>
     <w:lsdException w:name="heading 2" w:semiHidden="1" w:uiPriority="9" w:unhideWhenUsed="1" w:qFormat="1"/>
@@ -20380,11 +21100,6 @@
     <w:lsdException w:name="List Table 5 Dark Accent 6" w:uiPriority="50"/>
     <w:lsdException w:name="List Table 6 Colorful Accent 6" w:uiPriority="51"/>
     <w:lsdException w:name="List Table 7 Colorful Accent 6" w:uiPriority="52"/>
-    <w:lsdException w:name="Mention" w:semiHidden="1" w:unhideWhenUsed="1"/>
-    <w:lsdException w:name="Smart Hyperlink" w:semiHidden="1" w:unhideWhenUsed="1"/>
-    <w:lsdException w:name="Hashtag" w:semiHidden="1" w:unhideWhenUsed="1"/>
-    <w:lsdException w:name="Unresolved Mention" w:semiHidden="1" w:unhideWhenUsed="1"/>
-    <w:lsdException w:name="Smart Link" w:semiHidden="1" w:unhideWhenUsed="1"/>
   </w:latentStyles>
   <w:style w:type="paragraph" w:default="1" w:styleId="Normal">
     <w:name w:val="Normal"/>
@@ -20960,6 +21675,7 @@
       <w14:ligatures w14:val="none"/>
     </w:rPr>
     <w:tblPr>
+      <w:tblInd w:w="0" w:type="dxa"/>
       <w:tblBorders>
         <w:top w:val="single" w:sz="4" w:space="0" w:color="auto"/>
         <w:left w:val="single" w:sz="4" w:space="0" w:color="auto"/>
@@ -20968,6 +21684,12 @@
         <w:insideH w:val="single" w:sz="4" w:space="0" w:color="auto"/>
         <w:insideV w:val="single" w:sz="4" w:space="0" w:color="auto"/>
       </w:tblBorders>
+      <w:tblCellMar>
+        <w:top w:w="0" w:type="dxa"/>
+        <w:left w:w="108" w:type="dxa"/>
+        <w:bottom w:w="0" w:type="dxa"/>
+        <w:right w:w="108" w:type="dxa"/>
+      </w:tblCellMar>
     </w:tblPr>
   </w:style>
   <w:style w:type="paragraph" w:styleId="Header">
@@ -21430,7 +22152,7 @@
 </file>
 
 <file path=customXml/itemProps1.xml><?xml version="1.0" encoding="utf-8"?>
-<ds:datastoreItem xmlns:ds="http://schemas.openxmlformats.org/officeDocument/2006/customXml" ds:itemID="{867061D8-39B6-4AD8-984B-DEBE91AC18E7}">
+<ds:datastoreItem xmlns:ds="http://schemas.openxmlformats.org/officeDocument/2006/customXml" ds:itemID="{7D58B032-5EBF-46BF-B09A-0EA45F8C5AC3}">
   <ds:schemaRefs>
     <ds:schemaRef ds:uri="http://schemas.openxmlformats.org/officeDocument/2006/bibliography"/>
   </ds:schemaRefs>

</xml_diff>